<commit_message>
docs(informe): actualizar informe inicial v0 docx y pdf
</commit_message>
<xml_diff>
--- a/Informe_Inicial_v0.docx
+++ b/Informe_Inicial_v0.docx
@@ -49,7 +49,7 @@
           <w:sz w:val="28"/>
           <w:szCs w:val="28"/>
         </w:rPr>
-        <w:t xml:space="preserve">para la manipulación de recipientes en entornos con riesgo químico</w:t>
+        <w:t xml:space="preserve">para el traslado de recipientes sin manipulación directa</w:t>
       </w:r>
     </w:p>
     <w:p>
@@ -90,7 +90,7 @@
       <w:r>
         <w:drawing>
           <wp:inline distT="0" distB="0" distL="0" distR="0">
-            <wp:extent cx="2476500" cy="971550"/>
+            <wp:extent cx="4762500" cy="828675"/>
             <wp:effectExtent t="0" r="0" b="0" l="0"/>
             <wp:docPr id="1" name="" descr="" title=""/>
             <wp:cNvGraphicFramePr>
@@ -115,7 +115,7 @@
                   <pic:spPr bwMode="auto">
                     <a:xfrm>
                       <a:off x="0" y="0"/>
-                      <a:ext cx="2476500" cy="971550"/>
+                      <a:ext cx="4762500" cy="828675"/>
                     </a:xfrm>
                     <a:prstGeom prst="rect">
                       <a:avLst/>
@@ -510,7 +510,7 @@
           <w:sz w:val="23"/>
           <w:szCs w:val="23"/>
         </w:rPr>
-        <w:t xml:space="preserve">5</w:t>
+        <w:t xml:space="preserve">6</w:t>
       </w:r>
     </w:p>
     <w:p>
@@ -566,7 +566,7 @@
           <w:sz w:val="23"/>
           <w:szCs w:val="23"/>
         </w:rPr>
-        <w:t xml:space="preserve">3.1 FUNCIONALES</w:t>
+        <w:t xml:space="preserve">1. Requerimientos funcionales de hardware</w:t>
       </w:r>
       <w:r>
         <w:rPr>
@@ -603,7 +603,7 @@
           <w:sz w:val="23"/>
           <w:szCs w:val="23"/>
         </w:rPr>
-        <w:t xml:space="preserve">3.2 NO FUNCIONALES</w:t>
+        <w:t xml:space="preserve">2. Requerimientos funcionales de software</w:t>
       </w:r>
       <w:r>
         <w:rPr>
@@ -640,7 +640,44 @@
           <w:sz w:val="23"/>
           <w:szCs w:val="23"/>
         </w:rPr>
-        <w:t xml:space="preserve">3.3 DE ENSAYO, VALIDACIÓN Y DOCUMENTACIÓN</w:t>
+        <w:t xml:space="preserve">3. Requerimientos no funcionales</w:t>
+      </w:r>
+      <w:r>
+        <w:rPr>
+          <w:rFonts w:ascii="Times New Roman" w:cs="Times New Roman" w:eastAsia="Times New Roman" w:hAnsi="Times New Roman"/>
+          <w:sz w:val="24"/>
+          <w:szCs w:val="24"/>
+        </w:rPr>
+        <w:tab/>
+      </w:r>
+      <w:r>
+        <w:rPr>
+          <w:rFonts w:ascii="Times New Roman" w:cs="Times New Roman" w:eastAsia="Times New Roman" w:hAnsi="Times New Roman"/>
+          <w:b w:val="false"/>
+          <w:bCs w:val="false"/>
+          <w:sz w:val="23"/>
+          <w:szCs w:val="23"/>
+        </w:rPr>
+        <w:t xml:space="preserve">8</w:t>
+      </w:r>
+    </w:p>
+    <w:p>
+      <w:pPr>
+        <w:tabs>
+          <w:tab w:val="right" w:pos="9070" w:leader="dot"/>
+        </w:tabs>
+        <w:spacing w:after="50" w:line="300"/>
+        <w:ind w:left="454"/>
+      </w:pPr>
+      <w:r>
+        <w:rPr>
+          <w:rFonts w:ascii="Times New Roman" w:cs="Times New Roman" w:eastAsia="Times New Roman" w:hAnsi="Times New Roman"/>
+          <w:b w:val="false"/>
+          <w:bCs w:val="false"/>
+          <w:sz w:val="23"/>
+          <w:szCs w:val="23"/>
+        </w:rPr>
+        <w:t xml:space="preserve">4. Requerimientos de ensayo, validación y documentación</w:t>
       </w:r>
       <w:r>
         <w:rPr>
@@ -773,154 +810,6 @@
       </w:r>
     </w:p>
     <w:p>
-      <w:pPr>
-        <w:tabs>
-          <w:tab w:val="right" w:pos="9070" w:leader="dot"/>
-        </w:tabs>
-        <w:spacing w:after="90" w:line="300"/>
-        <w:ind w:left="0"/>
-      </w:pPr>
-      <w:r>
-        <w:rPr>
-          <w:rFonts w:ascii="Times New Roman" w:cs="Times New Roman" w:eastAsia="Times New Roman" w:hAnsi="Times New Roman"/>
-          <w:b/>
-          <w:bCs/>
-          <w:sz w:val="24"/>
-          <w:szCs w:val="24"/>
-        </w:rPr>
-        <w:t xml:space="preserve">ANEXO A. ALTERNATIVAS DE SOLUCIÓN Y COSTOS</w:t>
-      </w:r>
-      <w:r>
-        <w:rPr>
-          <w:rFonts w:ascii="Times New Roman" w:cs="Times New Roman" w:eastAsia="Times New Roman" w:hAnsi="Times New Roman"/>
-          <w:sz w:val="24"/>
-          <w:szCs w:val="24"/>
-        </w:rPr>
-        <w:tab/>
-      </w:r>
-      <w:r>
-        <w:rPr>
-          <w:rFonts w:ascii="Times New Roman" w:cs="Times New Roman" w:eastAsia="Times New Roman" w:hAnsi="Times New Roman"/>
-          <w:b/>
-          <w:bCs/>
-          <w:sz w:val="24"/>
-          <w:szCs w:val="24"/>
-        </w:rPr>
-        <w:t xml:space="preserve">14</w:t>
-      </w:r>
-    </w:p>
-    <w:p>
-      <w:pPr>
-        <w:tabs>
-          <w:tab w:val="right" w:pos="9070" w:leader="dot"/>
-        </w:tabs>
-        <w:spacing w:after="50" w:line="300"/>
-        <w:ind w:left="454"/>
-      </w:pPr>
-      <w:r>
-        <w:rPr>
-          <w:rFonts w:ascii="Times New Roman" w:cs="Times New Roman" w:eastAsia="Times New Roman" w:hAnsi="Times New Roman"/>
-          <w:b w:val="false"/>
-          <w:bCs w:val="false"/>
-          <w:sz w:val="23"/>
-          <w:szCs w:val="23"/>
-        </w:rPr>
-        <w:t xml:space="preserve">A.1 Dimensionamiento del par y precios de referencia</w:t>
-      </w:r>
-      <w:r>
-        <w:rPr>
-          <w:rFonts w:ascii="Times New Roman" w:cs="Times New Roman" w:eastAsia="Times New Roman" w:hAnsi="Times New Roman"/>
-          <w:sz w:val="24"/>
-          <w:szCs w:val="24"/>
-        </w:rPr>
-        <w:tab/>
-      </w:r>
-      <w:r>
-        <w:rPr>
-          <w:rFonts w:ascii="Times New Roman" w:cs="Times New Roman" w:eastAsia="Times New Roman" w:hAnsi="Times New Roman"/>
-          <w:b w:val="false"/>
-          <w:bCs w:val="false"/>
-          <w:sz w:val="23"/>
-          <w:szCs w:val="23"/>
-        </w:rPr>
-        <w:t xml:space="preserve">14</w:t>
-      </w:r>
-    </w:p>
-    <w:p>
-      <w:pPr>
-        <w:tabs>
-          <w:tab w:val="right" w:pos="9070" w:leader="dot"/>
-        </w:tabs>
-        <w:spacing w:after="50" w:line="300"/>
-        <w:ind w:left="454"/>
-      </w:pPr>
-      <w:r>
-        <w:rPr>
-          <w:rFonts w:ascii="Times New Roman" w:cs="Times New Roman" w:eastAsia="Times New Roman" w:hAnsi="Times New Roman"/>
-          <w:b w:val="false"/>
-          <w:bCs w:val="false"/>
-          <w:sz w:val="23"/>
-          <w:szCs w:val="23"/>
-        </w:rPr>
-        <w:t xml:space="preserve">A.2 Alternativas evaluadas</w:t>
-      </w:r>
-      <w:r>
-        <w:rPr>
-          <w:rFonts w:ascii="Times New Roman" w:cs="Times New Roman" w:eastAsia="Times New Roman" w:hAnsi="Times New Roman"/>
-          <w:sz w:val="24"/>
-          <w:szCs w:val="24"/>
-        </w:rPr>
-        <w:tab/>
-      </w:r>
-      <w:r>
-        <w:rPr>
-          <w:rFonts w:ascii="Times New Roman" w:cs="Times New Roman" w:eastAsia="Times New Roman" w:hAnsi="Times New Roman"/>
-          <w:b w:val="false"/>
-          <w:bCs w:val="false"/>
-          <w:sz w:val="23"/>
-          <w:szCs w:val="23"/>
-        </w:rPr>
-        <w:t xml:space="preserve">14</w:t>
-      </w:r>
-    </w:p>
-    <w:p>
-      <w:pPr>
-        <w:tabs>
-          <w:tab w:val="right" w:pos="9070" w:leader="dot"/>
-        </w:tabs>
-        <w:spacing w:after="50" w:line="300"/>
-        <w:ind w:left="454"/>
-      </w:pPr>
-      <w:r>
-        <w:rPr>
-          <w:rFonts w:ascii="Times New Roman" w:cs="Times New Roman" w:eastAsia="Times New Roman" w:hAnsi="Times New Roman"/>
-          <w:b w:val="false"/>
-          <w:bCs w:val="false"/>
-          <w:sz w:val="23"/>
-          <w:szCs w:val="23"/>
-        </w:rPr>
-        <w:t xml:space="preserve">A.3 Cuadro comparativo y alternativa propuesta</w:t>
-      </w:r>
-      <w:r>
-        <w:rPr>
-          <w:rFonts w:ascii="Times New Roman" w:cs="Times New Roman" w:eastAsia="Times New Roman" w:hAnsi="Times New Roman"/>
-          <w:sz w:val="24"/>
-          <w:szCs w:val="24"/>
-        </w:rPr>
-        <w:tab/>
-      </w:r>
-      <w:r>
-        <w:rPr>
-          <w:rFonts w:ascii="Times New Roman" w:cs="Times New Roman" w:eastAsia="Times New Roman" w:hAnsi="Times New Roman"/>
-          <w:b w:val="false"/>
-          <w:bCs w:val="false"/>
-          <w:sz w:val="23"/>
-          <w:szCs w:val="23"/>
-        </w:rPr>
-        <w:t xml:space="preserve">15</w:t>
-      </w:r>
-    </w:p>
-    <w:p>
       <w:r>
         <w:br w:type="page"/>
       </w:r>
@@ -954,7 +843,7 @@
           <w:sz w:val="24"/>
           <w:szCs w:val="24"/>
         </w:rPr>
-        <w:t xml:space="preserve">En un laboratorio de química, en una planta de tratamiento de efluentes o en un depósito de reactivos hay una operación que se repite decenas de veces por día y que es, a la vez, la más riesgosa: tomar un recipiente, moverlo unos pocos centímetros y apoyarlo en otro lado. La operación es trivial; lo que no lo es resulta que el operador deba acercar las manos y la cara a una sustancia corrosiva, tóxica o volátil para realizarla. La exposición no proviene de accidentes espectaculares sino de la acumulación de gestos rutinarios: un frasco que se desliza, un vapor que se libera al destapar, una salpicadura al trasvasar.</w:t>
+        <w:t xml:space="preserve">En un laboratorio de química, en una planta de tratamiento de efluentes o en un depósito de reactivos hay una operación que se repite decenas de veces por día y que es, a la vez, la más riesgosa por lo trivial que parece: tomar un recipiente con contenido peligroso, moverlo unos pocos centímetros y apoyarlo en otro lado. La operación no tiene ninguna dificultad; lo que sí la tiene es que el operador deba acercar las manos y la cara a una sustancia corrosiva, tóxica o volátil para realizarla. La exposición no proviene de accidentes espectaculares sino de la acumulación de gestos rutinarios: un frasco que se desliza, un vapor que se libera al destapar, una salpicadura al trasvasar.</w:t>
       </w:r>
     </w:p>
     <w:p>
@@ -969,7 +858,7 @@
           <w:sz w:val="24"/>
           <w:szCs w:val="24"/>
         </w:rPr>
-        <w:t xml:space="preserve">La respuesta clásica de la industria a este problema es la manipulación remota: interponer una máquina entre la persona y la sustancia. Un manipulador teleoperado es un brazo mecánico articulado que reproduce, a distancia, los movimientos que le ordena un operador. Los primeros equipos de este tipo aparecieron en la década de 1940 en la industria nuclear: eran mecanismos maestro-esclavo puramente mecánicos, unidos por varillas y cables, que permitían manipular material radiactivo desde detrás de un vidrio plomado. Con la electrónica de potencia y el control digital, el vínculo mecánico fue reemplazado por señales eléctricas y el brazo pasó a ser un conjunto de actuadores gobernados por un controlador programable.</w:t>
+        <w:t xml:space="preserve">La respuesta clásica de la industria a este problema es la manipulación remota: interponer una máquina entre la persona y la sustancia. El operador conserva el control de la tarea, pero deja de estar en el lugar donde ocurre el riesgo. Este proyecto se propone construir un prototipo funcional de esa idea, dimensionado para el alcance de una asignatura de grado.</w:t>
       </w:r>
     </w:p>
     <w:p>
@@ -984,7 +873,7 @@
           <w:sz w:val="24"/>
           <w:szCs w:val="24"/>
         </w:rPr>
-        <w:t xml:space="preserve">Un brazo de este tipo se describe por sus grados de libertad: la cantidad de movimientos independientes que puede realizar, cada uno con su propio actuador. El presente proyecto emplea cinco servomotores: cuatro articulaciones que posicionan y orientan el extremo del brazo, y un quinto que acciona la pinza.</w:t>
+        <w:t xml:space="preserve">Un manipulador teleoperado es un brazo mecánico articulado que reproduce, a distancia, los movimientos que le ordena un operador. Los primeros equipos de este tipo aparecieron en la década de 1940 en la industria nuclear: eran mecanismos maestro-esclavo puramente mecánicos, unidos por varillas y cables, que permitían manipular material radiactivo desde detrás de un vidrio plomado. Con la electrónica de potencia y el control digital, el vínculo mecánico fue reemplazado por señales eléctricas y el brazo pasó a ser un conjunto de actuadores gobernados por un controlador programable.</w:t>
       </w:r>
     </w:p>
     <w:p>
@@ -999,7 +888,7 @@
           <w:sz w:val="24"/>
           <w:szCs w:val="24"/>
         </w:rPr>
-        <w:t xml:space="preserve">El estado del arte abarca hoy tres familias claramente diferenciadas. En el extremo superior, los manipuladores industriales de seis ejes con servomotores de corriente alterna y encoders absolutos, capaces de repetibilidades del orden de la centésima de milímetro. En un rango intermedio, los robots colaborativos, diseñados para trabajar junto a personas, que miden la corriente de cada articulación para detectar colisiones y detenerse. En el extremo accesible, los brazos educativos y de laboratorio de bajo costo, construidos con servomotores de radiocontrol y estructuras impresas en tres dimensiones, gobernados por microcontroladores de propósito general. Este proyecto se inscribe en la tercera familia, pero incorpora deliberadamente dos elementos propios de las dos primeras: un sistema de monitoreo del ambiente que condiciona la operación del brazo y una cadena de seguridad con corte por hardware independiente del programa [3].</w:t>
+        <w:t xml:space="preserve">Un brazo de este tipo se describe por sus grados de libertad: la cantidad de movimientos independientes que puede realizar, cada uno con su propio actuador. Cuantos más grados de libertad, más libertad de movimiento, pero también más complejidad de control y más costo. El presente proyecto emplea cinco servomotores: cuatro articulaciones que posicionan y orientan el extremo del brazo, y un quinto que acciona la pinza [4].</w:t>
       </w:r>
     </w:p>
     <w:p>
@@ -1014,7 +903,7 @@
           <w:sz w:val="24"/>
           <w:szCs w:val="24"/>
         </w:rPr>
-        <w:t xml:space="preserve">El presente proyecto consiste en el diseño y la construcción de un brazo robótico de cuatro grados de libertad más pinza, accionado por cinco servomotores y gobernado por la placa EDU-CIAA-NXP, que integra el microcontrolador NXP LPC4337 de arquitectura ARM Cortex-M4 [2][4]. El operador comanda el brazo mediante una interfaz local compuesta por un joystick analógico, pulsadores y un display alfanumérico. Un subsistema de sensado mide de forma permanente la concentración de gases y la temperatura del ambiente de trabajo; al superarse un umbral configurable, el sistema detiene el movimiento y pasa a un estado de alarma. Un pulsador de parada de emergencia corta la alimentación de los actuadores por hardware, sin depender de la ejecución del programa.</w:t>
+        <w:t xml:space="preserve">El estado del arte abarca hoy tres familias claramente diferenciadas. En el extremo superior, los manipuladores industriales de seis ejes con servomotores de corriente alterna y sensores de posición absolutos, capaces de repetibilidades que van de la centésima a la décima de milímetro según su tamaño. En un rango intermedio, los robots colaborativos, diseñados para trabajar junto a personas y detenerse ante una colisión. En el extremo accesible, los brazos educativos y de laboratorio de bajo costo, construidos con servomotores de radiocontrol y estructuras livianas, gobernados por microcontroladores de propósito general [4]. Este proyecto se inscribe en la tercera familia.</w:t>
       </w:r>
     </w:p>
     <w:p>
@@ -1029,7 +918,7 @@
           <w:sz w:val="24"/>
           <w:szCs w:val="24"/>
         </w:rPr>
-        <w:t xml:space="preserve">Entre los principales desafíos se destacan la generación simultánea de cinco señales moduladas por ancho de pulso con resolución mejor que 10 µs, el dimensionamiento del par en cada articulación —parámetro que determina la selección de los actuadores y, con ella, el costo del proyecto—, el manejo de picos de corriente superiores a los diez amperios que puede demandar el conjunto de actuadores, el control coordinado de los cinco ejes para lograr un movimiento suave, y la seguridad funcional del conjunto.</w:t>
+        <w:t xml:space="preserve">El presente proyecto consiste en el diseño y la construcción de un brazo robótico de cuatro grados de libertad más pinza, accionado por cinco servomotores y gobernado por la placa EDU-CIAA-NXP, que integra el microcontrolador NXP LPC4337 de arquitectura ARM Cortex-M4 [1][2]. El operador comanda el brazo mediante una interfaz local compuesta por un joystick analógico y pulsadores, sin necesidad de acercarse al objeto manipulado.</w:t>
       </w:r>
     </w:p>
     <w:p>
@@ -1044,7 +933,37 @@
           <w:sz w:val="24"/>
           <w:szCs w:val="24"/>
         </w:rPr>
-        <w:t xml:space="preserve">En conclusión, el proyecto constituye un caso de aplicación concreto que integra conocimientos adquiridos durante la carrera: programación de sistemas embebidos en tiempo real, manejo de periféricos de temporización y conversión analógico-digital, diseño de circuitos impresos, electrónica de potencia y ensayo de prototipos. Se deja explícitamente fuera del alcance toda pretensión de certificación para uso con sustancias peligrosas reales: el objetivo es demostrar el principio de funcionamiento y las medidas de seguridad asociadas.</w:t>
+        <w:t xml:space="preserve">El caso de uso que se adopta para el desarrollo y la demostración es el traslado de un vaso con líquido, que simula un residuo químico. La elección no es arbitraria: manipular un recipiente abierto con contenido líquido impone dos condiciones que un objeto sólido no impone. La primera es que el recipiente debe permanecer en posición vertical durante todo el recorrido, lo que obliga a coordinar la muñeca con el resto de las articulaciones. La segunda es que el movimiento debe ser suave, porque una aceleración brusca derrama el contenido. Ambas condiciones convierten un simple traslado en un problema de control de trayectoria.</w:t>
+      </w:r>
+    </w:p>
+    <w:p>
+      <w:pPr>
+        <w:spacing w:after="120" w:line="360"/>
+        <w:ind w:firstLine="709"/>
+        <w:jc w:val="both"/>
+      </w:pPr>
+      <w:r>
+        <w:rPr>
+          <w:rFonts w:ascii="Times New Roman" w:cs="Times New Roman" w:eastAsia="Times New Roman" w:hAnsi="Times New Roman"/>
+          <w:sz w:val="24"/>
+          <w:szCs w:val="24"/>
+        </w:rPr>
+        <w:t xml:space="preserve">Entre los principales desafíos técnicos se destacan la generación simultánea de cinco señales moduladas por ancho de pulso con la precisión que exige un servomotor, el dimensionamiento del par en cada articulación —parámetro que determina la selección de los actuadores y condiciona toda la geometría del brazo—, el manejo de los picos de corriente que demanda el conjunto de actuadores, y el control coordinado de los cinco ejes para lograr un movimiento suave y sin derrames.</w:t>
+      </w:r>
+    </w:p>
+    <w:p>
+      <w:pPr>
+        <w:spacing w:after="120" w:line="360"/>
+        <w:ind w:firstLine="709"/>
+        <w:jc w:val="both"/>
+      </w:pPr>
+      <w:r>
+        <w:rPr>
+          <w:rFonts w:ascii="Times New Roman" w:cs="Times New Roman" w:eastAsia="Times New Roman" w:hAnsi="Times New Roman"/>
+          <w:sz w:val="24"/>
+          <w:szCs w:val="24"/>
+        </w:rPr>
+        <w:t xml:space="preserve">En conclusión, el proyecto constituye un caso de aplicación concreto que integra conocimientos adquiridos durante la carrera: programación de sistemas embebidos en tiempo real, manejo de periféricos de temporización y conversión analógico-digital, diseño de circuitos impresos, electrónica de potencia y ensayo de prototipos. Se deja explícitamente fuera del alcance toda pretensión de uso con sustancias peligrosas reales: el objetivo es demostrar el principio de funcionamiento sobre un caso simulado.</w:t>
       </w:r>
     </w:p>
     <w:p>
@@ -1081,7 +1000,7 @@
           <w:sz w:val="24"/>
           <w:szCs w:val="24"/>
         </w:rPr>
-        <w:t xml:space="preserve">Especificar los objetivos significa plantear el problema que se intenta resolver. En este caso: permitir que un operador tome, traslade y deposite un recipiente sin aproximarse físicamente a él, y que reciba información del ambiente en el que se realiza la operación.</w:t>
+        <w:t xml:space="preserve">Especificar los objetivos significa plantear el problema que se intenta resolver. En este caso: permitir que un operador tome un recipiente con contenido líquido, lo traslade y lo deposite en otro lugar sin tocarlo con las manos y sin derramar su contenido.</w:t>
       </w:r>
     </w:p>
     <w:p>
@@ -1155,7 +1074,7 @@
           <w:sz w:val="24"/>
           <w:szCs w:val="24"/>
         </w:rPr>
-        <w:t xml:space="preserve">Implementar una interfaz de operador local que permita el control manual e independiente de cada articulación.</w:t>
+        <w:t xml:space="preserve">Implementar una interfaz de operador local, basada en joystick analógico y pulsadores, que permita el control manual de cada articulación.</w:t>
       </w:r>
     </w:p>
     <w:p>
@@ -1174,7 +1093,7 @@
           <w:sz w:val="24"/>
           <w:szCs w:val="24"/>
         </w:rPr>
-        <w:t xml:space="preserve">Incorporar un subsistema de monitoreo ambiental que genere una alarma y detenga el movimiento al superarse los umbrales configurados.</w:t>
+        <w:t xml:space="preserve">Lograr que el brazo tome un vaso con líquido, lo traslade y lo deposite sin volcarlo ni derramar su contenido.</w:t>
       </w:r>
     </w:p>
     <w:p>
@@ -1193,7 +1112,7 @@
           <w:sz w:val="24"/>
           <w:szCs w:val="24"/>
         </w:rPr>
-        <w:t xml:space="preserve">Implementar una parada de emergencia que interrumpa por hardware la alimentación de los actuadores.</w:t>
+        <w:t xml:space="preserve">Mantener el recipiente en posición vertical durante todo el recorrido, coordinando la muñeca con el resto de las articulaciones.</w:t>
       </w:r>
     </w:p>
     <w:p>
@@ -1253,6 +1172,21 @@
     </w:p>
     <w:p>
       <w:pPr>
+        <w:spacing w:after="80" w:line="360"/>
+        <w:ind w:firstLine="709"/>
+        <w:jc w:val="both"/>
+      </w:pPr>
+      <w:r>
+        <w:rPr>
+          <w:rFonts w:ascii="Times New Roman" w:cs="Times New Roman" w:eastAsia="Times New Roman" w:hAnsi="Times New Roman"/>
+          <w:sz w:val="24"/>
+          <w:szCs w:val="24"/>
+        </w:rPr>
+        <w:t xml:space="preserve">Son mejoras de cumplimiento no obligatorio, sujetas a la disponibilidad de materiales, al costo y, sobre todo, al tiempo de desarrollo disponible:</w:t>
+      </w:r>
+    </w:p>
+    <w:p>
+      <w:pPr>
         <w:pStyle w:val="ListParagraph"/>
         <w:numPr>
           <w:ilvl w:val="0"/>
@@ -1267,7 +1201,7 @@
           <w:sz w:val="24"/>
           <w:szCs w:val="24"/>
         </w:rPr>
-        <w:t xml:space="preserve">Implementar un modo de grabación y reproducción de secuencias de movimiento.</w:t>
+        <w:t xml:space="preserve">Incorporar una parada de emergencia que interrumpa la alimentación de los actuadores.</w:t>
       </w:r>
     </w:p>
     <w:p>
@@ -1286,7 +1220,7 @@
           <w:sz w:val="24"/>
           <w:szCs w:val="24"/>
         </w:rPr>
-        <w:t xml:space="preserve">Desarrollar una interfaz en computadora personal para telemetría y comando remoto por puerto serie.</w:t>
+        <w:t xml:space="preserve">Implementar un modo de grabación y reproducción de secuencias de movimiento.</w:t>
       </w:r>
     </w:p>
     <w:p>
@@ -1305,7 +1239,7 @@
           <w:sz w:val="24"/>
           <w:szCs w:val="24"/>
         </w:rPr>
-        <w:t xml:space="preserve">Incorporar realimentación de posición mediante potenciómetro externo o medición de corriente de los actuadores.</w:t>
+        <w:t xml:space="preserve">Implementar la cinemática inversa del brazo, de modo de comandar el extremo en coordenadas cartesianas en lugar de articulación por articulación.</w:t>
       </w:r>
     </w:p>
     <w:p>
@@ -1324,7 +1258,7 @@
           <w:sz w:val="24"/>
           <w:szCs w:val="24"/>
         </w:rPr>
-        <w:t xml:space="preserve">Implementar la cinemática inversa del brazo para comandar el extremo en coordenadas cartesianas.</w:t>
+        <w:t xml:space="preserve">Transmitir el estado del sistema a una computadora por puerto serie, con fines de depuración y registro.</w:t>
       </w:r>
     </w:p>
     <w:p>
@@ -1367,7 +1301,7 @@
       <w:r>
         <w:drawing>
           <wp:inline distT="0" distB="0" distL="0" distR="0">
-            <wp:extent cx="5381625" cy="3019425"/>
+            <wp:extent cx="5381625" cy="2619375"/>
             <wp:effectExtent t="0" r="0" b="0" l="0"/>
             <wp:docPr id="1" name="" descr="" title=""/>
             <wp:cNvGraphicFramePr>
@@ -1392,7 +1326,7 @@
                   <pic:spPr bwMode="auto">
                     <a:xfrm>
                       <a:off x="0" y="0"/>
-                      <a:ext cx="5381625" cy="3019425"/>
+                      <a:ext cx="5381625" cy="2619375"/>
                     </a:xfrm>
                     <a:prstGeom prst="rect">
                       <a:avLst/>
@@ -1441,7 +1375,7 @@
           <w:sz w:val="24"/>
           <w:szCs w:val="24"/>
         </w:rPr>
-        <w:t xml:space="preserve">La placa EDU-CIAA-NXP concentra toda la lógica: ejecuta la máquina de estados de la aplicación, calcula la interpolación de los cinco ejes, genera las señales de accionamiento mediante el temporizador configurable por estados y muestrea periódicamente los sensores empleando el temporizador SysTick y el controlador de interrupciones anidadas [4][5].</w:t>
+        <w:t xml:space="preserve">La placa EDU-CIAA-NXP concentra toda la lógica del sistema. Lee la posición del joystick mediante su conversor analógico-digital, ejecuta la máquina de estados de la aplicación, calcula la interpolación coordinada de los cinco ejes y genera las señales de accionamiento, empleando el temporizador SysTick como base de tiempo [2].</w:t>
       </w:r>
     </w:p>
     <w:p>
@@ -1456,7 +1390,7 @@
           <w:sz w:val="24"/>
           <w:szCs w:val="24"/>
         </w:rPr>
-        <w:t xml:space="preserve">El joystick analógico de dos ejes, leído por el conversor analógico-digital, permite comandar dos articulaciones de forma continua; los pulsadores de la placa seleccionan el par de articulaciones activo y el modo de operación, y el display alfanumérico indica el estado del sistema. Un sensor de gas de la serie MQ y un sensor de temperatura, ambos de salida analógica, se muestrean cada 100 ms, mientras que los finales de carrera delimitan por hardware el recorrido de las articulaciones críticas.</w:t>
+        <w:t xml:space="preserve">La interfaz de operador está formada por un joystick analógico de dos ejes y los pulsadores de la placa. El joystick comanda dos articulaciones de forma continua y los pulsadores seleccionan el par de articulaciones activo y el modo de operación. Los indicadores luminosos de la placa señalan el estado del sistema.</w:t>
       </w:r>
     </w:p>
     <w:p>
@@ -1471,7 +1405,7 @@
           <w:sz w:val="24"/>
           <w:szCs w:val="24"/>
         </w:rPr>
-        <w:t xml:space="preserve">Los cinco servomotores se alimentan desde una fuente independiente de la lógica, con la que solo comparten la referencia de masa. La etapa de potencia incorpora el desacople capacitivo y los buffers de las señales de comando. El pulsador de parada de emergencia se intercala en esta alimentación, de modo que su accionamiento detiene los actuadores con independencia del estado del programa.</w:t>
+        <w:t xml:space="preserve">Los cinco servomotores se alimentan desde una fuente independiente de la lógica, con la que solo comparten la referencia de masa, para evitar que los picos de corriente de los actuadores afecten al microcontrolador. La etapa de potencia incorpora el desacople capacitivo y los buffers de las señales de comando.</w:t>
       </w:r>
     </w:p>
     <w:p>
@@ -1508,7 +1442,24 @@
           <w:sz w:val="24"/>
           <w:szCs w:val="24"/>
         </w:rPr>
-        <w:t xml:space="preserve">Los requerimientos se enumeran agrupados por afinidad y se expresan, siempre que resulta posible, en términos cuantificables y medibles. Los identificados como de prioridad menor podrán reasignarse a objetivos secundarios si el cronograma lo exige.</w:t>
+        <w:t xml:space="preserve">Los requerimientos se enumeran agrupados por afinidad. Los identificados como de prioridad menor podrán reasignarse a objetivos secundarios si el cronograma lo exige.</w:t>
+      </w:r>
+    </w:p>
+    <w:p>
+      <w:pPr>
+        <w:spacing w:after="120" w:line="360"/>
+        <w:ind w:firstLine="709"/>
+        <w:jc w:val="both"/>
+      </w:pPr>
+      <w:r>
+        <w:rPr>
+          <w:rFonts w:ascii="Times New Roman" w:cs="Times New Roman" w:eastAsia="Times New Roman" w:hAnsi="Times New Roman"/>
+          <w:i/>
+          <w:iCs/>
+          <w:sz w:val="24"/>
+          <w:szCs w:val="24"/>
+        </w:rPr>
+        <w:t xml:space="preserve">Varios requerimientos incluyen magnitudes indicadas como «a determinar». Se trata de valores que dependen de la geometría y de los actuadores que se adopten, y que se fijarán durante la fase de diseño, para ser incorporados al informe de avance 1. Declararlos ahora, antes de haber hecho el análisis mecánico, sería arbitrario.</w:t>
       </w:r>
     </w:p>
     <w:p>
@@ -1525,24 +1476,7 @@
           <w:sz w:val="26"/>
           <w:szCs w:val="26"/>
         </w:rPr>
-        <w:t xml:space="preserve">3.1 FUNCIONALES</w:t>
-      </w:r>
-    </w:p>
-    <w:p>
-      <w:pPr>
-        <w:pStyle w:val="Heading3"/>
-        <w:spacing w:after="100" w:before="200"/>
-      </w:pPr>
-      <w:r>
-        <w:rPr>
-          <w:rFonts w:ascii="Times New Roman" w:cs="Times New Roman" w:eastAsia="Times New Roman" w:hAnsi="Times New Roman"/>
-          <w:b/>
-          <w:bCs/>
-          <w:color w:val="000000"/>
-          <w:sz w:val="24"/>
-          <w:szCs w:val="24"/>
-        </w:rPr>
-        <w:t xml:space="preserve">Hardware</w:t>
+        <w:t xml:space="preserve">1. Requerimientos funcionales de hardware</w:t>
       </w:r>
     </w:p>
     <w:p>
@@ -1557,7 +1491,7 @@
           <w:sz w:val="24"/>
           <w:szCs w:val="24"/>
         </w:rPr>
-        <w:t xml:space="preserve">1.0 </w:t>
+        <w:t xml:space="preserve">1.1 </w:t>
       </w:r>
       <w:r>
         <w:rPr>
@@ -1580,7 +1514,7 @@
           <w:sz w:val="24"/>
           <w:szCs w:val="24"/>
         </w:rPr>
-        <w:t xml:space="preserve">1.1 </w:t>
+        <w:t xml:space="preserve">1.2 </w:t>
       </w:r>
       <w:r>
         <w:rPr>
@@ -1603,15 +1537,15 @@
           <w:sz w:val="24"/>
           <w:szCs w:val="24"/>
         </w:rPr>
-        <w:t xml:space="preserve">1.2 </w:t>
-      </w:r>
-      <w:r>
-        <w:rPr>
-          <w:rFonts w:ascii="Times New Roman" w:cs="Times New Roman" w:eastAsia="Times New Roman" w:hAnsi="Times New Roman"/>
-          <w:sz w:val="24"/>
-          <w:szCs w:val="24"/>
-        </w:rPr>
-        <w:t xml:space="preserve">El brazo debe manipular una carga útil mínima de 120 g con un alcance horizontal no menor a 20 cm. El valor definitivo surge de la alternativa que se adopte (Anexo A).</w:t>
+        <w:t xml:space="preserve">1.3 </w:t>
+      </w:r>
+      <w:r>
+        <w:rPr>
+          <w:rFonts w:ascii="Times New Roman" w:cs="Times New Roman" w:eastAsia="Times New Roman" w:hAnsi="Times New Roman"/>
+          <w:sz w:val="24"/>
+          <w:szCs w:val="24"/>
+        </w:rPr>
+        <w:t xml:space="preserve">El brazo debe manipular un recipiente cilíndrico con contenido líquido. Masa y dimensiones del recipiente: a determinar en la fase de diseño.</w:t>
       </w:r>
     </w:p>
     <w:p>
@@ -1626,15 +1560,15 @@
           <w:sz w:val="24"/>
           <w:szCs w:val="24"/>
         </w:rPr>
-        <w:t xml:space="preserve">1.3 </w:t>
-      </w:r>
-      <w:r>
-        <w:rPr>
-          <w:rFonts w:ascii="Times New Roman" w:cs="Times New Roman" w:eastAsia="Times New Roman" w:hAnsi="Times New Roman"/>
-          <w:sz w:val="24"/>
-          <w:szCs w:val="24"/>
-        </w:rPr>
-        <w:t xml:space="preserve">La pinza debe sujetar recipientes cilíndricos de 20 mm a 60 mm de diámetro sin deslizamiento.</w:t>
+        <w:t xml:space="preserve">1.4 </w:t>
+      </w:r>
+      <w:r>
+        <w:rPr>
+          <w:rFonts w:ascii="Times New Roman" w:cs="Times New Roman" w:eastAsia="Times New Roman" w:hAnsi="Times New Roman"/>
+          <w:sz w:val="24"/>
+          <w:szCs w:val="24"/>
+        </w:rPr>
+        <w:t xml:space="preserve">La pinza debe sujetar el recipiente sin que este deslice ni gire durante el traslado.</w:t>
       </w:r>
     </w:p>
     <w:p>
@@ -1649,15 +1583,15 @@
           <w:sz w:val="24"/>
           <w:szCs w:val="24"/>
         </w:rPr>
-        <w:t xml:space="preserve">1.4 </w:t>
-      </w:r>
-      <w:r>
-        <w:rPr>
-          <w:rFonts w:ascii="Times New Roman" w:cs="Times New Roman" w:eastAsia="Times New Roman" w:hAnsi="Times New Roman"/>
-          <w:sz w:val="24"/>
-          <w:szCs w:val="24"/>
-        </w:rPr>
-        <w:t xml:space="preserve">Los actuadores deben alimentarse desde una fuente independiente de 5 V a 6 V, capaz de entregar 10 A, con masa común a la lógica y desacople capacitivo local de al menos 1000 µF.</w:t>
+        <w:t xml:space="preserve">1.5 </w:t>
+      </w:r>
+      <w:r>
+        <w:rPr>
+          <w:rFonts w:ascii="Times New Roman" w:cs="Times New Roman" w:eastAsia="Times New Roman" w:hAnsi="Times New Roman"/>
+          <w:sz w:val="24"/>
+          <w:szCs w:val="24"/>
+        </w:rPr>
+        <w:t xml:space="preserve">El alcance horizontal del brazo debe permitir tomar el recipiente de una posición y depositarlo en otra sin desplazar la base. Valor a determinar en la fase de diseño.</w:t>
       </w:r>
     </w:p>
     <w:p>
@@ -1672,15 +1606,15 @@
           <w:sz w:val="24"/>
           <w:szCs w:val="24"/>
         </w:rPr>
-        <w:t xml:space="preserve">1.5 </w:t>
-      </w:r>
-      <w:r>
-        <w:rPr>
-          <w:rFonts w:ascii="Times New Roman" w:cs="Times New Roman" w:eastAsia="Times New Roman" w:hAnsi="Times New Roman"/>
-          <w:sz w:val="24"/>
-          <w:szCs w:val="24"/>
-        </w:rPr>
-        <w:t xml:space="preserve">El sistema debe incluir un circuito impreso de desarrollo propio que integre conectores, buffers de señal y acondicionamiento.</w:t>
+        <w:t xml:space="preserve">1.6 </w:t>
+      </w:r>
+      <w:r>
+        <w:rPr>
+          <w:rFonts w:ascii="Times New Roman" w:cs="Times New Roman" w:eastAsia="Times New Roman" w:hAnsi="Times New Roman"/>
+          <w:sz w:val="24"/>
+          <w:szCs w:val="24"/>
+        </w:rPr>
+        <w:t xml:space="preserve">Los actuadores deben alimentarse desde una fuente independiente de la lógica, compartiendo únicamente la referencia de masa, con desacople capacitivo local. Tensión y corriente: a determinar según los actuadores que se adopten.</w:t>
       </w:r>
     </w:p>
     <w:p>
@@ -1695,15 +1629,15 @@
           <w:sz w:val="24"/>
           <w:szCs w:val="24"/>
         </w:rPr>
-        <w:t xml:space="preserve">1.6 </w:t>
-      </w:r>
-      <w:r>
-        <w:rPr>
-          <w:rFonts w:ascii="Times New Roman" w:cs="Times New Roman" w:eastAsia="Times New Roman" w:hAnsi="Times New Roman"/>
-          <w:sz w:val="24"/>
-          <w:szCs w:val="24"/>
-        </w:rPr>
-        <w:t xml:space="preserve">Debe incorporarse un pulsador de parada de emergencia que interrumpa por hardware la alimentación de los actuadores.</w:t>
+        <w:t xml:space="preserve">1.7 </w:t>
+      </w:r>
+      <w:r>
+        <w:rPr>
+          <w:rFonts w:ascii="Times New Roman" w:cs="Times New Roman" w:eastAsia="Times New Roman" w:hAnsi="Times New Roman"/>
+          <w:sz w:val="24"/>
+          <w:szCs w:val="24"/>
+        </w:rPr>
+        <w:t xml:space="preserve">El sistema debe incluir un circuito impreso de desarrollo propio que integre conectores, buffers de señal y acondicionamiento.</w:t>
       </w:r>
     </w:p>
     <w:p>
@@ -1718,15 +1652,15 @@
           <w:sz w:val="24"/>
           <w:szCs w:val="24"/>
         </w:rPr>
-        <w:t xml:space="preserve">1.7 </w:t>
-      </w:r>
-      <w:r>
-        <w:rPr>
-          <w:rFonts w:ascii="Times New Roman" w:cs="Times New Roman" w:eastAsia="Times New Roman" w:hAnsi="Times New Roman"/>
-          <w:sz w:val="24"/>
-          <w:szCs w:val="24"/>
-        </w:rPr>
-        <w:t xml:space="preserve">Debe incorporarse un sensor de gas de la serie MQ y un sensor de temperatura, ambos leídos por el conversor analógico-digital.</w:t>
+        <w:t xml:space="preserve">1.8 </w:t>
+      </w:r>
+      <w:r>
+        <w:rPr>
+          <w:rFonts w:ascii="Times New Roman" w:cs="Times New Roman" w:eastAsia="Times New Roman" w:hAnsi="Times New Roman"/>
+          <w:sz w:val="24"/>
+          <w:szCs w:val="24"/>
+        </w:rPr>
+        <w:t xml:space="preserve">La interfaz de operador debe incluir un joystick analógico de dos ejes y pulsadores para la selección de articulación y de modo de operación.</w:t>
       </w:r>
     </w:p>
     <w:p>
@@ -1741,15 +1675,15 @@
           <w:sz w:val="24"/>
           <w:szCs w:val="24"/>
         </w:rPr>
-        <w:t xml:space="preserve">1.8 </w:t>
-      </w:r>
-      <w:r>
-        <w:rPr>
-          <w:rFonts w:ascii="Times New Roman" w:cs="Times New Roman" w:eastAsia="Times New Roman" w:hAnsi="Times New Roman"/>
-          <w:sz w:val="24"/>
-          <w:szCs w:val="24"/>
-        </w:rPr>
-        <w:t xml:space="preserve">La interfaz de operador debe incluir un joystick analógico de dos ejes, al menos cuatro pulsadores y un display alfanumérico.</w:t>
+        <w:t xml:space="preserve">1.9 </w:t>
+      </w:r>
+      <w:r>
+        <w:rPr>
+          <w:rFonts w:ascii="Times New Roman" w:cs="Times New Roman" w:eastAsia="Times New Roman" w:hAnsi="Times New Roman"/>
+          <w:sz w:val="24"/>
+          <w:szCs w:val="24"/>
+        </w:rPr>
+        <w:t xml:space="preserve">El sistema debe señalizar su estado de operación mediante los indicadores luminosos disponibles en la placa.</w:t>
       </w:r>
     </w:p>
     <w:p>
@@ -1764,29 +1698,6 @@
           <w:sz w:val="24"/>
           <w:szCs w:val="24"/>
         </w:rPr>
-        <w:t xml:space="preserve">1.9 </w:t>
-      </w:r>
-      <w:r>
-        <w:rPr>
-          <w:rFonts w:ascii="Times New Roman" w:cs="Times New Roman" w:eastAsia="Times New Roman" w:hAnsi="Times New Roman"/>
-          <w:sz w:val="24"/>
-          <w:szCs w:val="24"/>
-        </w:rPr>
-        <w:t xml:space="preserve">Deben incorporarse finales de carrera que delimiten el recorrido de las articulaciones de base y hombro.</w:t>
-      </w:r>
-    </w:p>
-    <w:p>
-      <w:pPr>
-        <w:spacing w:after="110" w:line="360"/>
-        <w:ind w:left="284" w:hanging="284"/>
-        <w:jc w:val="both"/>
-      </w:pPr>
-      <w:r>
-        <w:rPr>
-          <w:rFonts w:ascii="Times New Roman" w:cs="Times New Roman" w:eastAsia="Times New Roman" w:hAnsi="Times New Roman"/>
-          <w:sz w:val="24"/>
-          <w:szCs w:val="24"/>
-        </w:rPr>
         <w:t xml:space="preserve">1.10 </w:t>
       </w:r>
       <w:r>
@@ -1795,340 +1706,7 @@
           <w:sz w:val="24"/>
           <w:szCs w:val="24"/>
         </w:rPr>
-        <w:t xml:space="preserve">Debe incorporarse señalización luminosa mediante LED RGB para distinguir los estados de operación.</w:t>
-      </w:r>
-      <w:r>
-        <w:rPr>
-          <w:rFonts w:ascii="Times New Roman" w:cs="Times New Roman" w:eastAsia="Times New Roman" w:hAnsi="Times New Roman"/>
-          <w:i/>
-          <w:iCs/>
-          <w:sz w:val="24"/>
-          <w:szCs w:val="24"/>
-        </w:rPr>
-        <w:t xml:space="preserve"> (prioridad menor)</w:t>
-      </w:r>
-    </w:p>
-    <w:p>
-      <w:pPr>
-        <w:spacing w:after="110" w:line="360"/>
-        <w:ind w:left="284" w:hanging="284"/>
-        <w:jc w:val="both"/>
-      </w:pPr>
-      <w:r>
-        <w:rPr>
-          <w:rFonts w:ascii="Times New Roman" w:cs="Times New Roman" w:eastAsia="Times New Roman" w:hAnsi="Times New Roman"/>
-          <w:sz w:val="24"/>
-          <w:szCs w:val="24"/>
-        </w:rPr>
-        <w:t xml:space="preserve">1.11 </w:t>
-      </w:r>
-      <w:r>
-        <w:rPr>
-          <w:rFonts w:ascii="Times New Roman" w:cs="Times New Roman" w:eastAsia="Times New Roman" w:hAnsi="Times New Roman"/>
-          <w:sz w:val="24"/>
-          <w:szCs w:val="24"/>
-        </w:rPr>
-        <w:t xml:space="preserve">Debe incorporarse realimentación de posición en la articulación de base mediante potenciómetro externo.</w:t>
-      </w:r>
-      <w:r>
-        <w:rPr>
-          <w:rFonts w:ascii="Times New Roman" w:cs="Times New Roman" w:eastAsia="Times New Roman" w:hAnsi="Times New Roman"/>
-          <w:i/>
-          <w:iCs/>
-          <w:sz w:val="24"/>
-          <w:szCs w:val="24"/>
-        </w:rPr>
-        <w:t xml:space="preserve"> (prioridad menor)</w:t>
-      </w:r>
-    </w:p>
-    <w:p>
-      <w:pPr>
-        <w:pStyle w:val="Heading3"/>
-        <w:spacing w:after="100" w:before="200"/>
-      </w:pPr>
-      <w:r>
-        <w:rPr>
-          <w:rFonts w:ascii="Times New Roman" w:cs="Times New Roman" w:eastAsia="Times New Roman" w:hAnsi="Times New Roman"/>
-          <w:b/>
-          <w:bCs/>
-          <w:color w:val="000000"/>
-          <w:sz w:val="24"/>
-          <w:szCs w:val="24"/>
-        </w:rPr>
-        <w:t xml:space="preserve">Software</w:t>
-      </w:r>
-    </w:p>
-    <w:p>
-      <w:pPr>
-        <w:spacing w:after="110" w:line="360"/>
-        <w:ind w:left="284" w:hanging="284"/>
-        <w:jc w:val="both"/>
-      </w:pPr>
-      <w:r>
-        <w:rPr>
-          <w:rFonts w:ascii="Times New Roman" w:cs="Times New Roman" w:eastAsia="Times New Roman" w:hAnsi="Times New Roman"/>
-          <w:sz w:val="24"/>
-          <w:szCs w:val="24"/>
-        </w:rPr>
-        <w:t xml:space="preserve">2.0 </w:t>
-      </w:r>
-      <w:r>
-        <w:rPr>
-          <w:rFonts w:ascii="Times New Roman" w:cs="Times New Roman" w:eastAsia="Times New Roman" w:hAnsi="Times New Roman"/>
-          <w:sz w:val="24"/>
-          <w:szCs w:val="24"/>
-        </w:rPr>
-        <w:t xml:space="preserve">El firmware debe desarrollarse en lenguaje C sobre el proyecto Firmware v3, con la biblioteca sAPI sobre LPCOpen [6].</w:t>
-      </w:r>
-    </w:p>
-    <w:p>
-      <w:pPr>
-        <w:spacing w:after="110" w:line="360"/>
-        <w:ind w:left="284" w:hanging="284"/>
-        <w:jc w:val="both"/>
-      </w:pPr>
-      <w:r>
-        <w:rPr>
-          <w:rFonts w:ascii="Times New Roman" w:cs="Times New Roman" w:eastAsia="Times New Roman" w:hAnsi="Times New Roman"/>
-          <w:sz w:val="24"/>
-          <w:szCs w:val="24"/>
-        </w:rPr>
-        <w:t xml:space="preserve">2.1 </w:t>
-      </w:r>
-      <w:r>
-        <w:rPr>
-          <w:rFonts w:ascii="Times New Roman" w:cs="Times New Roman" w:eastAsia="Times New Roman" w:hAnsi="Times New Roman"/>
-          <w:sz w:val="24"/>
-          <w:szCs w:val="24"/>
-        </w:rPr>
-        <w:t xml:space="preserve">El firmware debe estructurarse en capas de controladores, lógica de control y aplicación, con módulos compilables de forma independiente.</w:t>
-      </w:r>
-    </w:p>
-    <w:p>
-      <w:pPr>
-        <w:spacing w:after="110" w:line="360"/>
-        <w:ind w:left="284" w:hanging="284"/>
-        <w:jc w:val="both"/>
-      </w:pPr>
-      <w:r>
-        <w:rPr>
-          <w:rFonts w:ascii="Times New Roman" w:cs="Times New Roman" w:eastAsia="Times New Roman" w:hAnsi="Times New Roman"/>
-          <w:sz w:val="24"/>
-          <w:szCs w:val="24"/>
-        </w:rPr>
-        <w:t xml:space="preserve">2.2 </w:t>
-      </w:r>
-      <w:r>
-        <w:rPr>
-          <w:rFonts w:ascii="Times New Roman" w:cs="Times New Roman" w:eastAsia="Times New Roman" w:hAnsi="Times New Roman"/>
-          <w:sz w:val="24"/>
-          <w:szCs w:val="24"/>
-        </w:rPr>
-        <w:t xml:space="preserve">Debe generar cinco señales de ancho de pulso modulado de 50 Hz, con ancho ajustable entre 500 µs y 2500 µs y resolución no mayor a 10 µs.</w:t>
-      </w:r>
-    </w:p>
-    <w:p>
-      <w:pPr>
-        <w:spacing w:after="110" w:line="360"/>
-        <w:ind w:left="284" w:hanging="284"/>
-        <w:jc w:val="both"/>
-      </w:pPr>
-      <w:r>
-        <w:rPr>
-          <w:rFonts w:ascii="Times New Roman" w:cs="Times New Roman" w:eastAsia="Times New Roman" w:hAnsi="Times New Roman"/>
-          <w:sz w:val="24"/>
-          <w:szCs w:val="24"/>
-        </w:rPr>
-        <w:t xml:space="preserve">2.3 </w:t>
-      </w:r>
-      <w:r>
-        <w:rPr>
-          <w:rFonts w:ascii="Times New Roman" w:cs="Times New Roman" w:eastAsia="Times New Roman" w:hAnsi="Times New Roman"/>
-          <w:sz w:val="24"/>
-          <w:szCs w:val="24"/>
-        </w:rPr>
-        <w:t xml:space="preserve">Debe limitar la velocidad angular de cada articulación a 60 °/s mediante rampas de aceleración y desaceleración.</w:t>
-      </w:r>
-    </w:p>
-    <w:p>
-      <w:pPr>
-        <w:spacing w:after="110" w:line="360"/>
-        <w:ind w:left="284" w:hanging="284"/>
-        <w:jc w:val="both"/>
-      </w:pPr>
-      <w:r>
-        <w:rPr>
-          <w:rFonts w:ascii="Times New Roman" w:cs="Times New Roman" w:eastAsia="Times New Roman" w:hAnsi="Times New Roman"/>
-          <w:sz w:val="24"/>
-          <w:szCs w:val="24"/>
-        </w:rPr>
-        <w:t xml:space="preserve">2.4 </w:t>
-      </w:r>
-      <w:r>
-        <w:rPr>
-          <w:rFonts w:ascii="Times New Roman" w:cs="Times New Roman" w:eastAsia="Times New Roman" w:hAnsi="Times New Roman"/>
-          <w:sz w:val="24"/>
-          <w:szCs w:val="24"/>
-        </w:rPr>
-        <w:t xml:space="preserve">Debe implementar una máquina de estados con los estados Inicialización, Manual, Automático, Alarma y Emergencia.</w:t>
-      </w:r>
-    </w:p>
-    <w:p>
-      <w:pPr>
-        <w:spacing w:after="110" w:line="360"/>
-        <w:ind w:left="284" w:hanging="284"/>
-        <w:jc w:val="both"/>
-      </w:pPr>
-      <w:r>
-        <w:rPr>
-          <w:rFonts w:ascii="Times New Roman" w:cs="Times New Roman" w:eastAsia="Times New Roman" w:hAnsi="Times New Roman"/>
-          <w:sz w:val="24"/>
-          <w:szCs w:val="24"/>
-        </w:rPr>
-        <w:t xml:space="preserve">2.5 </w:t>
-      </w:r>
-      <w:r>
-        <w:rPr>
-          <w:rFonts w:ascii="Times New Roman" w:cs="Times New Roman" w:eastAsia="Times New Roman" w:hAnsi="Times New Roman"/>
-          <w:sz w:val="24"/>
-          <w:szCs w:val="24"/>
-        </w:rPr>
-        <w:t xml:space="preserve">Debe muestrear los sensores cada 100 ms empleando el temporizador SysTick e interrupciones, sin utilizar retardos bloqueantes.</w:t>
-      </w:r>
-    </w:p>
-    <w:p>
-      <w:pPr>
-        <w:spacing w:after="110" w:line="360"/>
-        <w:ind w:left="284" w:hanging="284"/>
-        <w:jc w:val="both"/>
-      </w:pPr>
-      <w:r>
-        <w:rPr>
-          <w:rFonts w:ascii="Times New Roman" w:cs="Times New Roman" w:eastAsia="Times New Roman" w:hAnsi="Times New Roman"/>
-          <w:sz w:val="24"/>
-          <w:szCs w:val="24"/>
-        </w:rPr>
-        <w:t xml:space="preserve">2.6 </w:t>
-      </w:r>
-      <w:r>
-        <w:rPr>
-          <w:rFonts w:ascii="Times New Roman" w:cs="Times New Roman" w:eastAsia="Times New Roman" w:hAnsi="Times New Roman"/>
-          <w:sz w:val="24"/>
-          <w:szCs w:val="24"/>
-        </w:rPr>
-        <w:t xml:space="preserve">Ante la superación del umbral de gas configurado, debe pasar al estado Alarma en menos de 500 ms, detener el movimiento y señalizar la condición.</w:t>
-      </w:r>
-    </w:p>
-    <w:p>
-      <w:pPr>
-        <w:spacing w:after="110" w:line="360"/>
-        <w:ind w:left="284" w:hanging="284"/>
-        <w:jc w:val="both"/>
-      </w:pPr>
-      <w:r>
-        <w:rPr>
-          <w:rFonts w:ascii="Times New Roman" w:cs="Times New Roman" w:eastAsia="Times New Roman" w:hAnsi="Times New Roman"/>
-          <w:sz w:val="24"/>
-          <w:szCs w:val="24"/>
-        </w:rPr>
-        <w:t xml:space="preserve">2.7 </w:t>
-      </w:r>
-      <w:r>
-        <w:rPr>
-          <w:rFonts w:ascii="Times New Roman" w:cs="Times New Roman" w:eastAsia="Times New Roman" w:hAnsi="Times New Roman"/>
-          <w:sz w:val="24"/>
-          <w:szCs w:val="24"/>
-        </w:rPr>
-        <w:t xml:space="preserve">Debe implementar un temporizador de vigilancia que reinicie el sistema ante bloqueos superiores a 2 s.</w:t>
-      </w:r>
-    </w:p>
-    <w:p>
-      <w:pPr>
-        <w:spacing w:after="110" w:line="360"/>
-        <w:ind w:left="284" w:hanging="284"/>
-        <w:jc w:val="both"/>
-      </w:pPr>
-      <w:r>
-        <w:rPr>
-          <w:rFonts w:ascii="Times New Roman" w:cs="Times New Roman" w:eastAsia="Times New Roman" w:hAnsi="Times New Roman"/>
-          <w:sz w:val="24"/>
-          <w:szCs w:val="24"/>
-        </w:rPr>
-        <w:t xml:space="preserve">2.8 </w:t>
-      </w:r>
-      <w:r>
-        <w:rPr>
-          <w:rFonts w:ascii="Times New Roman" w:cs="Times New Roman" w:eastAsia="Times New Roman" w:hAnsi="Times New Roman"/>
-          <w:sz w:val="24"/>
-          <w:szCs w:val="24"/>
-        </w:rPr>
-        <w:t xml:space="preserve">Debe transmitir el estado del sistema por USART2 a 115200 baudios, 8N1, en formato de texto con marca de tiempo.</w:t>
-      </w:r>
-      <w:r>
-        <w:rPr>
-          <w:rFonts w:ascii="Times New Roman" w:cs="Times New Roman" w:eastAsia="Times New Roman" w:hAnsi="Times New Roman"/>
-          <w:i/>
-          <w:iCs/>
-          <w:sz w:val="24"/>
-          <w:szCs w:val="24"/>
-        </w:rPr>
-        <w:t xml:space="preserve"> (prioridad menor)</w:t>
-      </w:r>
-    </w:p>
-    <w:p>
-      <w:pPr>
-        <w:spacing w:after="110" w:line="360"/>
-        <w:ind w:left="284" w:hanging="284"/>
-        <w:jc w:val="both"/>
-      </w:pPr>
-      <w:r>
-        <w:rPr>
-          <w:rFonts w:ascii="Times New Roman" w:cs="Times New Roman" w:eastAsia="Times New Roman" w:hAnsi="Times New Roman"/>
-          <w:sz w:val="24"/>
-          <w:szCs w:val="24"/>
-        </w:rPr>
-        <w:t xml:space="preserve">2.9 </w:t>
-      </w:r>
-      <w:r>
-        <w:rPr>
-          <w:rFonts w:ascii="Times New Roman" w:cs="Times New Roman" w:eastAsia="Times New Roman" w:hAnsi="Times New Roman"/>
-          <w:sz w:val="24"/>
-          <w:szCs w:val="24"/>
-        </w:rPr>
-        <w:t xml:space="preserve">Debe permitir grabar y reproducir una secuencia de al menos diez posiciones.</w:t>
-      </w:r>
-      <w:r>
-        <w:rPr>
-          <w:rFonts w:ascii="Times New Roman" w:cs="Times New Roman" w:eastAsia="Times New Roman" w:hAnsi="Times New Roman"/>
-          <w:i/>
-          <w:iCs/>
-          <w:sz w:val="24"/>
-          <w:szCs w:val="24"/>
-        </w:rPr>
-        <w:t xml:space="preserve"> (prioridad menor)</w:t>
-      </w:r>
-    </w:p>
-    <w:p>
-      <w:pPr>
-        <w:spacing w:after="110" w:line="360"/>
-        <w:ind w:left="284" w:hanging="284"/>
-        <w:jc w:val="both"/>
-      </w:pPr>
-      <w:r>
-        <w:rPr>
-          <w:rFonts w:ascii="Times New Roman" w:cs="Times New Roman" w:eastAsia="Times New Roman" w:hAnsi="Times New Roman"/>
-          <w:sz w:val="24"/>
-          <w:szCs w:val="24"/>
-        </w:rPr>
-        <w:t xml:space="preserve">2.10 </w:t>
-      </w:r>
-      <w:r>
-        <w:rPr>
-          <w:rFonts w:ascii="Times New Roman" w:cs="Times New Roman" w:eastAsia="Times New Roman" w:hAnsi="Times New Roman"/>
-          <w:sz w:val="24"/>
-          <w:szCs w:val="24"/>
-        </w:rPr>
-        <w:t xml:space="preserve">Debe proveer una interfaz en computadora personal para telemetría y comando remoto.</w:t>
+        <w:t xml:space="preserve">Debe incorporarse una parada de emergencia que interrumpa la alimentación de los actuadores.</w:t>
       </w:r>
       <w:r>
         <w:rPr>
@@ -2155,7 +1733,7 @@
           <w:sz w:val="26"/>
           <w:szCs w:val="26"/>
         </w:rPr>
-        <w:t xml:space="preserve">3.2 NO FUNCIONALES</w:t>
+        <w:t xml:space="preserve">2. Requerimientos funcionales de software</w:t>
       </w:r>
     </w:p>
     <w:p>
@@ -2170,15 +1748,15 @@
           <w:sz w:val="24"/>
           <w:szCs w:val="24"/>
         </w:rPr>
-        <w:t xml:space="preserve">3.0 </w:t>
-      </w:r>
-      <w:r>
-        <w:rPr>
-          <w:rFonts w:ascii="Times New Roman" w:cs="Times New Roman" w:eastAsia="Times New Roman" w:hAnsi="Times New Roman"/>
-          <w:sz w:val="24"/>
-          <w:szCs w:val="24"/>
-        </w:rPr>
-        <w:t xml:space="preserve">El costo total de materiales no debe superar los $30.000 por integrante del grupo.</w:t>
+        <w:t xml:space="preserve">2.1 </w:t>
+      </w:r>
+      <w:r>
+        <w:rPr>
+          <w:rFonts w:ascii="Times New Roman" w:cs="Times New Roman" w:eastAsia="Times New Roman" w:hAnsi="Times New Roman"/>
+          <w:sz w:val="24"/>
+          <w:szCs w:val="24"/>
+        </w:rPr>
+        <w:t xml:space="preserve">El firmware debe desarrollarse en lenguaje C sobre el proyecto Firmware v3, con la biblioteca sAPI sobre LPCOpen [3].</w:t>
       </w:r>
     </w:p>
     <w:p>
@@ -2193,15 +1771,15 @@
           <w:sz w:val="24"/>
           <w:szCs w:val="24"/>
         </w:rPr>
-        <w:t xml:space="preserve">3.1 </w:t>
-      </w:r>
-      <w:r>
-        <w:rPr>
-          <w:rFonts w:ascii="Times New Roman" w:cs="Times New Roman" w:eastAsia="Times New Roman" w:hAnsi="Times New Roman"/>
-          <w:sz w:val="24"/>
-          <w:szCs w:val="24"/>
-        </w:rPr>
-        <w:t xml:space="preserve">El proyecto y su documentación deben completarse dentro del cronograma de la cátedra del segundo cuatrimestre de 2026.</w:t>
+        <w:t xml:space="preserve">2.2 </w:t>
+      </w:r>
+      <w:r>
+        <w:rPr>
+          <w:rFonts w:ascii="Times New Roman" w:cs="Times New Roman" w:eastAsia="Times New Roman" w:hAnsi="Times New Roman"/>
+          <w:sz w:val="24"/>
+          <w:szCs w:val="24"/>
+        </w:rPr>
+        <w:t xml:space="preserve">El firmware debe estructurarse en capas de controladores, lógica de control y aplicación, con módulos compilables de forma independiente.</w:t>
       </w:r>
     </w:p>
     <w:p>
@@ -2216,15 +1794,15 @@
           <w:sz w:val="24"/>
           <w:szCs w:val="24"/>
         </w:rPr>
-        <w:t xml:space="preserve">3.2 </w:t>
-      </w:r>
-      <w:r>
-        <w:rPr>
-          <w:rFonts w:ascii="Times New Roman" w:cs="Times New Roman" w:eastAsia="Times New Roman" w:hAnsi="Times New Roman"/>
-          <w:sz w:val="24"/>
-          <w:szCs w:val="24"/>
-        </w:rPr>
-        <w:t xml:space="preserve">El esfuerzo total no debe superar las 64 horas por integrante, conforme al reglamento de la cátedra.</w:t>
+        <w:t xml:space="preserve">2.3 </w:t>
+      </w:r>
+      <w:r>
+        <w:rPr>
+          <w:rFonts w:ascii="Times New Roman" w:cs="Times New Roman" w:eastAsia="Times New Roman" w:hAnsi="Times New Roman"/>
+          <w:sz w:val="24"/>
+          <w:szCs w:val="24"/>
+        </w:rPr>
+        <w:t xml:space="preserve">Debe generar cinco señales de ancho de pulso modulado de 50 Hz, con ancho ajustable en el rango que admiten los servomotores. Resolución mínima: a determinar a partir de la precisión de posicionamiento que se especifique.</w:t>
       </w:r>
     </w:p>
     <w:p>
@@ -2239,15 +1817,15 @@
           <w:sz w:val="24"/>
           <w:szCs w:val="24"/>
         </w:rPr>
-        <w:t xml:space="preserve">3.3 </w:t>
-      </w:r>
-      <w:r>
-        <w:rPr>
-          <w:rFonts w:ascii="Times New Roman" w:cs="Times New Roman" w:eastAsia="Times New Roman" w:hAnsi="Times New Roman"/>
-          <w:sz w:val="24"/>
-          <w:szCs w:val="24"/>
-        </w:rPr>
-        <w:t xml:space="preserve">El sistema no debe operar con tensiones superiores a 24 V ni presentar puntos de atrapamiento accesibles en sus partes móviles.</w:t>
+        <w:t xml:space="preserve">2.4 </w:t>
+      </w:r>
+      <w:r>
+        <w:rPr>
+          <w:rFonts w:ascii="Times New Roman" w:cs="Times New Roman" w:eastAsia="Times New Roman" w:hAnsi="Times New Roman"/>
+          <w:sz w:val="24"/>
+          <w:szCs w:val="24"/>
+        </w:rPr>
+        <w:t xml:space="preserve">Debe limitar la velocidad y la aceleración de cada articulación mediante rampas, de modo que el traslado no derrame el contenido del recipiente. Valores límite: a determinar por ensayo.</w:t>
       </w:r>
     </w:p>
     <w:p>
@@ -2262,15 +1840,15 @@
           <w:sz w:val="24"/>
           <w:szCs w:val="24"/>
         </w:rPr>
-        <w:t xml:space="preserve">3.4 </w:t>
-      </w:r>
-      <w:r>
-        <w:rPr>
-          <w:rFonts w:ascii="Times New Roman" w:cs="Times New Roman" w:eastAsia="Times New Roman" w:hAnsi="Times New Roman"/>
-          <w:sz w:val="24"/>
-          <w:szCs w:val="24"/>
-        </w:rPr>
-        <w:t xml:space="preserve">El prototipo debe ser transportable: masa total inferior a 5 kg y montaje sobre base rígida.</w:t>
+        <w:t xml:space="preserve">2.5 </w:t>
+      </w:r>
+      <w:r>
+        <w:rPr>
+          <w:rFonts w:ascii="Times New Roman" w:cs="Times New Roman" w:eastAsia="Times New Roman" w:hAnsi="Times New Roman"/>
+          <w:sz w:val="24"/>
+          <w:szCs w:val="24"/>
+        </w:rPr>
+        <w:t xml:space="preserve">Debe coordinar el movimiento de la muñeca con el del resto de las articulaciones, de modo de mantener el recipiente en posición vertical durante todo el recorrido.</w:t>
       </w:r>
     </w:p>
     <w:p>
@@ -2285,15 +1863,15 @@
           <w:sz w:val="24"/>
           <w:szCs w:val="24"/>
         </w:rPr>
-        <w:t xml:space="preserve">3.5 </w:t>
-      </w:r>
-      <w:r>
-        <w:rPr>
-          <w:rFonts w:ascii="Times New Roman" w:cs="Times New Roman" w:eastAsia="Times New Roman" w:hAnsi="Times New Roman"/>
-          <w:sz w:val="24"/>
-          <w:szCs w:val="24"/>
-        </w:rPr>
-        <w:t xml:space="preserve">Los componentes deben ser de adquisición en plaza local y de reposición sencilla.</w:t>
+        <w:t xml:space="preserve">2.6 </w:t>
+      </w:r>
+      <w:r>
+        <w:rPr>
+          <w:rFonts w:ascii="Times New Roman" w:cs="Times New Roman" w:eastAsia="Times New Roman" w:hAnsi="Times New Roman"/>
+          <w:sz w:val="24"/>
+          <w:szCs w:val="24"/>
+        </w:rPr>
+        <w:t xml:space="preserve">Debe implementar una máquina de estados que contemple, como mínimo, los estados de Inicialización, Reposo y Operación manual.</w:t>
       </w:r>
     </w:p>
     <w:p>
@@ -2308,15 +1886,15 @@
           <w:sz w:val="24"/>
           <w:szCs w:val="24"/>
         </w:rPr>
-        <w:t xml:space="preserve">3.6 </w:t>
-      </w:r>
-      <w:r>
-        <w:rPr>
-          <w:rFonts w:ascii="Times New Roman" w:cs="Times New Roman" w:eastAsia="Times New Roman" w:hAnsi="Times New Roman"/>
-          <w:sz w:val="24"/>
-          <w:szCs w:val="24"/>
-        </w:rPr>
-        <w:t xml:space="preserve">El código y la documentación deben versionarse en un repositorio Git, con instrucciones de compilación.</w:t>
+        <w:t xml:space="preserve">2.7 </w:t>
+      </w:r>
+      <w:r>
+        <w:rPr>
+          <w:rFonts w:ascii="Times New Roman" w:cs="Times New Roman" w:eastAsia="Times New Roman" w:hAnsi="Times New Roman"/>
+          <w:sz w:val="24"/>
+          <w:szCs w:val="24"/>
+        </w:rPr>
+        <w:t xml:space="preserve">Debe emplear el temporizador SysTick como base de tiempo, sin utilizar retardos bloqueantes, de modo de atender la interfaz de operador y el movimiento de los ejes de forma concurrente.</w:t>
       </w:r>
     </w:p>
     <w:p>
@@ -2331,15 +1909,15 @@
           <w:sz w:val="24"/>
           <w:szCs w:val="24"/>
         </w:rPr>
-        <w:t xml:space="preserve">3.7 </w:t>
-      </w:r>
-      <w:r>
-        <w:rPr>
-          <w:rFonts w:ascii="Times New Roman" w:cs="Times New Roman" w:eastAsia="Times New Roman" w:hAnsi="Times New Roman"/>
-          <w:sz w:val="24"/>
-          <w:szCs w:val="24"/>
-        </w:rPr>
-        <w:t xml:space="preserve">Toda la documentación —esquemáticos, diagramas, código fuente y protocolos de ensayo— debe entregarse junto al informe final.</w:t>
+        <w:t xml:space="preserve">2.8 </w:t>
+      </w:r>
+      <w:r>
+        <w:rPr>
+          <w:rFonts w:ascii="Times New Roman" w:cs="Times New Roman" w:eastAsia="Times New Roman" w:hAnsi="Times New Roman"/>
+          <w:sz w:val="24"/>
+          <w:szCs w:val="24"/>
+        </w:rPr>
+        <w:t xml:space="preserve">Debe iniciar el sistema en una posición segura conocida, evitando movimientos bruscos al energizar.</w:t>
       </w:r>
     </w:p>
     <w:p>
@@ -2354,15 +1932,48 @@
           <w:sz w:val="24"/>
           <w:szCs w:val="24"/>
         </w:rPr>
-        <w:t xml:space="preserve">3.8 </w:t>
-      </w:r>
-      <w:r>
-        <w:rPr>
-          <w:rFonts w:ascii="Times New Roman" w:cs="Times New Roman" w:eastAsia="Times New Roman" w:hAnsi="Times New Roman"/>
-          <w:sz w:val="24"/>
-          <w:szCs w:val="24"/>
-        </w:rPr>
-        <w:t xml:space="preserve">Debe elaborarse un instructivo de uso del brazo dirigido al operador.</w:t>
+        <w:t xml:space="preserve">2.9 </w:t>
+      </w:r>
+      <w:r>
+        <w:rPr>
+          <w:rFonts w:ascii="Times New Roman" w:cs="Times New Roman" w:eastAsia="Times New Roman" w:hAnsi="Times New Roman"/>
+          <w:sz w:val="24"/>
+          <w:szCs w:val="24"/>
+        </w:rPr>
+        <w:t xml:space="preserve">Debe permitir grabar y reproducir una secuencia de posiciones.</w:t>
+      </w:r>
+      <w:r>
+        <w:rPr>
+          <w:rFonts w:ascii="Times New Roman" w:cs="Times New Roman" w:eastAsia="Times New Roman" w:hAnsi="Times New Roman"/>
+          <w:i/>
+          <w:iCs/>
+          <w:sz w:val="24"/>
+          <w:szCs w:val="24"/>
+        </w:rPr>
+        <w:t xml:space="preserve"> (prioridad menor)</w:t>
+      </w:r>
+    </w:p>
+    <w:p>
+      <w:pPr>
+        <w:spacing w:after="110" w:line="360"/>
+        <w:ind w:left="284" w:hanging="284"/>
+        <w:jc w:val="both"/>
+      </w:pPr>
+      <w:r>
+        <w:rPr>
+          <w:rFonts w:ascii="Times New Roman" w:cs="Times New Roman" w:eastAsia="Times New Roman" w:hAnsi="Times New Roman"/>
+          <w:sz w:val="24"/>
+          <w:szCs w:val="24"/>
+        </w:rPr>
+        <w:t xml:space="preserve">2.10 </w:t>
+      </w:r>
+      <w:r>
+        <w:rPr>
+          <w:rFonts w:ascii="Times New Roman" w:cs="Times New Roman" w:eastAsia="Times New Roman" w:hAnsi="Times New Roman"/>
+          <w:sz w:val="24"/>
+          <w:szCs w:val="24"/>
+        </w:rPr>
+        <w:t xml:space="preserve">Debe transmitir el estado del sistema por puerto serie con fines de depuración y registro.</w:t>
       </w:r>
       <w:r>
         <w:rPr>
@@ -2389,7 +2000,7 @@
           <w:sz w:val="26"/>
           <w:szCs w:val="26"/>
         </w:rPr>
-        <w:t xml:space="preserve">3.3 DE ENSAYO, VALIDACIÓN Y DOCUMENTACIÓN</w:t>
+        <w:t xml:space="preserve">3. Requerimientos no funcionales</w:t>
       </w:r>
     </w:p>
     <w:p>
@@ -2404,15 +2015,15 @@
           <w:sz w:val="24"/>
           <w:szCs w:val="24"/>
         </w:rPr>
-        <w:t xml:space="preserve">4.0 </w:t>
-      </w:r>
-      <w:r>
-        <w:rPr>
-          <w:rFonts w:ascii="Times New Roman" w:cs="Times New Roman" w:eastAsia="Times New Roman" w:hAnsi="Times New Roman"/>
-          <w:sz w:val="24"/>
-          <w:szCs w:val="24"/>
-        </w:rPr>
-        <w:t xml:space="preserve">Ensayo de repetibilidad: veinte ciclos de toma y colocación, con error de posición menor o igual a 5 mm.</w:t>
+        <w:t xml:space="preserve">3.1 </w:t>
+      </w:r>
+      <w:r>
+        <w:rPr>
+          <w:rFonts w:ascii="Times New Roman" w:cs="Times New Roman" w:eastAsia="Times New Roman" w:hAnsi="Times New Roman"/>
+          <w:sz w:val="24"/>
+          <w:szCs w:val="24"/>
+        </w:rPr>
+        <w:t xml:space="preserve">El proyecto y su documentación deben completarse dentro del cronograma de la cátedra del segundo cuatrimestre de 2026.</w:t>
       </w:r>
     </w:p>
     <w:p>
@@ -2427,15 +2038,15 @@
           <w:sz w:val="24"/>
           <w:szCs w:val="24"/>
         </w:rPr>
-        <w:t xml:space="preserve">4.1 </w:t>
-      </w:r>
-      <w:r>
-        <w:rPr>
-          <w:rFonts w:ascii="Times New Roman" w:cs="Times New Roman" w:eastAsia="Times New Roman" w:hAnsi="Times New Roman"/>
-          <w:sz w:val="24"/>
-          <w:szCs w:val="24"/>
-        </w:rPr>
-        <w:t xml:space="preserve">Ensayo de carga máxima: incrementos de 50 g hasta la falla, documentando la carga máxima estable.</w:t>
+        <w:t xml:space="preserve">3.2 </w:t>
+      </w:r>
+      <w:r>
+        <w:rPr>
+          <w:rFonts w:ascii="Times New Roman" w:cs="Times New Roman" w:eastAsia="Times New Roman" w:hAnsi="Times New Roman"/>
+          <w:sz w:val="24"/>
+          <w:szCs w:val="24"/>
+        </w:rPr>
+        <w:t xml:space="preserve">El esfuerzo total no debe superar las 64 horas por integrante, conforme al reglamento de la cátedra.</w:t>
       </w:r>
     </w:p>
     <w:p>
@@ -2450,15 +2061,15 @@
           <w:sz w:val="24"/>
           <w:szCs w:val="24"/>
         </w:rPr>
-        <w:t xml:space="preserve">4.2 </w:t>
-      </w:r>
-      <w:r>
-        <w:rPr>
-          <w:rFonts w:ascii="Times New Roman" w:cs="Times New Roman" w:eastAsia="Times New Roman" w:hAnsi="Times New Roman"/>
-          <w:sz w:val="24"/>
-          <w:szCs w:val="24"/>
-        </w:rPr>
-        <w:t xml:space="preserve">Calibración del sensor de gas con un mínimo de tres puntos y curva característica documentada.</w:t>
+        <w:t xml:space="preserve">3.3 </w:t>
+      </w:r>
+      <w:r>
+        <w:rPr>
+          <w:rFonts w:ascii="Times New Roman" w:cs="Times New Roman" w:eastAsia="Times New Roman" w:hAnsi="Times New Roman"/>
+          <w:sz w:val="24"/>
+          <w:szCs w:val="24"/>
+        </w:rPr>
+        <w:t xml:space="preserve">El sistema no debe presentar puntos de atrapamiento accesibles en sus partes móviles ni operar con tensiones que impliquen riesgo eléctrico para el usuario.</w:t>
       </w:r>
     </w:p>
     <w:p>
@@ -2473,15 +2084,15 @@
           <w:sz w:val="24"/>
           <w:szCs w:val="24"/>
         </w:rPr>
-        <w:t xml:space="preserve">4.3 </w:t>
-      </w:r>
-      <w:r>
-        <w:rPr>
-          <w:rFonts w:ascii="Times New Roman" w:cs="Times New Roman" w:eastAsia="Times New Roman" w:hAnsi="Times New Roman"/>
-          <w:sz w:val="24"/>
-          <w:szCs w:val="24"/>
-        </w:rPr>
-        <w:t xml:space="preserve">Ensayo del corte de emergencia: diez activaciones, con corte efectivo en menos de 100 ms en todos los casos.</w:t>
+        <w:t xml:space="preserve">3.4 </w:t>
+      </w:r>
+      <w:r>
+        <w:rPr>
+          <w:rFonts w:ascii="Times New Roman" w:cs="Times New Roman" w:eastAsia="Times New Roman" w:hAnsi="Times New Roman"/>
+          <w:sz w:val="24"/>
+          <w:szCs w:val="24"/>
+        </w:rPr>
+        <w:t xml:space="preserve">El prototipo debe ser transportable y estar montado sobre una base rígida que impida su vuelco durante la operación.</w:t>
       </w:r>
     </w:p>
     <w:p>
@@ -2496,15 +2107,15 @@
           <w:sz w:val="24"/>
           <w:szCs w:val="24"/>
         </w:rPr>
-        <w:t xml:space="preserve">4.4 </w:t>
-      </w:r>
-      <w:r>
-        <w:rPr>
-          <w:rFonts w:ascii="Times New Roman" w:cs="Times New Roman" w:eastAsia="Times New Roman" w:hAnsi="Times New Roman"/>
-          <w:sz w:val="24"/>
-          <w:szCs w:val="24"/>
-        </w:rPr>
-        <w:t xml:space="preserve">Medición del consumo en reposo y en movimiento pleno, indicando instrumento y método.</w:t>
+        <w:t xml:space="preserve">3.5 </w:t>
+      </w:r>
+      <w:r>
+        <w:rPr>
+          <w:rFonts w:ascii="Times New Roman" w:cs="Times New Roman" w:eastAsia="Times New Roman" w:hAnsi="Times New Roman"/>
+          <w:sz w:val="24"/>
+          <w:szCs w:val="24"/>
+        </w:rPr>
+        <w:t xml:space="preserve">Los componentes deben ser de adquisición en plaza local y de reposición sencilla.</w:t>
       </w:r>
     </w:p>
     <w:p>
@@ -2519,6 +2130,194 @@
           <w:sz w:val="24"/>
           <w:szCs w:val="24"/>
         </w:rPr>
+        <w:t xml:space="preserve">3.6 </w:t>
+      </w:r>
+      <w:r>
+        <w:rPr>
+          <w:rFonts w:ascii="Times New Roman" w:cs="Times New Roman" w:eastAsia="Times New Roman" w:hAnsi="Times New Roman"/>
+          <w:sz w:val="24"/>
+          <w:szCs w:val="24"/>
+        </w:rPr>
+        <w:t xml:space="preserve">El código y la documentación deben versionarse en un repositorio Git, con instrucciones de compilación.</w:t>
+      </w:r>
+    </w:p>
+    <w:p>
+      <w:pPr>
+        <w:spacing w:after="110" w:line="360"/>
+        <w:ind w:left="284" w:hanging="284"/>
+        <w:jc w:val="both"/>
+      </w:pPr>
+      <w:r>
+        <w:rPr>
+          <w:rFonts w:ascii="Times New Roman" w:cs="Times New Roman" w:eastAsia="Times New Roman" w:hAnsi="Times New Roman"/>
+          <w:sz w:val="24"/>
+          <w:szCs w:val="24"/>
+        </w:rPr>
+        <w:t xml:space="preserve">3.7 </w:t>
+      </w:r>
+      <w:r>
+        <w:rPr>
+          <w:rFonts w:ascii="Times New Roman" w:cs="Times New Roman" w:eastAsia="Times New Roman" w:hAnsi="Times New Roman"/>
+          <w:sz w:val="24"/>
+          <w:szCs w:val="24"/>
+        </w:rPr>
+        <w:t xml:space="preserve">Toda la documentación —esquemáticos, diagramas, código fuente y protocolos de ensayo— debe entregarse junto al informe final.</w:t>
+      </w:r>
+    </w:p>
+    <w:p>
+      <w:pPr>
+        <w:spacing w:after="110" w:line="360"/>
+        <w:ind w:left="284" w:hanging="284"/>
+        <w:jc w:val="both"/>
+      </w:pPr>
+      <w:r>
+        <w:rPr>
+          <w:rFonts w:ascii="Times New Roman" w:cs="Times New Roman" w:eastAsia="Times New Roman" w:hAnsi="Times New Roman"/>
+          <w:sz w:val="24"/>
+          <w:szCs w:val="24"/>
+        </w:rPr>
+        <w:t xml:space="preserve">3.8 </w:t>
+      </w:r>
+      <w:r>
+        <w:rPr>
+          <w:rFonts w:ascii="Times New Roman" w:cs="Times New Roman" w:eastAsia="Times New Roman" w:hAnsi="Times New Roman"/>
+          <w:sz w:val="24"/>
+          <w:szCs w:val="24"/>
+        </w:rPr>
+        <w:t xml:space="preserve">Debe elaborarse un instructivo de uso del brazo dirigido al operador.</w:t>
+      </w:r>
+      <w:r>
+        <w:rPr>
+          <w:rFonts w:ascii="Times New Roman" w:cs="Times New Roman" w:eastAsia="Times New Roman" w:hAnsi="Times New Roman"/>
+          <w:i/>
+          <w:iCs/>
+          <w:sz w:val="24"/>
+          <w:szCs w:val="24"/>
+        </w:rPr>
+        <w:t xml:space="preserve"> (prioridad menor)</w:t>
+      </w:r>
+    </w:p>
+    <w:p>
+      <w:pPr>
+        <w:pStyle w:val="Heading2"/>
+        <w:spacing w:after="140" w:before="280"/>
+      </w:pPr>
+      <w:r>
+        <w:rPr>
+          <w:rFonts w:ascii="Times New Roman" w:cs="Times New Roman" w:eastAsia="Times New Roman" w:hAnsi="Times New Roman"/>
+          <w:b/>
+          <w:bCs/>
+          <w:color w:val="000000"/>
+          <w:sz w:val="26"/>
+          <w:szCs w:val="26"/>
+        </w:rPr>
+        <w:t xml:space="preserve">4. Requerimientos de ensayo, validación y documentación</w:t>
+      </w:r>
+    </w:p>
+    <w:p>
+      <w:pPr>
+        <w:spacing w:after="110" w:line="360"/>
+        <w:ind w:left="284" w:hanging="284"/>
+        <w:jc w:val="both"/>
+      </w:pPr>
+      <w:r>
+        <w:rPr>
+          <w:rFonts w:ascii="Times New Roman" w:cs="Times New Roman" w:eastAsia="Times New Roman" w:hAnsi="Times New Roman"/>
+          <w:sz w:val="24"/>
+          <w:szCs w:val="24"/>
+        </w:rPr>
+        <w:t xml:space="preserve">4.1 </w:t>
+      </w:r>
+      <w:r>
+        <w:rPr>
+          <w:rFonts w:ascii="Times New Roman" w:cs="Times New Roman" w:eastAsia="Times New Roman" w:hAnsi="Times New Roman"/>
+          <w:sz w:val="24"/>
+          <w:szCs w:val="24"/>
+        </w:rPr>
+        <w:t xml:space="preserve">Ensayo de traslado: el brazo debe tomar un vaso con líquido, trasladarlo y depositarlo de forma repetida sin derrame apreciable. Cantidad de ciclos y criterio de derrame: a definir en el protocolo de ensayo.</w:t>
+      </w:r>
+    </w:p>
+    <w:p>
+      <w:pPr>
+        <w:spacing w:after="110" w:line="360"/>
+        <w:ind w:left="284" w:hanging="284"/>
+        <w:jc w:val="both"/>
+      </w:pPr>
+      <w:r>
+        <w:rPr>
+          <w:rFonts w:ascii="Times New Roman" w:cs="Times New Roman" w:eastAsia="Times New Roman" w:hAnsi="Times New Roman"/>
+          <w:sz w:val="24"/>
+          <w:szCs w:val="24"/>
+        </w:rPr>
+        <w:t xml:space="preserve">4.2 </w:t>
+      </w:r>
+      <w:r>
+        <w:rPr>
+          <w:rFonts w:ascii="Times New Roman" w:cs="Times New Roman" w:eastAsia="Times New Roman" w:hAnsi="Times New Roman"/>
+          <w:sz w:val="24"/>
+          <w:szCs w:val="24"/>
+        </w:rPr>
+        <w:t xml:space="preserve">Ensayo de repetibilidad de posicionamiento, con el error medido sobre el extremo del brazo. Criterio de aceptación: a determinar en la fase de diseño.</w:t>
+      </w:r>
+    </w:p>
+    <w:p>
+      <w:pPr>
+        <w:spacing w:after="110" w:line="360"/>
+        <w:ind w:left="284" w:hanging="284"/>
+        <w:jc w:val="both"/>
+      </w:pPr>
+      <w:r>
+        <w:rPr>
+          <w:rFonts w:ascii="Times New Roman" w:cs="Times New Roman" w:eastAsia="Times New Roman" w:hAnsi="Times New Roman"/>
+          <w:sz w:val="24"/>
+          <w:szCs w:val="24"/>
+        </w:rPr>
+        <w:t xml:space="preserve">4.3 </w:t>
+      </w:r>
+      <w:r>
+        <w:rPr>
+          <w:rFonts w:ascii="Times New Roman" w:cs="Times New Roman" w:eastAsia="Times New Roman" w:hAnsi="Times New Roman"/>
+          <w:sz w:val="24"/>
+          <w:szCs w:val="24"/>
+        </w:rPr>
+        <w:t xml:space="preserve">Ensayo de carga máxima, incrementando la masa del recipiente hasta la falla y documentando el valor alcanzado.</w:t>
+      </w:r>
+    </w:p>
+    <w:p>
+      <w:pPr>
+        <w:spacing w:after="110" w:line="360"/>
+        <w:ind w:left="284" w:hanging="284"/>
+        <w:jc w:val="both"/>
+      </w:pPr>
+      <w:r>
+        <w:rPr>
+          <w:rFonts w:ascii="Times New Roman" w:cs="Times New Roman" w:eastAsia="Times New Roman" w:hAnsi="Times New Roman"/>
+          <w:sz w:val="24"/>
+          <w:szCs w:val="24"/>
+        </w:rPr>
+        <w:t xml:space="preserve">4.4 </w:t>
+      </w:r>
+      <w:r>
+        <w:rPr>
+          <w:rFonts w:ascii="Times New Roman" w:cs="Times New Roman" w:eastAsia="Times New Roman" w:hAnsi="Times New Roman"/>
+          <w:sz w:val="24"/>
+          <w:szCs w:val="24"/>
+        </w:rPr>
+        <w:t xml:space="preserve">Medición del consumo del sistema en reposo y en movimiento pleno, indicando instrumento y método.</w:t>
+      </w:r>
+    </w:p>
+    <w:p>
+      <w:pPr>
+        <w:spacing w:after="110" w:line="360"/>
+        <w:ind w:left="284" w:hanging="284"/>
+        <w:jc w:val="both"/>
+      </w:pPr>
+      <w:r>
+        <w:rPr>
+          <w:rFonts w:ascii="Times New Roman" w:cs="Times New Roman" w:eastAsia="Times New Roman" w:hAnsi="Times New Roman"/>
+          <w:sz w:val="24"/>
+          <w:szCs w:val="24"/>
+        </w:rPr>
         <w:t xml:space="preserve">4.5 </w:t>
       </w:r>
       <w:r>
@@ -2527,7 +2326,7 @@
           <w:sz w:val="24"/>
           <w:szCs w:val="24"/>
         </w:rPr>
-        <w:t xml:space="preserve">Ejercitación de todas las transiciones de la máquina de estados, registradas por el puerto serie.</w:t>
+        <w:t xml:space="preserve">Ejercitación de todas las transiciones de la máquina de estados, con registro de los resultados.</w:t>
       </w:r>
     </w:p>
     <w:p>
@@ -2898,7 +2697,7 @@
                 <w:sz w:val="21"/>
                 <w:szCs w:val="21"/>
               </w:rPr>
-              <w:t xml:space="preserve">20</w:t>
+              <w:t xml:space="preserve">16</w:t>
             </w:r>
           </w:p>
         </w:tc>
@@ -2959,7 +2758,7 @@
                 <w:sz w:val="21"/>
                 <w:szCs w:val="21"/>
               </w:rPr>
-              <w:t xml:space="preserve">Selección de componentes y compra</w:t>
+              <w:t xml:space="preserve">Selección de componentes</w:t>
             </w:r>
           </w:p>
         </w:tc>
@@ -3015,7 +2814,7 @@
                 <w:sz w:val="21"/>
                 <w:szCs w:val="21"/>
               </w:rPr>
-              <w:t xml:space="preserve">12</w:t>
+              <w:t xml:space="preserve">8</w:t>
             </w:r>
           </w:p>
         </w:tc>
@@ -3132,7 +2931,7 @@
                 <w:sz w:val="21"/>
                 <w:szCs w:val="21"/>
               </w:rPr>
-              <w:t xml:space="preserve">15</w:t>
+              <w:t xml:space="preserve">12</w:t>
             </w:r>
           </w:p>
         </w:tc>
@@ -3249,7 +3048,7 @@
                 <w:sz w:val="21"/>
                 <w:szCs w:val="21"/>
               </w:rPr>
-              <w:t xml:space="preserve">25</w:t>
+              <w:t xml:space="preserve">22</w:t>
             </w:r>
           </w:p>
         </w:tc>
@@ -3366,7 +3165,7 @@
                 <w:sz w:val="21"/>
                 <w:szCs w:val="21"/>
               </w:rPr>
-              <w:t xml:space="preserve">25</w:t>
+              <w:t xml:space="preserve">20</w:t>
             </w:r>
           </w:p>
         </w:tc>
@@ -3483,7 +3282,7 @@
                 <w:sz w:val="21"/>
                 <w:szCs w:val="21"/>
               </w:rPr>
-              <w:t xml:space="preserve">10</w:t>
+              <w:t xml:space="preserve">8</w:t>
             </w:r>
           </w:p>
         </w:tc>
@@ -3544,7 +3343,7 @@
                 <w:sz w:val="21"/>
                 <w:szCs w:val="21"/>
               </w:rPr>
-              <w:t xml:space="preserve">Controladores de firmware (GPIO, PWM, ADC, UART)</w:t>
+              <w:t xml:space="preserve">Controladores de firmware (GPIO, PWM, ADC)</w:t>
             </w:r>
           </w:p>
         </w:tc>
@@ -3600,7 +3399,7 @@
                 <w:sz w:val="21"/>
                 <w:szCs w:val="21"/>
               </w:rPr>
-              <w:t xml:space="preserve">40</w:t>
+              <w:t xml:space="preserve">30</w:t>
             </w:r>
           </w:p>
         </w:tc>
@@ -3717,7 +3516,7 @@
                 <w:sz w:val="21"/>
                 <w:szCs w:val="21"/>
               </w:rPr>
-              <w:t xml:space="preserve">30</w:t>
+              <w:t xml:space="preserve">26</w:t>
             </w:r>
           </w:p>
         </w:tc>
@@ -3834,7 +3633,7 @@
                 <w:sz w:val="21"/>
                 <w:szCs w:val="21"/>
               </w:rPr>
-              <w:t xml:space="preserve">10</w:t>
+              <w:t xml:space="preserve">8</w:t>
             </w:r>
           </w:p>
         </w:tc>
@@ -3951,7 +3750,7 @@
                 <w:sz w:val="21"/>
                 <w:szCs w:val="21"/>
               </w:rPr>
-              <w:t xml:space="preserve">30</w:t>
+              <w:t xml:space="preserve">26</w:t>
             </w:r>
           </w:p>
         </w:tc>
@@ -4012,7 +3811,7 @@
                 <w:sz w:val="21"/>
                 <w:szCs w:val="21"/>
               </w:rPr>
-              <w:t xml:space="preserve">Máquina de estados y lógica de control</w:t>
+              <w:t xml:space="preserve">Máquina de estados y control coordinado de ejes</w:t>
             </w:r>
           </w:p>
         </w:tc>
@@ -4068,7 +3867,7 @@
                 <w:sz w:val="21"/>
                 <w:szCs w:val="21"/>
               </w:rPr>
-              <w:t xml:space="preserve">30</w:t>
+              <w:t xml:space="preserve">26</w:t>
             </w:r>
           </w:p>
         </w:tc>
@@ -4185,7 +3984,7 @@
                 <w:sz w:val="21"/>
                 <w:szCs w:val="21"/>
               </w:rPr>
-              <w:t xml:space="preserve">25</w:t>
+              <w:t xml:space="preserve">20</w:t>
             </w:r>
           </w:p>
         </w:tc>
@@ -4302,7 +4101,7 @@
                 <w:sz w:val="21"/>
                 <w:szCs w:val="21"/>
               </w:rPr>
-              <w:t xml:space="preserve">20</w:t>
+              <w:t xml:space="preserve">16</w:t>
             </w:r>
           </w:p>
         </w:tc>
@@ -4419,7 +4218,7 @@
                 <w:sz w:val="21"/>
                 <w:szCs w:val="21"/>
               </w:rPr>
-              <w:t xml:space="preserve">20</w:t>
+              <w:t xml:space="preserve">14</w:t>
             </w:r>
           </w:p>
         </w:tc>
@@ -4536,7 +4335,7 @@
                 <w:sz w:val="21"/>
                 <w:szCs w:val="21"/>
               </w:rPr>
-              <w:t xml:space="preserve">312</w:t>
+              <w:t xml:space="preserve">252</w:t>
             </w:r>
           </w:p>
         </w:tc>
@@ -4606,7 +4405,22 @@
           <w:sz w:val="24"/>
           <w:szCs w:val="24"/>
         </w:rPr>
-        <w:t xml:space="preserve">El reglamento de la cátedra admite hasta cuatro horas semanales adicionales por integrante durante dieciséis semanas, es decir, 64 horas por persona, lo que para un grupo de cuatro integrantes fija un techo de 256 horas. La estimación de 312 horas lo excede en aproximadamente un 20 %, por lo que se prevé reasignar a objetivos secundarios los requerimientos de prioridad menor y adoptar una de las alternativas de menor carga mecánica descriptas en el Anexo A. Los vencimientos de la cátedra son: informe inicial el 10/09/2026, informe de avance 1 el 05/10/2026, informe de avance 2 el 05/11/2026, entrega de informes el 11/02/2027 y presentación de proyectos el 18 y el 22/02/2027.</w:t>
+        <w:t xml:space="preserve">El reglamento de la cátedra admite hasta cuatro horas semanales adicionales por integrante durante dieciséis semanas, es decir, 64 horas por persona, lo que para un grupo de cuatro integrantes fija un techo de 256 horas. La estimación de 252 horas queda por debajo de ese techo, pero con un margen escaso: cualquier demora en la fabricación o en la puesta a punto lo consume. Por esa razón los requerimientos de prioridad menor están identificados como tales desde este informe: son los primeros candidatos a recortar si el cronograma se atrasa. El reparto resultante es de aproximadamente 63 horas por integrante.</w:t>
+      </w:r>
+    </w:p>
+    <w:p>
+      <w:pPr>
+        <w:spacing w:after="120" w:line="360"/>
+        <w:ind w:firstLine="709"/>
+        <w:jc w:val="both"/>
+      </w:pPr>
+      <w:r>
+        <w:rPr>
+          <w:rFonts w:ascii="Times New Roman" w:cs="Times New Roman" w:eastAsia="Times New Roman" w:hAnsi="Times New Roman"/>
+          <w:sz w:val="24"/>
+          <w:szCs w:val="24"/>
+        </w:rPr>
+        <w:t xml:space="preserve">Los vencimientos fijados por la cátedra son: informe inicial el 10/09/2026, informe de avance 1 el 05/10/2026, informe de avance 2 el 05/11/2026, entrega de informes el 11/02/2027 y presentación de proyectos el 18 y el 22/02/2027.</w:t>
       </w:r>
     </w:p>
     <w:p>
@@ -4668,7 +4482,7 @@
           <w:sz w:val="24"/>
           <w:szCs w:val="24"/>
         </w:rPr>
-        <w:t xml:space="preserve"> se encargará del diseño mecánico del brazo: definición de la topología, cálculo del par en cada articulación, selección de los servomotores y modelado de las piezas para su fabricación. Será responsable del prototipo del eje crítico previsto para la semana 4 y del ensamblaje final del conjunto. En los objetivos secundarios, podría colaborar en la incorporación de la realimentación de posición.</w:t>
+        <w:t xml:space="preserve"> se encargará del diseño mecánico del brazo: definición de la geometría, cálculo del par requerido en cada articulación, selección de los servomotores y modelado de las piezas para su fabricación. Será responsable del ensamblaje final del conjunto y de verificar que la estructura soporte la carga sin flexiones apreciables.</w:t>
       </w:r>
     </w:p>
     <w:p>
@@ -4693,7 +4507,7 @@
           <w:sz w:val="24"/>
           <w:szCs w:val="24"/>
         </w:rPr>
-        <w:t xml:space="preserve"> será responsable del diseño de hardware electrónico: el esquemático en Proteus, la etapa de potencia y protección, el dimensionamiento de la fuente y el desacople, y el diseño del circuito impreso hasta su fabricación en el taller ATEI. También se encargará de implementar la cadena de seguridad y la parada de emergencia por hardware.</w:t>
+        <w:t xml:space="preserve"> será responsable del diseño de hardware electrónico: el esquemático, el dimensionamiento de la fuente y el desacople, la etapa de potencia y el diseño del circuito impreso hasta su fabricación en el taller ATEI.</w:t>
       </w:r>
     </w:p>
     <w:p>
@@ -4718,7 +4532,7 @@
           <w:sz w:val="24"/>
           <w:szCs w:val="24"/>
         </w:rPr>
-        <w:t xml:space="preserve"> desarrollará los controladores de firmware: la generación de las cinco señales de ancho de pulso modulado mediante el temporizador configurable por estados, la lectura del conversor analógico-digital, el manejo del teclado y el display, y la comunicación por USART2. Su tarea incluirá verificar que la fluctuación temporal de las señales de comando se mantenga dentro de lo especificado en el requerimiento 2.2.</w:t>
+        <w:t xml:space="preserve"> desarrollará los controladores de firmware: la generación de las cinco señales de ancho de pulso modulado, la lectura del joystick por el conversor analógico-digital y el manejo de los pulsadores y de la señalización de estado.</w:t>
       </w:r>
     </w:p>
     <w:p>
@@ -4743,7 +4557,7 @@
           <w:sz w:val="24"/>
           <w:szCs w:val="24"/>
         </w:rPr>
-        <w:t xml:space="preserve"> implementará la lógica de control de alto nivel: la máquina de estados, la interpolación coordinada de los cinco ejes, las rampas de velocidad y la gestión de las condiciones de alarma. En caso de avanzar con los objetivos secundarios, se encargaría de la cinemática inversa y de la interfaz de telemetría en computadora.</w:t>
+        <w:t xml:space="preserve"> implementará la lógica de control de alto nivel: la máquina de estados, la interpolación coordinada de los cinco ejes, las rampas de velocidad y la coordinación de la muñeca que mantiene el recipiente en posición vertical.</w:t>
       </w:r>
     </w:p>
     <w:p>
@@ -4803,7 +4617,7 @@
           <w:sz w:val="24"/>
           <w:szCs w:val="24"/>
         </w:rPr>
-        <w:t xml:space="preserve">IEEE. IEEE Citation Reference. 1.a ed. IEEE Publications, 2016. Disponible en: http://www.ieee.org/documents/ieeecitationref.pdf (visitado 31-8-2026).</w:t>
+        <w:t xml:space="preserve">Proyecto CIAA [portal web]. Disponible en: http://www.proyecto-ciaa.com.ar/index.html (visitado 7-9-2026).</w:t>
       </w:r>
     </w:p>
     <w:p>
@@ -4826,7 +4640,7 @@
           <w:sz w:val="24"/>
           <w:szCs w:val="24"/>
         </w:rPr>
-        <w:t xml:space="preserve">Proyecto CIAA [portal web]. Disponible en: http://www.proyecto-ciaa.com.ar/index.html (visitado 31-8-2026).</w:t>
+        <w:t xml:space="preserve">NXP Semiconductors. UM10503. LPC43xx/LPC43Sxx ARM Cortex-M4/M0 multi-core microcontroller. User manual, Rev. 2.1, 10-12-2015.</w:t>
       </w:r>
     </w:p>
     <w:p>
@@ -4849,7 +4663,7 @@
           <w:sz w:val="24"/>
           <w:szCs w:val="24"/>
         </w:rPr>
-        <w:t xml:space="preserve">Hokayem, P. F. y Spong, M. W. “Bilateral Teleoperation: An Historical Survey”. Automatica, vol. 42, n.º 12, pp. 2035-2057, 2006.</w:t>
+        <w:t xml:space="preserve">Pernía, E. Firmware v3 [repositorio de software]. Disponible en: https://github.com/epernia/firmware_v3 (visitado 7-9-2026).</w:t>
       </w:r>
     </w:p>
     <w:p>
@@ -4872,7 +4686,7 @@
           <w:sz w:val="24"/>
           <w:szCs w:val="24"/>
         </w:rPr>
-        <w:t xml:space="preserve">NXP Semiconductors. UM10503. LPC43xx/LPC43Sxx ARM Cortex-M4/M0 multi-core microcontroller. User manual, Rev. 2.1, 10-12-2015.</w:t>
+        <w:t xml:space="preserve">Llamas, L. Brazo robótico controlado por Arduino [artículo web]. Disponible en: https://www.luisllamas.es/brazo-robotico-arduino/ (visitado 7-9-2026).</w:t>
       </w:r>
     </w:p>
     <w:p>
@@ -4895,2673 +4709,12 @@
           <w:sz w:val="24"/>
           <w:szCs w:val="24"/>
         </w:rPr>
-        <w:t xml:space="preserve">Yiu, J. The Definitive Guide to ARM Cortex-M3 and Cortex-M4 Processors. 3.a ed. Oxford: Elsevier/Newnes, 2014.</w:t>
-      </w:r>
-    </w:p>
-    <w:p>
-      <w:pPr>
-        <w:spacing w:after="160" w:line="320"/>
-        <w:ind w:left="454" w:hanging="454"/>
-        <w:jc w:val="both"/>
-      </w:pPr>
-      <w:r>
-        <w:rPr>
-          <w:rFonts w:ascii="Times New Roman" w:cs="Times New Roman" w:eastAsia="Times New Roman" w:hAnsi="Times New Roman"/>
-          <w:sz w:val="24"/>
-          <w:szCs w:val="24"/>
-        </w:rPr>
-        <w:t xml:space="preserve">[6] </w:t>
-      </w:r>
-      <w:r>
-        <w:rPr>
-          <w:rFonts w:ascii="Times New Roman" w:cs="Times New Roman" w:eastAsia="Times New Roman" w:hAnsi="Times New Roman"/>
-          <w:sz w:val="24"/>
-          <w:szCs w:val="24"/>
-        </w:rPr>
-        <w:t xml:space="preserve">Pernía, E. Firmware v3 [repositorio de software]. Disponible en: https://github.com/epernia/firmware_v3 (visitado 31-8-2026).</w:t>
-      </w:r>
-    </w:p>
-    <w:p>
-      <w:pPr>
-        <w:spacing w:after="160" w:line="320"/>
-        <w:ind w:left="454" w:hanging="454"/>
-        <w:jc w:val="both"/>
-      </w:pPr>
-      <w:r>
-        <w:rPr>
-          <w:rFonts w:ascii="Times New Roman" w:cs="Times New Roman" w:eastAsia="Times New Roman" w:hAnsi="Times New Roman"/>
-          <w:sz w:val="24"/>
-          <w:szCs w:val="24"/>
-        </w:rPr>
-        <w:t xml:space="preserve">[7] </w:t>
-      </w:r>
-      <w:r>
-        <w:rPr>
-          <w:rFonts w:ascii="Times New Roman" w:cs="Times New Roman" w:eastAsia="Times New Roman" w:hAnsi="Times New Roman"/>
-          <w:sz w:val="24"/>
-          <w:szCs w:val="24"/>
-        </w:rPr>
-        <w:t xml:space="preserve">NXP Semiconductors. LPC435x/3x/2x/1x. 32-bit ARM Cortex-M4/M0 MCU. Product data sheet, Rev. 5.3, 15-3-2016.</w:t>
-      </w:r>
-    </w:p>
-    <w:p>
-      <w:pPr>
-        <w:spacing w:after="160" w:line="320"/>
-        <w:ind w:left="454" w:hanging="454"/>
-        <w:jc w:val="both"/>
-      </w:pPr>
-      <w:r>
-        <w:rPr>
-          <w:rFonts w:ascii="Times New Roman" w:cs="Times New Roman" w:eastAsia="Times New Roman" w:hAnsi="Times New Roman"/>
-          <w:sz w:val="24"/>
-          <w:szCs w:val="24"/>
-        </w:rPr>
-        <w:t xml:space="preserve">[8] </w:t>
-      </w:r>
-      <w:r>
-        <w:rPr>
-          <w:rFonts w:ascii="Times New Roman" w:cs="Times New Roman" w:eastAsia="Times New Roman" w:hAnsi="Times New Roman"/>
-          <w:sz w:val="24"/>
-          <w:szCs w:val="24"/>
-        </w:rPr>
-        <w:t xml:space="preserve">Proyecto CIAA. EDU-CIAA-NXP v1.1 Board. Documento de especificación de la placa, 3-1-2019.</w:t>
-      </w:r>
-    </w:p>
-    <w:p>
-      <w:pPr>
-        <w:spacing w:after="160" w:line="320"/>
-        <w:ind w:left="454" w:hanging="454"/>
-        <w:jc w:val="both"/>
-      </w:pPr>
-      <w:r>
-        <w:rPr>
-          <w:rFonts w:ascii="Times New Roman" w:cs="Times New Roman" w:eastAsia="Times New Roman" w:hAnsi="Times New Roman"/>
-          <w:sz w:val="24"/>
-          <w:szCs w:val="24"/>
-        </w:rPr>
-        <w:t xml:space="preserve">[9] </w:t>
-      </w:r>
-      <w:r>
-        <w:rPr>
-          <w:rFonts w:ascii="Times New Roman" w:cs="Times New Roman" w:eastAsia="Times New Roman" w:hAnsi="Times New Roman"/>
-          <w:sz w:val="24"/>
-          <w:szCs w:val="24"/>
-        </w:rPr>
-        <w:t xml:space="preserve">Valvano, J. W. Embedded Microcomputer Systems: Real Time Interfacing. 2.a ed. Thomson, 2007.</w:t>
-      </w:r>
-    </w:p>
-    <w:p>
-      <w:pPr>
-        <w:spacing w:after="160" w:line="320"/>
-        <w:ind w:left="454" w:hanging="454"/>
-        <w:jc w:val="both"/>
-      </w:pPr>
-      <w:r>
-        <w:rPr>
-          <w:rFonts w:ascii="Times New Roman" w:cs="Times New Roman" w:eastAsia="Times New Roman" w:hAnsi="Times New Roman"/>
-          <w:sz w:val="24"/>
-          <w:szCs w:val="24"/>
-        </w:rPr>
-        <w:t xml:space="preserve">[10] </w:t>
-      </w:r>
-      <w:r>
-        <w:rPr>
-          <w:rFonts w:ascii="Times New Roman" w:cs="Times New Roman" w:eastAsia="Times New Roman" w:hAnsi="Times New Roman"/>
-          <w:sz w:val="24"/>
-          <w:szCs w:val="24"/>
-        </w:rPr>
-        <w:t xml:space="preserve">Craig, J. J. Introduction to Robotics: Mechanics and Control. 3.a ed. Pearson Prentice Hall, 2005.</w:t>
-      </w:r>
-    </w:p>
-    <w:p>
-      <w:pPr>
-        <w:spacing w:after="160" w:line="320"/>
-        <w:ind w:left="454" w:hanging="454"/>
-        <w:jc w:val="both"/>
-      </w:pPr>
-      <w:r>
-        <w:rPr>
-          <w:rFonts w:ascii="Times New Roman" w:cs="Times New Roman" w:eastAsia="Times New Roman" w:hAnsi="Times New Roman"/>
-          <w:sz w:val="24"/>
-          <w:szCs w:val="24"/>
-        </w:rPr>
-        <w:t xml:space="preserve">[11] </w:t>
-      </w:r>
-      <w:r>
-        <w:rPr>
-          <w:rFonts w:ascii="Times New Roman" w:cs="Times New Roman" w:eastAsia="Times New Roman" w:hAnsi="Times New Roman"/>
-          <w:sz w:val="24"/>
-          <w:szCs w:val="24"/>
-        </w:rPr>
-        <w:t xml:space="preserve">Todomicro, Unibot, Starware y Electrocity [tiendas en línea]. Relevamiento de precios de componentes, 31-8-2026.</w:t>
+        <w:t xml:space="preserve">Cátedra de Introducción a la Robótica (E1505). Clase 15: Manipuladores. Facultad de Ingeniería, UNLP, 2025.</w:t>
       </w:r>
     </w:p>
     <w:p>
       <w:r>
         <w:br w:type="page"/>
-      </w:r>
-    </w:p>
-    <w:p>
-      <w:pPr>
-        <w:pStyle w:val="Heading1"/>
-        <w:spacing w:after="200" w:before="240"/>
-      </w:pPr>
-      <w:r>
-        <w:rPr>
-          <w:rFonts w:ascii="Times New Roman" w:cs="Times New Roman" w:eastAsia="Times New Roman" w:hAnsi="Times New Roman"/>
-          <w:b/>
-          <w:bCs/>
-          <w:color w:val="000000"/>
-          <w:sz w:val="32"/>
-          <w:szCs w:val="32"/>
-        </w:rPr>
-        <w:t xml:space="preserve">ANEXO A. ALTERNATIVAS DE SOLUCIÓN Y COSTOS</w:t>
-      </w:r>
-    </w:p>
-    <w:p>
-      <w:pPr>
-        <w:pStyle w:val="Heading2"/>
-        <w:spacing w:after="140" w:before="280"/>
-      </w:pPr>
-      <w:r>
-        <w:rPr>
-          <w:rFonts w:ascii="Times New Roman" w:cs="Times New Roman" w:eastAsia="Times New Roman" w:hAnsi="Times New Roman"/>
-          <w:b/>
-          <w:bCs/>
-          <w:color w:val="000000"/>
-          <w:sz w:val="26"/>
-          <w:szCs w:val="26"/>
-        </w:rPr>
-        <w:t xml:space="preserve">A.1 Dimensionamiento del par y precios de referencia</w:t>
-      </w:r>
-    </w:p>
-    <w:p>
-      <w:pPr>
-        <w:spacing w:after="120" w:line="360"/>
-        <w:ind w:firstLine="709"/>
-        <w:jc w:val="both"/>
-      </w:pPr>
-      <w:r>
-        <w:rPr>
-          <w:rFonts w:ascii="Times New Roman" w:cs="Times New Roman" w:eastAsia="Times New Roman" w:hAnsi="Times New Roman"/>
-          <w:sz w:val="24"/>
-          <w:szCs w:val="24"/>
-        </w:rPr>
-        <w:t xml:space="preserve">El par requerido en el hombro es el parámetro que gobierna el costo del proyecto. Para un brazo de dos tramos de 15 cm que sostiene una carga de 250 g, el par en esa articulación resulta de la suma de los momentos de todo lo que cuelga de ella:</w:t>
-      </w:r>
-    </w:p>
-    <w:p>
-      <w:pPr>
-        <w:spacing w:after="160" w:before="120"/>
-        <w:jc w:val="center"/>
-      </w:pPr>
-      <w:r>
-        <w:rPr>
-          <w:rFonts w:ascii="Times New Roman" w:cs="Times New Roman" w:eastAsia="Times New Roman" w:hAnsi="Times New Roman"/>
-          <w:b/>
-          <w:bCs/>
-          <w:sz w:val="26"/>
-          <w:szCs w:val="26"/>
-        </w:rPr>
-        <w:t xml:space="preserve">τ = Σ mᵢ · g · dᵢ ≈ 1,27 N·m ≈ 13 kgf·cm</w:t>
-      </w:r>
-    </w:p>
-    <w:p>
-      <w:pPr>
-        <w:spacing w:after="120" w:line="360"/>
-        <w:ind w:firstLine="709"/>
-        <w:jc w:val="both"/>
-      </w:pPr>
-      <w:r>
-        <w:rPr>
-          <w:rFonts w:ascii="Times New Roman" w:cs="Times New Roman" w:eastAsia="Times New Roman" w:hAnsi="Times New Roman"/>
-          <w:sz w:val="24"/>
-          <w:szCs w:val="24"/>
-        </w:rPr>
-        <w:t xml:space="preserve">Un servomotor MG996R entrega aproximadamente 11 kgf·cm a 6 V, de modo que no satisface ese valor; el modelo inmediato superior disponible en plaza, el DS3218MG de 20 kgf·cm, cuesta cerca de cinco veces más. Se evaluaron por lo tanto cuatro alternativas, todas compatibles con el objetivo del proyecto y con la restricción presupuestaria del requerimiento 3.0. Los precios corresponden a un relevamiento realizado el 31 de agosto de 2026 en tiendas argentinas en línea y son de carácter orientativo [11].</w:t>
-      </w:r>
-    </w:p>
-    <w:tbl>
-      <w:tblPr>
-        <w:tblW w:type="dxa" w:w="9070"/>
-        <w:tblBorders>
-          <w:top w:val="single" w:color="000000" w:sz="4"/>
-          <w:left w:val="single" w:color="000000" w:sz="4"/>
-          <w:bottom w:val="single" w:color="000000" w:sz="4"/>
-          <w:right w:val="single" w:color="000000" w:sz="4"/>
-          <w:insideH w:val="single" w:color="666666" w:sz="2"/>
-          <w:insideV w:val="single" w:color="666666" w:sz="2"/>
-        </w:tblBorders>
-      </w:tblPr>
-      <w:tblGrid>
-        <w:gridCol w:w="5805"/>
-        <w:gridCol w:w="3265"/>
-      </w:tblGrid>
-      <w:tr>
-        <w:trPr>
-          <w:tblHeader/>
-        </w:trPr>
-        <w:tc>
-          <w:tcPr>
-            <w:tcW w:type="dxa" w:w="5805"/>
-            <w:shd w:fill="D9D9D9" w:color="auto" w:val="clear"/>
-            <w:tcMar>
-              <w:top w:type="dxa" w:w="70"/>
-              <w:left w:type="dxa" w:w="110"/>
-              <w:bottom w:type="dxa" w:w="70"/>
-              <w:right w:type="dxa" w:w="110"/>
-            </w:tcMar>
-            <w:vAlign w:val="center"/>
-          </w:tcPr>
-          <w:p>
-            <w:pPr>
-              <w:spacing w:after="0" w:line="240"/>
-              <w:jc w:val="left"/>
-            </w:pPr>
-            <w:r>
-              <w:rPr>
-                <w:rFonts w:ascii="Times New Roman" w:cs="Times New Roman" w:eastAsia="Times New Roman" w:hAnsi="Times New Roman"/>
-                <w:b/>
-                <w:bCs/>
-                <w:sz w:val="21"/>
-                <w:szCs w:val="21"/>
-              </w:rPr>
-              <w:t xml:space="preserve">Componente</w:t>
-            </w:r>
-          </w:p>
-        </w:tc>
-        <w:tc>
-          <w:tcPr>
-            <w:tcW w:type="dxa" w:w="3265"/>
-            <w:shd w:fill="D9D9D9" w:color="auto" w:val="clear"/>
-            <w:tcMar>
-              <w:top w:type="dxa" w:w="70"/>
-              <w:left w:type="dxa" w:w="110"/>
-              <w:bottom w:type="dxa" w:w="70"/>
-              <w:right w:type="dxa" w:w="110"/>
-            </w:tcMar>
-            <w:vAlign w:val="center"/>
-          </w:tcPr>
-          <w:p>
-            <w:pPr>
-              <w:spacing w:after="0" w:line="240"/>
-              <w:jc w:val="left"/>
-            </w:pPr>
-            <w:r>
-              <w:rPr>
-                <w:rFonts w:ascii="Times New Roman" w:cs="Times New Roman" w:eastAsia="Times New Roman" w:hAnsi="Times New Roman"/>
-                <w:b/>
-                <w:bCs/>
-                <w:sz w:val="21"/>
-                <w:szCs w:val="21"/>
-              </w:rPr>
-              <w:t xml:space="preserve">Precio unitario</w:t>
-            </w:r>
-          </w:p>
-        </w:tc>
-      </w:tr>
-      <w:tr>
-        <w:trPr>
-          <w:tblHeader w:val="false"/>
-        </w:trPr>
-        <w:tc>
-          <w:tcPr>
-            <w:tcW w:type="dxa" w:w="5805"/>
-            <w:tcMar>
-              <w:top w:type="dxa" w:w="70"/>
-              <w:left w:type="dxa" w:w="110"/>
-              <w:bottom w:type="dxa" w:w="70"/>
-              <w:right w:type="dxa" w:w="110"/>
-            </w:tcMar>
-            <w:vAlign w:val="center"/>
-          </w:tcPr>
-          <w:p>
-            <w:pPr>
-              <w:spacing w:after="0" w:line="240"/>
-              <w:jc w:val="left"/>
-            </w:pPr>
-            <w:r>
-              <w:rPr>
-                <w:rFonts w:ascii="Times New Roman" w:cs="Times New Roman" w:eastAsia="Times New Roman" w:hAnsi="Times New Roman"/>
-                <w:b w:val="false"/>
-                <w:bCs w:val="false"/>
-                <w:sz w:val="21"/>
-                <w:szCs w:val="21"/>
-              </w:rPr>
-              <w:t xml:space="preserve">Servomotor SG90 (9 g, engranaje plástico, ≈1,5 kgf·cm)</w:t>
-            </w:r>
-          </w:p>
-        </w:tc>
-        <w:tc>
-          <w:tcPr>
-            <w:tcW w:type="dxa" w:w="3265"/>
-            <w:tcMar>
-              <w:top w:type="dxa" w:w="70"/>
-              <w:left w:type="dxa" w:w="110"/>
-              <w:bottom w:type="dxa" w:w="70"/>
-              <w:right w:type="dxa" w:w="110"/>
-            </w:tcMar>
-            <w:vAlign w:val="center"/>
-          </w:tcPr>
-          <w:p>
-            <w:pPr>
-              <w:spacing w:after="0" w:line="240"/>
-              <w:jc w:val="left"/>
-            </w:pPr>
-            <w:r>
-              <w:rPr>
-                <w:rFonts w:ascii="Times New Roman" w:cs="Times New Roman" w:eastAsia="Times New Roman" w:hAnsi="Times New Roman"/>
-                <w:b w:val="false"/>
-                <w:bCs w:val="false"/>
-                <w:sz w:val="21"/>
-                <w:szCs w:val="21"/>
-              </w:rPr>
-              <w:t xml:space="preserve">$4.000</w:t>
-            </w:r>
-          </w:p>
-        </w:tc>
-      </w:tr>
-      <w:tr>
-        <w:trPr>
-          <w:tblHeader w:val="false"/>
-        </w:trPr>
-        <w:tc>
-          <w:tcPr>
-            <w:tcW w:type="dxa" w:w="5805"/>
-            <w:tcMar>
-              <w:top w:type="dxa" w:w="70"/>
-              <w:left w:type="dxa" w:w="110"/>
-              <w:bottom w:type="dxa" w:w="70"/>
-              <w:right w:type="dxa" w:w="110"/>
-            </w:tcMar>
-            <w:vAlign w:val="center"/>
-          </w:tcPr>
-          <w:p>
-            <w:pPr>
-              <w:spacing w:after="0" w:line="240"/>
-              <w:jc w:val="left"/>
-            </w:pPr>
-            <w:r>
-              <w:rPr>
-                <w:rFonts w:ascii="Times New Roman" w:cs="Times New Roman" w:eastAsia="Times New Roman" w:hAnsi="Times New Roman"/>
-                <w:b w:val="false"/>
-                <w:bCs w:val="false"/>
-                <w:sz w:val="21"/>
-                <w:szCs w:val="21"/>
-              </w:rPr>
-              <w:t xml:space="preserve">Servomotor MG90S (engranaje metálico, ≈2 kgf·cm)</w:t>
-            </w:r>
-          </w:p>
-        </w:tc>
-        <w:tc>
-          <w:tcPr>
-            <w:tcW w:type="dxa" w:w="3265"/>
-            <w:tcMar>
-              <w:top w:type="dxa" w:w="70"/>
-              <w:left w:type="dxa" w:w="110"/>
-              <w:bottom w:type="dxa" w:w="70"/>
-              <w:right w:type="dxa" w:w="110"/>
-            </w:tcMar>
-            <w:vAlign w:val="center"/>
-          </w:tcPr>
-          <w:p>
-            <w:pPr>
-              <w:spacing w:after="0" w:line="240"/>
-              <w:jc w:val="left"/>
-            </w:pPr>
-            <w:r>
-              <w:rPr>
-                <w:rFonts w:ascii="Times New Roman" w:cs="Times New Roman" w:eastAsia="Times New Roman" w:hAnsi="Times New Roman"/>
-                <w:b w:val="false"/>
-                <w:bCs w:val="false"/>
-                <w:sz w:val="21"/>
-                <w:szCs w:val="21"/>
-              </w:rPr>
-              <w:t xml:space="preserve">$8.000</w:t>
-            </w:r>
-          </w:p>
-        </w:tc>
-      </w:tr>
-      <w:tr>
-        <w:trPr>
-          <w:tblHeader w:val="false"/>
-        </w:trPr>
-        <w:tc>
-          <w:tcPr>
-            <w:tcW w:type="dxa" w:w="5805"/>
-            <w:tcMar>
-              <w:top w:type="dxa" w:w="70"/>
-              <w:left w:type="dxa" w:w="110"/>
-              <w:bottom w:type="dxa" w:w="70"/>
-              <w:right w:type="dxa" w:w="110"/>
-            </w:tcMar>
-            <w:vAlign w:val="center"/>
-          </w:tcPr>
-          <w:p>
-            <w:pPr>
-              <w:spacing w:after="0" w:line="240"/>
-              <w:jc w:val="left"/>
-            </w:pPr>
-            <w:r>
-              <w:rPr>
-                <w:rFonts w:ascii="Times New Roman" w:cs="Times New Roman" w:eastAsia="Times New Roman" w:hAnsi="Times New Roman"/>
-                <w:b w:val="false"/>
-                <w:bCs w:val="false"/>
-                <w:sz w:val="21"/>
-                <w:szCs w:val="21"/>
-              </w:rPr>
-              <w:t xml:space="preserve">Servomotor MG996R (≈10 a 12 kgf·cm)</w:t>
-            </w:r>
-          </w:p>
-        </w:tc>
-        <w:tc>
-          <w:tcPr>
-            <w:tcW w:type="dxa" w:w="3265"/>
-            <w:tcMar>
-              <w:top w:type="dxa" w:w="70"/>
-              <w:left w:type="dxa" w:w="110"/>
-              <w:bottom w:type="dxa" w:w="70"/>
-              <w:right w:type="dxa" w:w="110"/>
-            </w:tcMar>
-            <w:vAlign w:val="center"/>
-          </w:tcPr>
-          <w:p>
-            <w:pPr>
-              <w:spacing w:after="0" w:line="240"/>
-              <w:jc w:val="left"/>
-            </w:pPr>
-            <w:r>
-              <w:rPr>
-                <w:rFonts w:ascii="Times New Roman" w:cs="Times New Roman" w:eastAsia="Times New Roman" w:hAnsi="Times New Roman"/>
-                <w:b w:val="false"/>
-                <w:bCs w:val="false"/>
-                <w:sz w:val="21"/>
-                <w:szCs w:val="21"/>
-              </w:rPr>
-              <w:t xml:space="preserve">$10.000</w:t>
-            </w:r>
-          </w:p>
-        </w:tc>
-      </w:tr>
-      <w:tr>
-        <w:trPr>
-          <w:tblHeader w:val="false"/>
-        </w:trPr>
-        <w:tc>
-          <w:tcPr>
-            <w:tcW w:type="dxa" w:w="5805"/>
-            <w:tcMar>
-              <w:top w:type="dxa" w:w="70"/>
-              <w:left w:type="dxa" w:w="110"/>
-              <w:bottom w:type="dxa" w:w="70"/>
-              <w:right w:type="dxa" w:w="110"/>
-            </w:tcMar>
-            <w:vAlign w:val="center"/>
-          </w:tcPr>
-          <w:p>
-            <w:pPr>
-              <w:spacing w:after="0" w:line="240"/>
-              <w:jc w:val="left"/>
-            </w:pPr>
-            <w:r>
-              <w:rPr>
-                <w:rFonts w:ascii="Times New Roman" w:cs="Times New Roman" w:eastAsia="Times New Roman" w:hAnsi="Times New Roman"/>
-                <w:b w:val="false"/>
-                <w:bCs w:val="false"/>
-                <w:sz w:val="21"/>
-                <w:szCs w:val="21"/>
-              </w:rPr>
-              <w:t xml:space="preserve">Servomotor DS3218MG (≈20 kgf·cm)</w:t>
-            </w:r>
-          </w:p>
-        </w:tc>
-        <w:tc>
-          <w:tcPr>
-            <w:tcW w:type="dxa" w:w="3265"/>
-            <w:tcMar>
-              <w:top w:type="dxa" w:w="70"/>
-              <w:left w:type="dxa" w:w="110"/>
-              <w:bottom w:type="dxa" w:w="70"/>
-              <w:right w:type="dxa" w:w="110"/>
-            </w:tcMar>
-            <w:vAlign w:val="center"/>
-          </w:tcPr>
-          <w:p>
-            <w:pPr>
-              <w:spacing w:after="0" w:line="240"/>
-              <w:jc w:val="left"/>
-            </w:pPr>
-            <w:r>
-              <w:rPr>
-                <w:rFonts w:ascii="Times New Roman" w:cs="Times New Roman" w:eastAsia="Times New Roman" w:hAnsi="Times New Roman"/>
-                <w:b w:val="false"/>
-                <w:bCs w:val="false"/>
-                <w:sz w:val="21"/>
-                <w:szCs w:val="21"/>
-              </w:rPr>
-              <w:t xml:space="preserve">$48.000</w:t>
-            </w:r>
-          </w:p>
-        </w:tc>
-      </w:tr>
-      <w:tr>
-        <w:trPr>
-          <w:tblHeader w:val="false"/>
-        </w:trPr>
-        <w:tc>
-          <w:tcPr>
-            <w:tcW w:type="dxa" w:w="5805"/>
-            <w:tcMar>
-              <w:top w:type="dxa" w:w="70"/>
-              <w:left w:type="dxa" w:w="110"/>
-              <w:bottom w:type="dxa" w:w="70"/>
-              <w:right w:type="dxa" w:w="110"/>
-            </w:tcMar>
-            <w:vAlign w:val="center"/>
-          </w:tcPr>
-          <w:p>
-            <w:pPr>
-              <w:spacing w:after="0" w:line="240"/>
-              <w:jc w:val="left"/>
-            </w:pPr>
-            <w:r>
-              <w:rPr>
-                <w:rFonts w:ascii="Times New Roman" w:cs="Times New Roman" w:eastAsia="Times New Roman" w:hAnsi="Times New Roman"/>
-                <w:b w:val="false"/>
-                <w:bCs w:val="false"/>
-                <w:sz w:val="21"/>
-                <w:szCs w:val="21"/>
-              </w:rPr>
-              <w:t xml:space="preserve">Fuente conmutada 5 V / 10 A</w:t>
-            </w:r>
-          </w:p>
-        </w:tc>
-        <w:tc>
-          <w:tcPr>
-            <w:tcW w:type="dxa" w:w="3265"/>
-            <w:tcMar>
-              <w:top w:type="dxa" w:w="70"/>
-              <w:left w:type="dxa" w:w="110"/>
-              <w:bottom w:type="dxa" w:w="70"/>
-              <w:right w:type="dxa" w:w="110"/>
-            </w:tcMar>
-            <w:vAlign w:val="center"/>
-          </w:tcPr>
-          <w:p>
-            <w:pPr>
-              <w:spacing w:after="0" w:line="240"/>
-              <w:jc w:val="left"/>
-            </w:pPr>
-            <w:r>
-              <w:rPr>
-                <w:rFonts w:ascii="Times New Roman" w:cs="Times New Roman" w:eastAsia="Times New Roman" w:hAnsi="Times New Roman"/>
-                <w:b w:val="false"/>
-                <w:bCs w:val="false"/>
-                <w:sz w:val="21"/>
-                <w:szCs w:val="21"/>
-              </w:rPr>
-              <w:t xml:space="preserve">$16.000</w:t>
-            </w:r>
-          </w:p>
-        </w:tc>
-      </w:tr>
-      <w:tr>
-        <w:trPr>
-          <w:tblHeader w:val="false"/>
-        </w:trPr>
-        <w:tc>
-          <w:tcPr>
-            <w:tcW w:type="dxa" w:w="5805"/>
-            <w:tcMar>
-              <w:top w:type="dxa" w:w="70"/>
-              <w:left w:type="dxa" w:w="110"/>
-              <w:bottom w:type="dxa" w:w="70"/>
-              <w:right w:type="dxa" w:w="110"/>
-            </w:tcMar>
-            <w:vAlign w:val="center"/>
-          </w:tcPr>
-          <w:p>
-            <w:pPr>
-              <w:spacing w:after="0" w:line="240"/>
-              <w:jc w:val="left"/>
-            </w:pPr>
-            <w:r>
-              <w:rPr>
-                <w:rFonts w:ascii="Times New Roman" w:cs="Times New Roman" w:eastAsia="Times New Roman" w:hAnsi="Times New Roman"/>
-                <w:b w:val="false"/>
-                <w:bCs w:val="false"/>
-                <w:sz w:val="21"/>
-                <w:szCs w:val="21"/>
-              </w:rPr>
-              <w:t xml:space="preserve">Fuente ATX de computadora reciclada</w:t>
-            </w:r>
-          </w:p>
-        </w:tc>
-        <w:tc>
-          <w:tcPr>
-            <w:tcW w:type="dxa" w:w="3265"/>
-            <w:tcMar>
-              <w:top w:type="dxa" w:w="70"/>
-              <w:left w:type="dxa" w:w="110"/>
-              <w:bottom w:type="dxa" w:w="70"/>
-              <w:right w:type="dxa" w:w="110"/>
-            </w:tcMar>
-            <w:vAlign w:val="center"/>
-          </w:tcPr>
-          <w:p>
-            <w:pPr>
-              <w:spacing w:after="0" w:line="240"/>
-              <w:jc w:val="left"/>
-            </w:pPr>
-            <w:r>
-              <w:rPr>
-                <w:rFonts w:ascii="Times New Roman" w:cs="Times New Roman" w:eastAsia="Times New Roman" w:hAnsi="Times New Roman"/>
-                <w:b w:val="false"/>
-                <w:bCs w:val="false"/>
-                <w:sz w:val="21"/>
-                <w:szCs w:val="21"/>
-              </w:rPr>
-              <w:t xml:space="preserve">$0</w:t>
-            </w:r>
-          </w:p>
-        </w:tc>
-      </w:tr>
-      <w:tr>
-        <w:trPr>
-          <w:tblHeader w:val="false"/>
-        </w:trPr>
-        <w:tc>
-          <w:tcPr>
-            <w:tcW w:type="dxa" w:w="5805"/>
-            <w:tcMar>
-              <w:top w:type="dxa" w:w="70"/>
-              <w:left w:type="dxa" w:w="110"/>
-              <w:bottom w:type="dxa" w:w="70"/>
-              <w:right w:type="dxa" w:w="110"/>
-            </w:tcMar>
-            <w:vAlign w:val="center"/>
-          </w:tcPr>
-          <w:p>
-            <w:pPr>
-              <w:spacing w:after="0" w:line="240"/>
-              <w:jc w:val="left"/>
-            </w:pPr>
-            <w:r>
-              <w:rPr>
-                <w:rFonts w:ascii="Times New Roman" w:cs="Times New Roman" w:eastAsia="Times New Roman" w:hAnsi="Times New Roman"/>
-                <w:b w:val="false"/>
-                <w:bCs w:val="false"/>
-                <w:sz w:val="21"/>
-                <w:szCs w:val="21"/>
-              </w:rPr>
-              <w:t xml:space="preserve">Sensor de gas MQ-135 o MQ-2</w:t>
-            </w:r>
-          </w:p>
-        </w:tc>
-        <w:tc>
-          <w:tcPr>
-            <w:tcW w:type="dxa" w:w="3265"/>
-            <w:tcMar>
-              <w:top w:type="dxa" w:w="70"/>
-              <w:left w:type="dxa" w:w="110"/>
-              <w:bottom w:type="dxa" w:w="70"/>
-              <w:right w:type="dxa" w:w="110"/>
-            </w:tcMar>
-            <w:vAlign w:val="center"/>
-          </w:tcPr>
-          <w:p>
-            <w:pPr>
-              <w:spacing w:after="0" w:line="240"/>
-              <w:jc w:val="left"/>
-            </w:pPr>
-            <w:r>
-              <w:rPr>
-                <w:rFonts w:ascii="Times New Roman" w:cs="Times New Roman" w:eastAsia="Times New Roman" w:hAnsi="Times New Roman"/>
-                <w:b w:val="false"/>
-                <w:bCs w:val="false"/>
-                <w:sz w:val="21"/>
-                <w:szCs w:val="21"/>
-              </w:rPr>
-              <w:t xml:space="preserve">$3.500</w:t>
-            </w:r>
-          </w:p>
-        </w:tc>
-      </w:tr>
-      <w:tr>
-        <w:trPr>
-          <w:tblHeader w:val="false"/>
-        </w:trPr>
-        <w:tc>
-          <w:tcPr>
-            <w:tcW w:type="dxa" w:w="5805"/>
-            <w:tcMar>
-              <w:top w:type="dxa" w:w="70"/>
-              <w:left w:type="dxa" w:w="110"/>
-              <w:bottom w:type="dxa" w:w="70"/>
-              <w:right w:type="dxa" w:w="110"/>
-            </w:tcMar>
-            <w:vAlign w:val="center"/>
-          </w:tcPr>
-          <w:p>
-            <w:pPr>
-              <w:spacing w:after="0" w:line="240"/>
-              <w:jc w:val="left"/>
-            </w:pPr>
-            <w:r>
-              <w:rPr>
-                <w:rFonts w:ascii="Times New Roman" w:cs="Times New Roman" w:eastAsia="Times New Roman" w:hAnsi="Times New Roman"/>
-                <w:b w:val="false"/>
-                <w:bCs w:val="false"/>
-                <w:sz w:val="21"/>
-                <w:szCs w:val="21"/>
-              </w:rPr>
-              <w:t xml:space="preserve">Módulo joystick analógico de dos ejes</w:t>
-            </w:r>
-          </w:p>
-        </w:tc>
-        <w:tc>
-          <w:tcPr>
-            <w:tcW w:type="dxa" w:w="3265"/>
-            <w:tcMar>
-              <w:top w:type="dxa" w:w="70"/>
-              <w:left w:type="dxa" w:w="110"/>
-              <w:bottom w:type="dxa" w:w="70"/>
-              <w:right w:type="dxa" w:w="110"/>
-            </w:tcMar>
-            <w:vAlign w:val="center"/>
-          </w:tcPr>
-          <w:p>
-            <w:pPr>
-              <w:spacing w:after="0" w:line="240"/>
-              <w:jc w:val="left"/>
-            </w:pPr>
-            <w:r>
-              <w:rPr>
-                <w:rFonts w:ascii="Times New Roman" w:cs="Times New Roman" w:eastAsia="Times New Roman" w:hAnsi="Times New Roman"/>
-                <w:b w:val="false"/>
-                <w:bCs w:val="false"/>
-                <w:sz w:val="21"/>
-                <w:szCs w:val="21"/>
-              </w:rPr>
-              <w:t xml:space="preserve">$2.000</w:t>
-            </w:r>
-          </w:p>
-        </w:tc>
-      </w:tr>
-      <w:tr>
-        <w:trPr>
-          <w:tblHeader w:val="false"/>
-        </w:trPr>
-        <w:tc>
-          <w:tcPr>
-            <w:tcW w:type="dxa" w:w="5805"/>
-            <w:tcMar>
-              <w:top w:type="dxa" w:w="70"/>
-              <w:left w:type="dxa" w:w="110"/>
-              <w:bottom w:type="dxa" w:w="70"/>
-              <w:right w:type="dxa" w:w="110"/>
-            </w:tcMar>
-            <w:vAlign w:val="center"/>
-          </w:tcPr>
-          <w:p>
-            <w:pPr>
-              <w:spacing w:after="0" w:line="240"/>
-              <w:jc w:val="left"/>
-            </w:pPr>
-            <w:r>
-              <w:rPr>
-                <w:rFonts w:ascii="Times New Roman" w:cs="Times New Roman" w:eastAsia="Times New Roman" w:hAnsi="Times New Roman"/>
-                <w:b w:val="false"/>
-                <w:bCs w:val="false"/>
-                <w:sz w:val="21"/>
-                <w:szCs w:val="21"/>
-              </w:rPr>
-              <w:t xml:space="preserve">Pulsador de emergencia tipo hongo, 22 mm</w:t>
-            </w:r>
-          </w:p>
-        </w:tc>
-        <w:tc>
-          <w:tcPr>
-            <w:tcW w:type="dxa" w:w="3265"/>
-            <w:tcMar>
-              <w:top w:type="dxa" w:w="70"/>
-              <w:left w:type="dxa" w:w="110"/>
-              <w:bottom w:type="dxa" w:w="70"/>
-              <w:right w:type="dxa" w:w="110"/>
-            </w:tcMar>
-            <w:vAlign w:val="center"/>
-          </w:tcPr>
-          <w:p>
-            <w:pPr>
-              <w:spacing w:after="0" w:line="240"/>
-              <w:jc w:val="left"/>
-            </w:pPr>
-            <w:r>
-              <w:rPr>
-                <w:rFonts w:ascii="Times New Roman" w:cs="Times New Roman" w:eastAsia="Times New Roman" w:hAnsi="Times New Roman"/>
-                <w:b w:val="false"/>
-                <w:bCs w:val="false"/>
-                <w:sz w:val="21"/>
-                <w:szCs w:val="21"/>
-              </w:rPr>
-              <w:t xml:space="preserve">$10.000</w:t>
-            </w:r>
-          </w:p>
-        </w:tc>
-      </w:tr>
-      <w:tr>
-        <w:trPr>
-          <w:tblHeader w:val="false"/>
-        </w:trPr>
-        <w:tc>
-          <w:tcPr>
-            <w:tcW w:type="dxa" w:w="5805"/>
-            <w:tcMar>
-              <w:top w:type="dxa" w:w="70"/>
-              <w:left w:type="dxa" w:w="110"/>
-              <w:bottom w:type="dxa" w:w="70"/>
-              <w:right w:type="dxa" w:w="110"/>
-            </w:tcMar>
-            <w:vAlign w:val="center"/>
-          </w:tcPr>
-          <w:p>
-            <w:pPr>
-              <w:spacing w:after="0" w:line="240"/>
-              <w:jc w:val="left"/>
-            </w:pPr>
-            <w:r>
-              <w:rPr>
-                <w:rFonts w:ascii="Times New Roman" w:cs="Times New Roman" w:eastAsia="Times New Roman" w:hAnsi="Times New Roman"/>
-                <w:b w:val="false"/>
-                <w:bCs w:val="false"/>
-                <w:sz w:val="21"/>
-                <w:szCs w:val="21"/>
-              </w:rPr>
-              <w:t xml:space="preserve">Capacitores y componentes pasivos</w:t>
-            </w:r>
-          </w:p>
-        </w:tc>
-        <w:tc>
-          <w:tcPr>
-            <w:tcW w:type="dxa" w:w="3265"/>
-            <w:tcMar>
-              <w:top w:type="dxa" w:w="70"/>
-              <w:left w:type="dxa" w:w="110"/>
-              <w:bottom w:type="dxa" w:w="70"/>
-              <w:right w:type="dxa" w:w="110"/>
-            </w:tcMar>
-            <w:vAlign w:val="center"/>
-          </w:tcPr>
-          <w:p>
-            <w:pPr>
-              <w:spacing w:after="0" w:line="240"/>
-              <w:jc w:val="left"/>
-            </w:pPr>
-            <w:r>
-              <w:rPr>
-                <w:rFonts w:ascii="Times New Roman" w:cs="Times New Roman" w:eastAsia="Times New Roman" w:hAnsi="Times New Roman"/>
-                <w:b w:val="false"/>
-                <w:bCs w:val="false"/>
-                <w:sz w:val="21"/>
-                <w:szCs w:val="21"/>
-              </w:rPr>
-              <w:t xml:space="preserve">$5.000</w:t>
-            </w:r>
-          </w:p>
-        </w:tc>
-      </w:tr>
-      <w:tr>
-        <w:trPr>
-          <w:tblHeader w:val="false"/>
-        </w:trPr>
-        <w:tc>
-          <w:tcPr>
-            <w:tcW w:type="dxa" w:w="5805"/>
-            <w:tcMar>
-              <w:top w:type="dxa" w:w="70"/>
-              <w:left w:type="dxa" w:w="110"/>
-              <w:bottom w:type="dxa" w:w="70"/>
-              <w:right w:type="dxa" w:w="110"/>
-            </w:tcMar>
-            <w:vAlign w:val="center"/>
-          </w:tcPr>
-          <w:p>
-            <w:pPr>
-              <w:spacing w:after="0" w:line="240"/>
-              <w:jc w:val="left"/>
-            </w:pPr>
-            <w:r>
-              <w:rPr>
-                <w:rFonts w:ascii="Times New Roman" w:cs="Times New Roman" w:eastAsia="Times New Roman" w:hAnsi="Times New Roman"/>
-                <w:b w:val="false"/>
-                <w:bCs w:val="false"/>
-                <w:sz w:val="21"/>
-                <w:szCs w:val="21"/>
-              </w:rPr>
-              <w:t xml:space="preserve">Conectores, cables, display y tornillería</w:t>
-            </w:r>
-          </w:p>
-        </w:tc>
-        <w:tc>
-          <w:tcPr>
-            <w:tcW w:type="dxa" w:w="3265"/>
-            <w:tcMar>
-              <w:top w:type="dxa" w:w="70"/>
-              <w:left w:type="dxa" w:w="110"/>
-              <w:bottom w:type="dxa" w:w="70"/>
-              <w:right w:type="dxa" w:w="110"/>
-            </w:tcMar>
-            <w:vAlign w:val="center"/>
-          </w:tcPr>
-          <w:p>
-            <w:pPr>
-              <w:spacing w:after="0" w:line="240"/>
-              <w:jc w:val="left"/>
-            </w:pPr>
-            <w:r>
-              <w:rPr>
-                <w:rFonts w:ascii="Times New Roman" w:cs="Times New Roman" w:eastAsia="Times New Roman" w:hAnsi="Times New Roman"/>
-                <w:b w:val="false"/>
-                <w:bCs w:val="false"/>
-                <w:sz w:val="21"/>
-                <w:szCs w:val="21"/>
-              </w:rPr>
-              <w:t xml:space="preserve">$15.000</w:t>
-            </w:r>
-          </w:p>
-        </w:tc>
-      </w:tr>
-      <w:tr>
-        <w:trPr>
-          <w:tblHeader w:val="false"/>
-        </w:trPr>
-        <w:tc>
-          <w:tcPr>
-            <w:tcW w:type="dxa" w:w="5805"/>
-            <w:tcMar>
-              <w:top w:type="dxa" w:w="70"/>
-              <w:left w:type="dxa" w:w="110"/>
-              <w:bottom w:type="dxa" w:w="70"/>
-              <w:right w:type="dxa" w:w="110"/>
-            </w:tcMar>
-            <w:vAlign w:val="center"/>
-          </w:tcPr>
-          <w:p>
-            <w:pPr>
-              <w:spacing w:after="0" w:line="240"/>
-              <w:jc w:val="left"/>
-            </w:pPr>
-            <w:r>
-              <w:rPr>
-                <w:rFonts w:ascii="Times New Roman" w:cs="Times New Roman" w:eastAsia="Times New Roman" w:hAnsi="Times New Roman"/>
-                <w:b w:val="false"/>
-                <w:bCs w:val="false"/>
-                <w:sz w:val="21"/>
-                <w:szCs w:val="21"/>
-              </w:rPr>
-              <w:t xml:space="preserve">Estructura impresa en 3D (costo de filamento)</w:t>
-            </w:r>
-          </w:p>
-        </w:tc>
-        <w:tc>
-          <w:tcPr>
-            <w:tcW w:type="dxa" w:w="3265"/>
-            <w:tcMar>
-              <w:top w:type="dxa" w:w="70"/>
-              <w:left w:type="dxa" w:w="110"/>
-              <w:bottom w:type="dxa" w:w="70"/>
-              <w:right w:type="dxa" w:w="110"/>
-            </w:tcMar>
-            <w:vAlign w:val="center"/>
-          </w:tcPr>
-          <w:p>
-            <w:pPr>
-              <w:spacing w:after="0" w:line="240"/>
-              <w:jc w:val="left"/>
-            </w:pPr>
-            <w:r>
-              <w:rPr>
-                <w:rFonts w:ascii="Times New Roman" w:cs="Times New Roman" w:eastAsia="Times New Roman" w:hAnsi="Times New Roman"/>
-                <w:b w:val="false"/>
-                <w:bCs w:val="false"/>
-                <w:sz w:val="21"/>
-                <w:szCs w:val="21"/>
-              </w:rPr>
-              <w:t xml:space="preserve">$8.000</w:t>
-            </w:r>
-          </w:p>
-        </w:tc>
-      </w:tr>
-      <w:tr>
-        <w:trPr>
-          <w:tblHeader w:val="false"/>
-        </w:trPr>
-        <w:tc>
-          <w:tcPr>
-            <w:tcW w:type="dxa" w:w="5805"/>
-            <w:tcMar>
-              <w:top w:type="dxa" w:w="70"/>
-              <w:left w:type="dxa" w:w="110"/>
-              <w:bottom w:type="dxa" w:w="70"/>
-              <w:right w:type="dxa" w:w="110"/>
-            </w:tcMar>
-            <w:vAlign w:val="center"/>
-          </w:tcPr>
-          <w:p>
-            <w:pPr>
-              <w:spacing w:after="0" w:line="240"/>
-              <w:jc w:val="left"/>
-            </w:pPr>
-            <w:r>
-              <w:rPr>
-                <w:rFonts w:ascii="Times New Roman" w:cs="Times New Roman" w:eastAsia="Times New Roman" w:hAnsi="Times New Roman"/>
-                <w:b w:val="false"/>
-                <w:bCs w:val="false"/>
-                <w:sz w:val="21"/>
-                <w:szCs w:val="21"/>
-              </w:rPr>
-              <w:t xml:space="preserve">Kit comercial de brazo con servomotores incluidos</w:t>
-            </w:r>
-          </w:p>
-        </w:tc>
-        <w:tc>
-          <w:tcPr>
-            <w:tcW w:type="dxa" w:w="3265"/>
-            <w:tcMar>
-              <w:top w:type="dxa" w:w="70"/>
-              <w:left w:type="dxa" w:w="110"/>
-              <w:bottom w:type="dxa" w:w="70"/>
-              <w:right w:type="dxa" w:w="110"/>
-            </w:tcMar>
-            <w:vAlign w:val="center"/>
-          </w:tcPr>
-          <w:p>
-            <w:pPr>
-              <w:spacing w:after="0" w:line="240"/>
-              <w:jc w:val="left"/>
-            </w:pPr>
-            <w:r>
-              <w:rPr>
-                <w:rFonts w:ascii="Times New Roman" w:cs="Times New Roman" w:eastAsia="Times New Roman" w:hAnsi="Times New Roman"/>
-                <w:b w:val="false"/>
-                <w:bCs w:val="false"/>
-                <w:sz w:val="21"/>
-                <w:szCs w:val="21"/>
-              </w:rPr>
-              <w:t xml:space="preserve">$44.650</w:t>
-            </w:r>
-          </w:p>
-        </w:tc>
-      </w:tr>
-    </w:tbl>
-    <w:p>
-      <w:pPr>
-        <w:spacing w:after="240" w:before="0"/>
-        <w:jc w:val="center"/>
-      </w:pPr>
-      <w:r>
-        <w:rPr>
-          <w:rFonts w:ascii="Times New Roman" w:cs="Times New Roman" w:eastAsia="Times New Roman" w:hAnsi="Times New Roman"/>
-          <w:b/>
-          <w:bCs/>
-          <w:sz w:val="22"/>
-          <w:szCs w:val="22"/>
-        </w:rPr>
-        <w:t xml:space="preserve">Tabla 2: </w:t>
-      </w:r>
-      <w:r>
-        <w:rPr>
-          <w:rFonts w:ascii="Times New Roman" w:cs="Times New Roman" w:eastAsia="Times New Roman" w:hAnsi="Times New Roman"/>
-          <w:sz w:val="22"/>
-          <w:szCs w:val="22"/>
-        </w:rPr>
-        <w:t xml:space="preserve">Precios de referencia de los componentes principales.</w:t>
-      </w:r>
-    </w:p>
-    <w:p>
-      <w:pPr>
-        <w:pStyle w:val="Heading2"/>
-        <w:spacing w:after="140" w:before="280"/>
-      </w:pPr>
-      <w:r>
-        <w:rPr>
-          <w:rFonts w:ascii="Times New Roman" w:cs="Times New Roman" w:eastAsia="Times New Roman" w:hAnsi="Times New Roman"/>
-          <w:b/>
-          <w:bCs/>
-          <w:color w:val="000000"/>
-          <w:sz w:val="26"/>
-          <w:szCs w:val="26"/>
-        </w:rPr>
-        <w:t xml:space="preserve">A.2 Alternativas evaluadas</w:t>
-      </w:r>
-    </w:p>
-    <w:p>
-      <w:pPr>
-        <w:pStyle w:val="Heading3"/>
-        <w:spacing w:after="100" w:before="200"/>
-      </w:pPr>
-      <w:r>
-        <w:rPr>
-          <w:rFonts w:ascii="Times New Roman" w:cs="Times New Roman" w:eastAsia="Times New Roman" w:hAnsi="Times New Roman"/>
-          <w:b/>
-          <w:bCs/>
-          <w:color w:val="000000"/>
-          <w:sz w:val="24"/>
-          <w:szCs w:val="24"/>
-        </w:rPr>
-        <w:t xml:space="preserve">Alternativa 1 — Brazo antropomórfico liviano ($79.500)</w:t>
-      </w:r>
-    </w:p>
-    <w:p>
-      <w:pPr>
-        <w:spacing w:after="120" w:line="360"/>
-        <w:ind w:firstLine="709"/>
-        <w:jc w:val="both"/>
-      </w:pPr>
-      <w:r>
-        <w:rPr>
-          <w:rFonts w:ascii="Times New Roman" w:cs="Times New Roman" w:eastAsia="Times New Roman" w:hAnsi="Times New Roman"/>
-          <w:sz w:val="24"/>
-          <w:szCs w:val="24"/>
-        </w:rPr>
-        <w:t xml:space="preserve">Se reduce la carga útil a 120 g y la longitud de los tramos a 12 cm; el par requerido en el hombro desciende a unos 6 kgf·cm, valor que un MG996R satisface con margen. Un tubo de ensayo lleno pesa alrededor de 50 g y un frasco de reactivo pequeño alrededor de 100 g, de modo que la carga resultante sigue siendo representativa de la aplicación. Emplea un MG996R, dos MG90S y dos SG90.</w:t>
-      </w:r>
-    </w:p>
-    <w:p>
-      <w:pPr>
-        <w:pStyle w:val="Heading3"/>
-        <w:spacing w:after="100" w:before="200"/>
-      </w:pPr>
-      <w:r>
-        <w:rPr>
-          <w:rFonts w:ascii="Times New Roman" w:cs="Times New Roman" w:eastAsia="Times New Roman" w:hAnsi="Times New Roman"/>
-          <w:b/>
-          <w:bCs/>
-          <w:color w:val="000000"/>
-          <w:sz w:val="24"/>
-          <w:szCs w:val="24"/>
-        </w:rPr>
-        <w:t xml:space="preserve">Alternativa 2 — Brazo antropomórfico con contrapeso ($84.500)</w:t>
-      </w:r>
-    </w:p>
-    <w:p>
-      <w:pPr>
-        <w:spacing w:after="120" w:line="360"/>
-        <w:ind w:firstLine="709"/>
-        <w:jc w:val="both"/>
-      </w:pPr>
-      <w:r>
-        <w:rPr>
-          <w:rFonts w:ascii="Times New Roman" w:cs="Times New Roman" w:eastAsia="Times New Roman" w:hAnsi="Times New Roman"/>
-          <w:sz w:val="24"/>
-          <w:szCs w:val="24"/>
-        </w:rPr>
-        <w:t xml:space="preserve">Conserva la carga útil de 250 g y compensa el peso propio del brazo mediante un resorte de tracción o un contrapeso montado en el hombro, solución habitual en manipuladores industriales. El actuador deja de sostener el peso muerto de la estructura y solo debe vencer la carga y la inercia. El dimensionamiento del resorte constituye un capítulo de análisis mecánico para el informe de avance.</w:t>
-      </w:r>
-    </w:p>
-    <w:p>
-      <w:pPr>
-        <w:pStyle w:val="Heading3"/>
-        <w:spacing w:after="100" w:before="200"/>
-      </w:pPr>
-      <w:r>
-        <w:rPr>
-          <w:rFonts w:ascii="Times New Roman" w:cs="Times New Roman" w:eastAsia="Times New Roman" w:hAnsi="Times New Roman"/>
-          <w:b/>
-          <w:bCs/>
-          <w:color w:val="000000"/>
-          <w:sz w:val="24"/>
-          <w:szCs w:val="24"/>
-        </w:rPr>
-        <w:t xml:space="preserve">Alternativa 3 — Configuración SCARA ($87.500)</w:t>
-      </w:r>
-    </w:p>
-    <w:p>
-      <w:pPr>
-        <w:spacing w:after="120" w:line="360"/>
-        <w:ind w:firstLine="709"/>
-        <w:jc w:val="both"/>
-      </w:pPr>
-      <w:r>
-        <w:rPr>
-          <w:rFonts w:ascii="Times New Roman" w:cs="Times New Roman" w:eastAsia="Times New Roman" w:hAnsi="Times New Roman"/>
-          <w:sz w:val="24"/>
-          <w:szCs w:val="24"/>
-        </w:rPr>
-        <w:t xml:space="preserve">Modifica la topología del manipulador. En una configuración SCARA los ejes de rotación son verticales, de modo que los actuadores no trabajan contra la gravedad: únicamente vencen la inercia y el rozamiento. El único eje que soporta carga gravitatoria es el de elevación, resuelto mediante varilla roscada. Con servomotores MG90S se manipulan cargas del orden de 500 g, más del doble que en las alternativas anteriores, y con un costo de actuadores menor. Adicionalmente, la cinemática inversa de un SCARA de dos eslabones se resuelve de forma cerrada mediante el teorema del coseno [10], lo que vuelve alcanzable el objetivo secundario correspondiente.</w:t>
-      </w:r>
-    </w:p>
-    <w:p>
-      <w:pPr>
-        <w:pStyle w:val="Heading3"/>
-        <w:spacing w:after="100" w:before="200"/>
-      </w:pPr>
-      <w:r>
-        <w:rPr>
-          <w:rFonts w:ascii="Times New Roman" w:cs="Times New Roman" w:eastAsia="Times New Roman" w:hAnsi="Times New Roman"/>
-          <w:b/>
-          <w:bCs/>
-          <w:color w:val="000000"/>
-          <w:sz w:val="24"/>
-          <w:szCs w:val="24"/>
-        </w:rPr>
-        <w:t xml:space="preserve">Alternativa 4 — Kit comercial con electrónica propia ($96.150)</w:t>
-      </w:r>
-    </w:p>
-    <w:p>
-      <w:pPr>
-        <w:spacing w:after="120" w:line="360"/>
-        <w:ind w:firstLine="709"/>
-        <w:jc w:val="both"/>
-      </w:pPr>
-      <w:r>
-        <w:rPr>
-          <w:rFonts w:ascii="Times New Roman" w:cs="Times New Roman" w:eastAsia="Times New Roman" w:hAnsi="Times New Roman"/>
-          <w:sz w:val="24"/>
-          <w:szCs w:val="24"/>
-        </w:rPr>
-        <w:t xml:space="preserve">Se adquiere un kit con la estructura y los servomotores incluidos, y el esfuerzo del grupo se concentra en el circuito impreso, el firmware y los ensayos. Reduce en unas treinta horas la carga de trabajo mecánica, pero elimina el capítulo de diseño mecánico propio y es la alternativa de mayor costo. Los kits disponibles incorporan servomotores de bajo par, por lo que se presupuesta el reemplazo del actuador del hombro.</w:t>
-      </w:r>
-    </w:p>
-    <w:p>
-      <w:pPr>
-        <w:pStyle w:val="Heading2"/>
-        <w:spacing w:after="140" w:before="280"/>
-      </w:pPr>
-      <w:r>
-        <w:rPr>
-          <w:rFonts w:ascii="Times New Roman" w:cs="Times New Roman" w:eastAsia="Times New Roman" w:hAnsi="Times New Roman"/>
-          <w:b/>
-          <w:bCs/>
-          <w:color w:val="000000"/>
-          <w:sz w:val="26"/>
-          <w:szCs w:val="26"/>
-        </w:rPr>
-        <w:t xml:space="preserve">A.3 Cuadro comparativo y alternativa propuesta</w:t>
-      </w:r>
-    </w:p>
-    <w:tbl>
-      <w:tblPr>
-        <w:tblW w:type="dxa" w:w="9070"/>
-        <w:tblBorders>
-          <w:top w:val="single" w:color="000000" w:sz="4"/>
-          <w:left w:val="single" w:color="000000" w:sz="4"/>
-          <w:bottom w:val="single" w:color="000000" w:sz="4"/>
-          <w:right w:val="single" w:color="000000" w:sz="4"/>
-          <w:insideH w:val="single" w:color="666666" w:sz="2"/>
-          <w:insideV w:val="single" w:color="666666" w:sz="2"/>
-        </w:tblBorders>
-      </w:tblPr>
-      <w:tblGrid>
-        <w:gridCol w:w="2540"/>
-        <w:gridCol w:w="1633"/>
-        <w:gridCol w:w="1633"/>
-        <w:gridCol w:w="1633"/>
-        <w:gridCol w:w="1633"/>
-      </w:tblGrid>
-      <w:tr>
-        <w:trPr>
-          <w:tblHeader/>
-        </w:trPr>
-        <w:tc>
-          <w:tcPr>
-            <w:tcW w:type="dxa" w:w="2540"/>
-            <w:shd w:fill="D9D9D9" w:color="auto" w:val="clear"/>
-            <w:tcMar>
-              <w:top w:type="dxa" w:w="70"/>
-              <w:left w:type="dxa" w:w="110"/>
-              <w:bottom w:type="dxa" w:w="70"/>
-              <w:right w:type="dxa" w:w="110"/>
-            </w:tcMar>
-            <w:vAlign w:val="center"/>
-          </w:tcPr>
-          <w:p>
-            <w:pPr>
-              <w:spacing w:after="0" w:line="240"/>
-              <w:jc w:val="left"/>
-            </w:pPr>
-            <w:r>
-              <w:rPr>
-                <w:rFonts w:ascii="Times New Roman" w:cs="Times New Roman" w:eastAsia="Times New Roman" w:hAnsi="Times New Roman"/>
-                <w:b/>
-                <w:bCs/>
-                <w:sz w:val="21"/>
-                <w:szCs w:val="21"/>
-              </w:rPr>
-              <w:t xml:space="preserve">Criterio</w:t>
-            </w:r>
-          </w:p>
-        </w:tc>
-        <w:tc>
-          <w:tcPr>
-            <w:tcW w:type="dxa" w:w="1633"/>
-            <w:shd w:fill="D9D9D9" w:color="auto" w:val="clear"/>
-            <w:tcMar>
-              <w:top w:type="dxa" w:w="70"/>
-              <w:left w:type="dxa" w:w="110"/>
-              <w:bottom w:type="dxa" w:w="70"/>
-              <w:right w:type="dxa" w:w="110"/>
-            </w:tcMar>
-            <w:vAlign w:val="center"/>
-          </w:tcPr>
-          <w:p>
-            <w:pPr>
-              <w:spacing w:after="0" w:line="240"/>
-              <w:jc w:val="left"/>
-            </w:pPr>
-            <w:r>
-              <w:rPr>
-                <w:rFonts w:ascii="Times New Roman" w:cs="Times New Roman" w:eastAsia="Times New Roman" w:hAnsi="Times New Roman"/>
-                <w:b/>
-                <w:bCs/>
-                <w:sz w:val="21"/>
-                <w:szCs w:val="21"/>
-              </w:rPr>
-              <w:t xml:space="preserve">Alt. 1</w:t>
-            </w:r>
-          </w:p>
-        </w:tc>
-        <w:tc>
-          <w:tcPr>
-            <w:tcW w:type="dxa" w:w="1633"/>
-            <w:shd w:fill="D9D9D9" w:color="auto" w:val="clear"/>
-            <w:tcMar>
-              <w:top w:type="dxa" w:w="70"/>
-              <w:left w:type="dxa" w:w="110"/>
-              <w:bottom w:type="dxa" w:w="70"/>
-              <w:right w:type="dxa" w:w="110"/>
-            </w:tcMar>
-            <w:vAlign w:val="center"/>
-          </w:tcPr>
-          <w:p>
-            <w:pPr>
-              <w:spacing w:after="0" w:line="240"/>
-              <w:jc w:val="left"/>
-            </w:pPr>
-            <w:r>
-              <w:rPr>
-                <w:rFonts w:ascii="Times New Roman" w:cs="Times New Roman" w:eastAsia="Times New Roman" w:hAnsi="Times New Roman"/>
-                <w:b/>
-                <w:bCs/>
-                <w:sz w:val="21"/>
-                <w:szCs w:val="21"/>
-              </w:rPr>
-              <w:t xml:space="preserve">Alt. 2</w:t>
-            </w:r>
-          </w:p>
-        </w:tc>
-        <w:tc>
-          <w:tcPr>
-            <w:tcW w:type="dxa" w:w="1633"/>
-            <w:shd w:fill="D9D9D9" w:color="auto" w:val="clear"/>
-            <w:tcMar>
-              <w:top w:type="dxa" w:w="70"/>
-              <w:left w:type="dxa" w:w="110"/>
-              <w:bottom w:type="dxa" w:w="70"/>
-              <w:right w:type="dxa" w:w="110"/>
-            </w:tcMar>
-            <w:vAlign w:val="center"/>
-          </w:tcPr>
-          <w:p>
-            <w:pPr>
-              <w:spacing w:after="0" w:line="240"/>
-              <w:jc w:val="left"/>
-            </w:pPr>
-            <w:r>
-              <w:rPr>
-                <w:rFonts w:ascii="Times New Roman" w:cs="Times New Roman" w:eastAsia="Times New Roman" w:hAnsi="Times New Roman"/>
-                <w:b/>
-                <w:bCs/>
-                <w:sz w:val="21"/>
-                <w:szCs w:val="21"/>
-              </w:rPr>
-              <w:t xml:space="preserve">Alt. 3</w:t>
-            </w:r>
-          </w:p>
-        </w:tc>
-        <w:tc>
-          <w:tcPr>
-            <w:tcW w:type="dxa" w:w="1633"/>
-            <w:shd w:fill="D9D9D9" w:color="auto" w:val="clear"/>
-            <w:tcMar>
-              <w:top w:type="dxa" w:w="70"/>
-              <w:left w:type="dxa" w:w="110"/>
-              <w:bottom w:type="dxa" w:w="70"/>
-              <w:right w:type="dxa" w:w="110"/>
-            </w:tcMar>
-            <w:vAlign w:val="center"/>
-          </w:tcPr>
-          <w:p>
-            <w:pPr>
-              <w:spacing w:after="0" w:line="240"/>
-              <w:jc w:val="left"/>
-            </w:pPr>
-            <w:r>
-              <w:rPr>
-                <w:rFonts w:ascii="Times New Roman" w:cs="Times New Roman" w:eastAsia="Times New Roman" w:hAnsi="Times New Roman"/>
-                <w:b/>
-                <w:bCs/>
-                <w:sz w:val="21"/>
-                <w:szCs w:val="21"/>
-              </w:rPr>
-              <w:t xml:space="preserve">Alt. 4</w:t>
-            </w:r>
-          </w:p>
-        </w:tc>
-      </w:tr>
-      <w:tr>
-        <w:trPr>
-          <w:tblHeader w:val="false"/>
-        </w:trPr>
-        <w:tc>
-          <w:tcPr>
-            <w:tcW w:type="dxa" w:w="2540"/>
-            <w:tcMar>
-              <w:top w:type="dxa" w:w="70"/>
-              <w:left w:type="dxa" w:w="110"/>
-              <w:bottom w:type="dxa" w:w="70"/>
-              <w:right w:type="dxa" w:w="110"/>
-            </w:tcMar>
-            <w:vAlign w:val="center"/>
-          </w:tcPr>
-          <w:p>
-            <w:pPr>
-              <w:spacing w:after="0" w:line="240"/>
-              <w:jc w:val="left"/>
-            </w:pPr>
-            <w:r>
-              <w:rPr>
-                <w:rFonts w:ascii="Times New Roman" w:cs="Times New Roman" w:eastAsia="Times New Roman" w:hAnsi="Times New Roman"/>
-                <w:b w:val="false"/>
-                <w:bCs w:val="false"/>
-                <w:sz w:val="21"/>
-                <w:szCs w:val="21"/>
-              </w:rPr>
-              <w:t xml:space="preserve">Costo total</w:t>
-            </w:r>
-          </w:p>
-        </w:tc>
-        <w:tc>
-          <w:tcPr>
-            <w:tcW w:type="dxa" w:w="1633"/>
-            <w:tcMar>
-              <w:top w:type="dxa" w:w="70"/>
-              <w:left w:type="dxa" w:w="110"/>
-              <w:bottom w:type="dxa" w:w="70"/>
-              <w:right w:type="dxa" w:w="110"/>
-            </w:tcMar>
-            <w:vAlign w:val="center"/>
-          </w:tcPr>
-          <w:p>
-            <w:pPr>
-              <w:spacing w:after="0" w:line="240"/>
-              <w:jc w:val="left"/>
-            </w:pPr>
-            <w:r>
-              <w:rPr>
-                <w:rFonts w:ascii="Times New Roman" w:cs="Times New Roman" w:eastAsia="Times New Roman" w:hAnsi="Times New Roman"/>
-                <w:b w:val="false"/>
-                <w:bCs w:val="false"/>
-                <w:sz w:val="21"/>
-                <w:szCs w:val="21"/>
-              </w:rPr>
-              <w:t xml:space="preserve">$79.500</w:t>
-            </w:r>
-          </w:p>
-        </w:tc>
-        <w:tc>
-          <w:tcPr>
-            <w:tcW w:type="dxa" w:w="1633"/>
-            <w:tcMar>
-              <w:top w:type="dxa" w:w="70"/>
-              <w:left w:type="dxa" w:w="110"/>
-              <w:bottom w:type="dxa" w:w="70"/>
-              <w:right w:type="dxa" w:w="110"/>
-            </w:tcMar>
-            <w:vAlign w:val="center"/>
-          </w:tcPr>
-          <w:p>
-            <w:pPr>
-              <w:spacing w:after="0" w:line="240"/>
-              <w:jc w:val="left"/>
-            </w:pPr>
-            <w:r>
-              <w:rPr>
-                <w:rFonts w:ascii="Times New Roman" w:cs="Times New Roman" w:eastAsia="Times New Roman" w:hAnsi="Times New Roman"/>
-                <w:b w:val="false"/>
-                <w:bCs w:val="false"/>
-                <w:sz w:val="21"/>
-                <w:szCs w:val="21"/>
-              </w:rPr>
-              <w:t xml:space="preserve">$84.500</w:t>
-            </w:r>
-          </w:p>
-        </w:tc>
-        <w:tc>
-          <w:tcPr>
-            <w:tcW w:type="dxa" w:w="1633"/>
-            <w:tcMar>
-              <w:top w:type="dxa" w:w="70"/>
-              <w:left w:type="dxa" w:w="110"/>
-              <w:bottom w:type="dxa" w:w="70"/>
-              <w:right w:type="dxa" w:w="110"/>
-            </w:tcMar>
-            <w:vAlign w:val="center"/>
-          </w:tcPr>
-          <w:p>
-            <w:pPr>
-              <w:spacing w:after="0" w:line="240"/>
-              <w:jc w:val="left"/>
-            </w:pPr>
-            <w:r>
-              <w:rPr>
-                <w:rFonts w:ascii="Times New Roman" w:cs="Times New Roman" w:eastAsia="Times New Roman" w:hAnsi="Times New Roman"/>
-                <w:b w:val="false"/>
-                <w:bCs w:val="false"/>
-                <w:sz w:val="21"/>
-                <w:szCs w:val="21"/>
-              </w:rPr>
-              <w:t xml:space="preserve">$87.500</w:t>
-            </w:r>
-          </w:p>
-        </w:tc>
-        <w:tc>
-          <w:tcPr>
-            <w:tcW w:type="dxa" w:w="1633"/>
-            <w:tcMar>
-              <w:top w:type="dxa" w:w="70"/>
-              <w:left w:type="dxa" w:w="110"/>
-              <w:bottom w:type="dxa" w:w="70"/>
-              <w:right w:type="dxa" w:w="110"/>
-            </w:tcMar>
-            <w:vAlign w:val="center"/>
-          </w:tcPr>
-          <w:p>
-            <w:pPr>
-              <w:spacing w:after="0" w:line="240"/>
-              <w:jc w:val="left"/>
-            </w:pPr>
-            <w:r>
-              <w:rPr>
-                <w:rFonts w:ascii="Times New Roman" w:cs="Times New Roman" w:eastAsia="Times New Roman" w:hAnsi="Times New Roman"/>
-                <w:b w:val="false"/>
-                <w:bCs w:val="false"/>
-                <w:sz w:val="21"/>
-                <w:szCs w:val="21"/>
-              </w:rPr>
-              <w:t xml:space="preserve">$96.150</w:t>
-            </w:r>
-          </w:p>
-        </w:tc>
-      </w:tr>
-      <w:tr>
-        <w:trPr>
-          <w:tblHeader w:val="false"/>
-        </w:trPr>
-        <w:tc>
-          <w:tcPr>
-            <w:tcW w:type="dxa" w:w="2540"/>
-            <w:tcMar>
-              <w:top w:type="dxa" w:w="70"/>
-              <w:left w:type="dxa" w:w="110"/>
-              <w:bottom w:type="dxa" w:w="70"/>
-              <w:right w:type="dxa" w:w="110"/>
-            </w:tcMar>
-            <w:vAlign w:val="center"/>
-          </w:tcPr>
-          <w:p>
-            <w:pPr>
-              <w:spacing w:after="0" w:line="240"/>
-              <w:jc w:val="left"/>
-            </w:pPr>
-            <w:r>
-              <w:rPr>
-                <w:rFonts w:ascii="Times New Roman" w:cs="Times New Roman" w:eastAsia="Times New Roman" w:hAnsi="Times New Roman"/>
-                <w:b w:val="false"/>
-                <w:bCs w:val="false"/>
-                <w:sz w:val="21"/>
-                <w:szCs w:val="21"/>
-              </w:rPr>
-              <w:t xml:space="preserve">Costo por integrante (4)</w:t>
-            </w:r>
-          </w:p>
-        </w:tc>
-        <w:tc>
-          <w:tcPr>
-            <w:tcW w:type="dxa" w:w="1633"/>
-            <w:tcMar>
-              <w:top w:type="dxa" w:w="70"/>
-              <w:left w:type="dxa" w:w="110"/>
-              <w:bottom w:type="dxa" w:w="70"/>
-              <w:right w:type="dxa" w:w="110"/>
-            </w:tcMar>
-            <w:vAlign w:val="center"/>
-          </w:tcPr>
-          <w:p>
-            <w:pPr>
-              <w:spacing w:after="0" w:line="240"/>
-              <w:jc w:val="left"/>
-            </w:pPr>
-            <w:r>
-              <w:rPr>
-                <w:rFonts w:ascii="Times New Roman" w:cs="Times New Roman" w:eastAsia="Times New Roman" w:hAnsi="Times New Roman"/>
-                <w:b w:val="false"/>
-                <w:bCs w:val="false"/>
-                <w:sz w:val="21"/>
-                <w:szCs w:val="21"/>
-              </w:rPr>
-              <w:t xml:space="preserve">$19.900</w:t>
-            </w:r>
-          </w:p>
-        </w:tc>
-        <w:tc>
-          <w:tcPr>
-            <w:tcW w:type="dxa" w:w="1633"/>
-            <w:tcMar>
-              <w:top w:type="dxa" w:w="70"/>
-              <w:left w:type="dxa" w:w="110"/>
-              <w:bottom w:type="dxa" w:w="70"/>
-              <w:right w:type="dxa" w:w="110"/>
-            </w:tcMar>
-            <w:vAlign w:val="center"/>
-          </w:tcPr>
-          <w:p>
-            <w:pPr>
-              <w:spacing w:after="0" w:line="240"/>
-              <w:jc w:val="left"/>
-            </w:pPr>
-            <w:r>
-              <w:rPr>
-                <w:rFonts w:ascii="Times New Roman" w:cs="Times New Roman" w:eastAsia="Times New Roman" w:hAnsi="Times New Roman"/>
-                <w:b w:val="false"/>
-                <w:bCs w:val="false"/>
-                <w:sz w:val="21"/>
-                <w:szCs w:val="21"/>
-              </w:rPr>
-              <w:t xml:space="preserve">$21.100</w:t>
-            </w:r>
-          </w:p>
-        </w:tc>
-        <w:tc>
-          <w:tcPr>
-            <w:tcW w:type="dxa" w:w="1633"/>
-            <w:tcMar>
-              <w:top w:type="dxa" w:w="70"/>
-              <w:left w:type="dxa" w:w="110"/>
-              <w:bottom w:type="dxa" w:w="70"/>
-              <w:right w:type="dxa" w:w="110"/>
-            </w:tcMar>
-            <w:vAlign w:val="center"/>
-          </w:tcPr>
-          <w:p>
-            <w:pPr>
-              <w:spacing w:after="0" w:line="240"/>
-              <w:jc w:val="left"/>
-            </w:pPr>
-            <w:r>
-              <w:rPr>
-                <w:rFonts w:ascii="Times New Roman" w:cs="Times New Roman" w:eastAsia="Times New Roman" w:hAnsi="Times New Roman"/>
-                <w:b w:val="false"/>
-                <w:bCs w:val="false"/>
-                <w:sz w:val="21"/>
-                <w:szCs w:val="21"/>
-              </w:rPr>
-              <w:t xml:space="preserve">$21.900</w:t>
-            </w:r>
-          </w:p>
-        </w:tc>
-        <w:tc>
-          <w:tcPr>
-            <w:tcW w:type="dxa" w:w="1633"/>
-            <w:tcMar>
-              <w:top w:type="dxa" w:w="70"/>
-              <w:left w:type="dxa" w:w="110"/>
-              <w:bottom w:type="dxa" w:w="70"/>
-              <w:right w:type="dxa" w:w="110"/>
-            </w:tcMar>
-            <w:vAlign w:val="center"/>
-          </w:tcPr>
-          <w:p>
-            <w:pPr>
-              <w:spacing w:after="0" w:line="240"/>
-              <w:jc w:val="left"/>
-            </w:pPr>
-            <w:r>
-              <w:rPr>
-                <w:rFonts w:ascii="Times New Roman" w:cs="Times New Roman" w:eastAsia="Times New Roman" w:hAnsi="Times New Roman"/>
-                <w:b w:val="false"/>
-                <w:bCs w:val="false"/>
-                <w:sz w:val="21"/>
-                <w:szCs w:val="21"/>
-              </w:rPr>
-              <w:t xml:space="preserve">$24.000</w:t>
-            </w:r>
-          </w:p>
-        </w:tc>
-      </w:tr>
-      <w:tr>
-        <w:trPr>
-          <w:tblHeader w:val="false"/>
-        </w:trPr>
-        <w:tc>
-          <w:tcPr>
-            <w:tcW w:type="dxa" w:w="2540"/>
-            <w:tcMar>
-              <w:top w:type="dxa" w:w="70"/>
-              <w:left w:type="dxa" w:w="110"/>
-              <w:bottom w:type="dxa" w:w="70"/>
-              <w:right w:type="dxa" w:w="110"/>
-            </w:tcMar>
-            <w:vAlign w:val="center"/>
-          </w:tcPr>
-          <w:p>
-            <w:pPr>
-              <w:spacing w:after="0" w:line="240"/>
-              <w:jc w:val="left"/>
-            </w:pPr>
-            <w:r>
-              <w:rPr>
-                <w:rFonts w:ascii="Times New Roman" w:cs="Times New Roman" w:eastAsia="Times New Roman" w:hAnsi="Times New Roman"/>
-                <w:b w:val="false"/>
-                <w:bCs w:val="false"/>
-                <w:sz w:val="21"/>
-                <w:szCs w:val="21"/>
-              </w:rPr>
-              <w:t xml:space="preserve">Costo por integrante (3)</w:t>
-            </w:r>
-          </w:p>
-        </w:tc>
-        <w:tc>
-          <w:tcPr>
-            <w:tcW w:type="dxa" w:w="1633"/>
-            <w:tcMar>
-              <w:top w:type="dxa" w:w="70"/>
-              <w:left w:type="dxa" w:w="110"/>
-              <w:bottom w:type="dxa" w:w="70"/>
-              <w:right w:type="dxa" w:w="110"/>
-            </w:tcMar>
-            <w:vAlign w:val="center"/>
-          </w:tcPr>
-          <w:p>
-            <w:pPr>
-              <w:spacing w:after="0" w:line="240"/>
-              <w:jc w:val="left"/>
-            </w:pPr>
-            <w:r>
-              <w:rPr>
-                <w:rFonts w:ascii="Times New Roman" w:cs="Times New Roman" w:eastAsia="Times New Roman" w:hAnsi="Times New Roman"/>
-                <w:b w:val="false"/>
-                <w:bCs w:val="false"/>
-                <w:sz w:val="21"/>
-                <w:szCs w:val="21"/>
-              </w:rPr>
-              <w:t xml:space="preserve">$26.500</w:t>
-            </w:r>
-          </w:p>
-        </w:tc>
-        <w:tc>
-          <w:tcPr>
-            <w:tcW w:type="dxa" w:w="1633"/>
-            <w:tcMar>
-              <w:top w:type="dxa" w:w="70"/>
-              <w:left w:type="dxa" w:w="110"/>
-              <w:bottom w:type="dxa" w:w="70"/>
-              <w:right w:type="dxa" w:w="110"/>
-            </w:tcMar>
-            <w:vAlign w:val="center"/>
-          </w:tcPr>
-          <w:p>
-            <w:pPr>
-              <w:spacing w:after="0" w:line="240"/>
-              <w:jc w:val="left"/>
-            </w:pPr>
-            <w:r>
-              <w:rPr>
-                <w:rFonts w:ascii="Times New Roman" w:cs="Times New Roman" w:eastAsia="Times New Roman" w:hAnsi="Times New Roman"/>
-                <w:b w:val="false"/>
-                <w:bCs w:val="false"/>
-                <w:sz w:val="21"/>
-                <w:szCs w:val="21"/>
-              </w:rPr>
-              <w:t xml:space="preserve">$28.200</w:t>
-            </w:r>
-          </w:p>
-        </w:tc>
-        <w:tc>
-          <w:tcPr>
-            <w:tcW w:type="dxa" w:w="1633"/>
-            <w:tcMar>
-              <w:top w:type="dxa" w:w="70"/>
-              <w:left w:type="dxa" w:w="110"/>
-              <w:bottom w:type="dxa" w:w="70"/>
-              <w:right w:type="dxa" w:w="110"/>
-            </w:tcMar>
-            <w:vAlign w:val="center"/>
-          </w:tcPr>
-          <w:p>
-            <w:pPr>
-              <w:spacing w:after="0" w:line="240"/>
-              <w:jc w:val="left"/>
-            </w:pPr>
-            <w:r>
-              <w:rPr>
-                <w:rFonts w:ascii="Times New Roman" w:cs="Times New Roman" w:eastAsia="Times New Roman" w:hAnsi="Times New Roman"/>
-                <w:b w:val="false"/>
-                <w:bCs w:val="false"/>
-                <w:sz w:val="21"/>
-                <w:szCs w:val="21"/>
-              </w:rPr>
-              <w:t xml:space="preserve">$29.200</w:t>
-            </w:r>
-          </w:p>
-        </w:tc>
-        <w:tc>
-          <w:tcPr>
-            <w:tcW w:type="dxa" w:w="1633"/>
-            <w:tcMar>
-              <w:top w:type="dxa" w:w="70"/>
-              <w:left w:type="dxa" w:w="110"/>
-              <w:bottom w:type="dxa" w:w="70"/>
-              <w:right w:type="dxa" w:w="110"/>
-            </w:tcMar>
-            <w:vAlign w:val="center"/>
-          </w:tcPr>
-          <w:p>
-            <w:pPr>
-              <w:spacing w:after="0" w:line="240"/>
-              <w:jc w:val="left"/>
-            </w:pPr>
-            <w:r>
-              <w:rPr>
-                <w:rFonts w:ascii="Times New Roman" w:cs="Times New Roman" w:eastAsia="Times New Roman" w:hAnsi="Times New Roman"/>
-                <w:b w:val="false"/>
-                <w:bCs w:val="false"/>
-                <w:sz w:val="21"/>
-                <w:szCs w:val="21"/>
-              </w:rPr>
-              <w:t xml:space="preserve">$32.000</w:t>
-            </w:r>
-          </w:p>
-        </w:tc>
-      </w:tr>
-      <w:tr>
-        <w:trPr>
-          <w:tblHeader w:val="false"/>
-        </w:trPr>
-        <w:tc>
-          <w:tcPr>
-            <w:tcW w:type="dxa" w:w="2540"/>
-            <w:tcMar>
-              <w:top w:type="dxa" w:w="70"/>
-              <w:left w:type="dxa" w:w="110"/>
-              <w:bottom w:type="dxa" w:w="70"/>
-              <w:right w:type="dxa" w:w="110"/>
-            </w:tcMar>
-            <w:vAlign w:val="center"/>
-          </w:tcPr>
-          <w:p>
-            <w:pPr>
-              <w:spacing w:after="0" w:line="240"/>
-              <w:jc w:val="left"/>
-            </w:pPr>
-            <w:r>
-              <w:rPr>
-                <w:rFonts w:ascii="Times New Roman" w:cs="Times New Roman" w:eastAsia="Times New Roman" w:hAnsi="Times New Roman"/>
-                <w:b w:val="false"/>
-                <w:bCs w:val="false"/>
-                <w:sz w:val="21"/>
-                <w:szCs w:val="21"/>
-              </w:rPr>
-              <w:t xml:space="preserve">Carga útil</w:t>
-            </w:r>
-          </w:p>
-        </w:tc>
-        <w:tc>
-          <w:tcPr>
-            <w:tcW w:type="dxa" w:w="1633"/>
-            <w:tcMar>
-              <w:top w:type="dxa" w:w="70"/>
-              <w:left w:type="dxa" w:w="110"/>
-              <w:bottom w:type="dxa" w:w="70"/>
-              <w:right w:type="dxa" w:w="110"/>
-            </w:tcMar>
-            <w:vAlign w:val="center"/>
-          </w:tcPr>
-          <w:p>
-            <w:pPr>
-              <w:spacing w:after="0" w:line="240"/>
-              <w:jc w:val="left"/>
-            </w:pPr>
-            <w:r>
-              <w:rPr>
-                <w:rFonts w:ascii="Times New Roman" w:cs="Times New Roman" w:eastAsia="Times New Roman" w:hAnsi="Times New Roman"/>
-                <w:b w:val="false"/>
-                <w:bCs w:val="false"/>
-                <w:sz w:val="21"/>
-                <w:szCs w:val="21"/>
-              </w:rPr>
-              <w:t xml:space="preserve">120 g</w:t>
-            </w:r>
-          </w:p>
-        </w:tc>
-        <w:tc>
-          <w:tcPr>
-            <w:tcW w:type="dxa" w:w="1633"/>
-            <w:tcMar>
-              <w:top w:type="dxa" w:w="70"/>
-              <w:left w:type="dxa" w:w="110"/>
-              <w:bottom w:type="dxa" w:w="70"/>
-              <w:right w:type="dxa" w:w="110"/>
-            </w:tcMar>
-            <w:vAlign w:val="center"/>
-          </w:tcPr>
-          <w:p>
-            <w:pPr>
-              <w:spacing w:after="0" w:line="240"/>
-              <w:jc w:val="left"/>
-            </w:pPr>
-            <w:r>
-              <w:rPr>
-                <w:rFonts w:ascii="Times New Roman" w:cs="Times New Roman" w:eastAsia="Times New Roman" w:hAnsi="Times New Roman"/>
-                <w:b w:val="false"/>
-                <w:bCs w:val="false"/>
-                <w:sz w:val="21"/>
-                <w:szCs w:val="21"/>
-              </w:rPr>
-              <w:t xml:space="preserve">250 g</w:t>
-            </w:r>
-          </w:p>
-        </w:tc>
-        <w:tc>
-          <w:tcPr>
-            <w:tcW w:type="dxa" w:w="1633"/>
-            <w:tcMar>
-              <w:top w:type="dxa" w:w="70"/>
-              <w:left w:type="dxa" w:w="110"/>
-              <w:bottom w:type="dxa" w:w="70"/>
-              <w:right w:type="dxa" w:w="110"/>
-            </w:tcMar>
-            <w:vAlign w:val="center"/>
-          </w:tcPr>
-          <w:p>
-            <w:pPr>
-              <w:spacing w:after="0" w:line="240"/>
-              <w:jc w:val="left"/>
-            </w:pPr>
-            <w:r>
-              <w:rPr>
-                <w:rFonts w:ascii="Times New Roman" w:cs="Times New Roman" w:eastAsia="Times New Roman" w:hAnsi="Times New Roman"/>
-                <w:b w:val="false"/>
-                <w:bCs w:val="false"/>
-                <w:sz w:val="21"/>
-                <w:szCs w:val="21"/>
-              </w:rPr>
-              <w:t xml:space="preserve">500 g</w:t>
-            </w:r>
-          </w:p>
-        </w:tc>
-        <w:tc>
-          <w:tcPr>
-            <w:tcW w:type="dxa" w:w="1633"/>
-            <w:tcMar>
-              <w:top w:type="dxa" w:w="70"/>
-              <w:left w:type="dxa" w:w="110"/>
-              <w:bottom w:type="dxa" w:w="70"/>
-              <w:right w:type="dxa" w:w="110"/>
-            </w:tcMar>
-            <w:vAlign w:val="center"/>
-          </w:tcPr>
-          <w:p>
-            <w:pPr>
-              <w:spacing w:after="0" w:line="240"/>
-              <w:jc w:val="left"/>
-            </w:pPr>
-            <w:r>
-              <w:rPr>
-                <w:rFonts w:ascii="Times New Roman" w:cs="Times New Roman" w:eastAsia="Times New Roman" w:hAnsi="Times New Roman"/>
-                <w:b w:val="false"/>
-                <w:bCs w:val="false"/>
-                <w:sz w:val="21"/>
-                <w:szCs w:val="21"/>
-              </w:rPr>
-              <w:t xml:space="preserve">150 g</w:t>
-            </w:r>
-          </w:p>
-        </w:tc>
-      </w:tr>
-      <w:tr>
-        <w:trPr>
-          <w:tblHeader w:val="false"/>
-        </w:trPr>
-        <w:tc>
-          <w:tcPr>
-            <w:tcW w:type="dxa" w:w="2540"/>
-            <w:tcMar>
-              <w:top w:type="dxa" w:w="70"/>
-              <w:left w:type="dxa" w:w="110"/>
-              <w:bottom w:type="dxa" w:w="70"/>
-              <w:right w:type="dxa" w:w="110"/>
-            </w:tcMar>
-            <w:vAlign w:val="center"/>
-          </w:tcPr>
-          <w:p>
-            <w:pPr>
-              <w:spacing w:after="0" w:line="240"/>
-              <w:jc w:val="left"/>
-            </w:pPr>
-            <w:r>
-              <w:rPr>
-                <w:rFonts w:ascii="Times New Roman" w:cs="Times New Roman" w:eastAsia="Times New Roman" w:hAnsi="Times New Roman"/>
-                <w:b w:val="false"/>
-                <w:bCs w:val="false"/>
-                <w:sz w:val="21"/>
-                <w:szCs w:val="21"/>
-              </w:rPr>
-              <w:t xml:space="preserve">Dificultad mecánica</w:t>
-            </w:r>
-          </w:p>
-        </w:tc>
-        <w:tc>
-          <w:tcPr>
-            <w:tcW w:type="dxa" w:w="1633"/>
-            <w:tcMar>
-              <w:top w:type="dxa" w:w="70"/>
-              <w:left w:type="dxa" w:w="110"/>
-              <w:bottom w:type="dxa" w:w="70"/>
-              <w:right w:type="dxa" w:w="110"/>
-            </w:tcMar>
-            <w:vAlign w:val="center"/>
-          </w:tcPr>
-          <w:p>
-            <w:pPr>
-              <w:spacing w:after="0" w:line="240"/>
-              <w:jc w:val="left"/>
-            </w:pPr>
-            <w:r>
-              <w:rPr>
-                <w:rFonts w:ascii="Times New Roman" w:cs="Times New Roman" w:eastAsia="Times New Roman" w:hAnsi="Times New Roman"/>
-                <w:b w:val="false"/>
-                <w:bCs w:val="false"/>
-                <w:sz w:val="21"/>
-                <w:szCs w:val="21"/>
-              </w:rPr>
-              <w:t xml:space="preserve">Baja</w:t>
-            </w:r>
-          </w:p>
-        </w:tc>
-        <w:tc>
-          <w:tcPr>
-            <w:tcW w:type="dxa" w:w="1633"/>
-            <w:tcMar>
-              <w:top w:type="dxa" w:w="70"/>
-              <w:left w:type="dxa" w:w="110"/>
-              <w:bottom w:type="dxa" w:w="70"/>
-              <w:right w:type="dxa" w:w="110"/>
-            </w:tcMar>
-            <w:vAlign w:val="center"/>
-          </w:tcPr>
-          <w:p>
-            <w:pPr>
-              <w:spacing w:after="0" w:line="240"/>
-              <w:jc w:val="left"/>
-            </w:pPr>
-            <w:r>
-              <w:rPr>
-                <w:rFonts w:ascii="Times New Roman" w:cs="Times New Roman" w:eastAsia="Times New Roman" w:hAnsi="Times New Roman"/>
-                <w:b w:val="false"/>
-                <w:bCs w:val="false"/>
-                <w:sz w:val="21"/>
-                <w:szCs w:val="21"/>
-              </w:rPr>
-              <w:t xml:space="preserve">Media</w:t>
-            </w:r>
-          </w:p>
-        </w:tc>
-        <w:tc>
-          <w:tcPr>
-            <w:tcW w:type="dxa" w:w="1633"/>
-            <w:tcMar>
-              <w:top w:type="dxa" w:w="70"/>
-              <w:left w:type="dxa" w:w="110"/>
-              <w:bottom w:type="dxa" w:w="70"/>
-              <w:right w:type="dxa" w:w="110"/>
-            </w:tcMar>
-            <w:vAlign w:val="center"/>
-          </w:tcPr>
-          <w:p>
-            <w:pPr>
-              <w:spacing w:after="0" w:line="240"/>
-              <w:jc w:val="left"/>
-            </w:pPr>
-            <w:r>
-              <w:rPr>
-                <w:rFonts w:ascii="Times New Roman" w:cs="Times New Roman" w:eastAsia="Times New Roman" w:hAnsi="Times New Roman"/>
-                <w:b w:val="false"/>
-                <w:bCs w:val="false"/>
-                <w:sz w:val="21"/>
-                <w:szCs w:val="21"/>
-              </w:rPr>
-              <w:t xml:space="preserve">Alta</w:t>
-            </w:r>
-          </w:p>
-        </w:tc>
-        <w:tc>
-          <w:tcPr>
-            <w:tcW w:type="dxa" w:w="1633"/>
-            <w:tcMar>
-              <w:top w:type="dxa" w:w="70"/>
-              <w:left w:type="dxa" w:w="110"/>
-              <w:bottom w:type="dxa" w:w="70"/>
-              <w:right w:type="dxa" w:w="110"/>
-            </w:tcMar>
-            <w:vAlign w:val="center"/>
-          </w:tcPr>
-          <w:p>
-            <w:pPr>
-              <w:spacing w:after="0" w:line="240"/>
-              <w:jc w:val="left"/>
-            </w:pPr>
-            <w:r>
-              <w:rPr>
-                <w:rFonts w:ascii="Times New Roman" w:cs="Times New Roman" w:eastAsia="Times New Roman" w:hAnsi="Times New Roman"/>
-                <w:b w:val="false"/>
-                <w:bCs w:val="false"/>
-                <w:sz w:val="21"/>
-                <w:szCs w:val="21"/>
-              </w:rPr>
-              <w:t xml:space="preserve">Nula</w:t>
-            </w:r>
-          </w:p>
-        </w:tc>
-      </w:tr>
-      <w:tr>
-        <w:trPr>
-          <w:tblHeader w:val="false"/>
-        </w:trPr>
-        <w:tc>
-          <w:tcPr>
-            <w:tcW w:type="dxa" w:w="2540"/>
-            <w:tcMar>
-              <w:top w:type="dxa" w:w="70"/>
-              <w:left w:type="dxa" w:w="110"/>
-              <w:bottom w:type="dxa" w:w="70"/>
-              <w:right w:type="dxa" w:w="110"/>
-            </w:tcMar>
-            <w:vAlign w:val="center"/>
-          </w:tcPr>
-          <w:p>
-            <w:pPr>
-              <w:spacing w:after="0" w:line="240"/>
-              <w:jc w:val="left"/>
-            </w:pPr>
-            <w:r>
-              <w:rPr>
-                <w:rFonts w:ascii="Times New Roman" w:cs="Times New Roman" w:eastAsia="Times New Roman" w:hAnsi="Times New Roman"/>
-                <w:b w:val="false"/>
-                <w:bCs w:val="false"/>
-                <w:sz w:val="21"/>
-                <w:szCs w:val="21"/>
-              </w:rPr>
-              <w:t xml:space="preserve">Horas de trabajo mecánico</w:t>
-            </w:r>
-          </w:p>
-        </w:tc>
-        <w:tc>
-          <w:tcPr>
-            <w:tcW w:type="dxa" w:w="1633"/>
-            <w:tcMar>
-              <w:top w:type="dxa" w:w="70"/>
-              <w:left w:type="dxa" w:w="110"/>
-              <w:bottom w:type="dxa" w:w="70"/>
-              <w:right w:type="dxa" w:w="110"/>
-            </w:tcMar>
-            <w:vAlign w:val="center"/>
-          </w:tcPr>
-          <w:p>
-            <w:pPr>
-              <w:spacing w:after="0" w:line="240"/>
-              <w:jc w:val="left"/>
-            </w:pPr>
-            <w:r>
-              <w:rPr>
-                <w:rFonts w:ascii="Times New Roman" w:cs="Times New Roman" w:eastAsia="Times New Roman" w:hAnsi="Times New Roman"/>
-                <w:b w:val="false"/>
-                <w:bCs w:val="false"/>
-                <w:sz w:val="21"/>
-                <w:szCs w:val="21"/>
-              </w:rPr>
-              <w:t xml:space="preserve">≈25 h</w:t>
-            </w:r>
-          </w:p>
-        </w:tc>
-        <w:tc>
-          <w:tcPr>
-            <w:tcW w:type="dxa" w:w="1633"/>
-            <w:tcMar>
-              <w:top w:type="dxa" w:w="70"/>
-              <w:left w:type="dxa" w:w="110"/>
-              <w:bottom w:type="dxa" w:w="70"/>
-              <w:right w:type="dxa" w:w="110"/>
-            </w:tcMar>
-            <w:vAlign w:val="center"/>
-          </w:tcPr>
-          <w:p>
-            <w:pPr>
-              <w:spacing w:after="0" w:line="240"/>
-              <w:jc w:val="left"/>
-            </w:pPr>
-            <w:r>
-              <w:rPr>
-                <w:rFonts w:ascii="Times New Roman" w:cs="Times New Roman" w:eastAsia="Times New Roman" w:hAnsi="Times New Roman"/>
-                <w:b w:val="false"/>
-                <w:bCs w:val="false"/>
-                <w:sz w:val="21"/>
-                <w:szCs w:val="21"/>
-              </w:rPr>
-              <w:t xml:space="preserve">≈30 h</w:t>
-            </w:r>
-          </w:p>
-        </w:tc>
-        <w:tc>
-          <w:tcPr>
-            <w:tcW w:type="dxa" w:w="1633"/>
-            <w:tcMar>
-              <w:top w:type="dxa" w:w="70"/>
-              <w:left w:type="dxa" w:w="110"/>
-              <w:bottom w:type="dxa" w:w="70"/>
-              <w:right w:type="dxa" w:w="110"/>
-            </w:tcMar>
-            <w:vAlign w:val="center"/>
-          </w:tcPr>
-          <w:p>
-            <w:pPr>
-              <w:spacing w:after="0" w:line="240"/>
-              <w:jc w:val="left"/>
-            </w:pPr>
-            <w:r>
-              <w:rPr>
-                <w:rFonts w:ascii="Times New Roman" w:cs="Times New Roman" w:eastAsia="Times New Roman" w:hAnsi="Times New Roman"/>
-                <w:b w:val="false"/>
-                <w:bCs w:val="false"/>
-                <w:sz w:val="21"/>
-                <w:szCs w:val="21"/>
-              </w:rPr>
-              <w:t xml:space="preserve">≈40 h</w:t>
-            </w:r>
-          </w:p>
-        </w:tc>
-        <w:tc>
-          <w:tcPr>
-            <w:tcW w:type="dxa" w:w="1633"/>
-            <w:tcMar>
-              <w:top w:type="dxa" w:w="70"/>
-              <w:left w:type="dxa" w:w="110"/>
-              <w:bottom w:type="dxa" w:w="70"/>
-              <w:right w:type="dxa" w:w="110"/>
-            </w:tcMar>
-            <w:vAlign w:val="center"/>
-          </w:tcPr>
-          <w:p>
-            <w:pPr>
-              <w:spacing w:after="0" w:line="240"/>
-              <w:jc w:val="left"/>
-            </w:pPr>
-            <w:r>
-              <w:rPr>
-                <w:rFonts w:ascii="Times New Roman" w:cs="Times New Roman" w:eastAsia="Times New Roman" w:hAnsi="Times New Roman"/>
-                <w:b w:val="false"/>
-                <w:bCs w:val="false"/>
-                <w:sz w:val="21"/>
-                <w:szCs w:val="21"/>
-              </w:rPr>
-              <w:t xml:space="preserve">≈5 h</w:t>
-            </w:r>
-          </w:p>
-        </w:tc>
-      </w:tr>
-      <w:tr>
-        <w:trPr>
-          <w:tblHeader w:val="false"/>
-        </w:trPr>
-        <w:tc>
-          <w:tcPr>
-            <w:tcW w:type="dxa" w:w="2540"/>
-            <w:tcMar>
-              <w:top w:type="dxa" w:w="70"/>
-              <w:left w:type="dxa" w:w="110"/>
-              <w:bottom w:type="dxa" w:w="70"/>
-              <w:right w:type="dxa" w:w="110"/>
-            </w:tcMar>
-            <w:vAlign w:val="center"/>
-          </w:tcPr>
-          <w:p>
-            <w:pPr>
-              <w:spacing w:after="0" w:line="240"/>
-              <w:jc w:val="left"/>
-            </w:pPr>
-            <w:r>
-              <w:rPr>
-                <w:rFonts w:ascii="Times New Roman" w:cs="Times New Roman" w:eastAsia="Times New Roman" w:hAnsi="Times New Roman"/>
-                <w:b w:val="false"/>
-                <w:bCs w:val="false"/>
-                <w:sz w:val="21"/>
-                <w:szCs w:val="21"/>
-              </w:rPr>
-              <w:t xml:space="preserve">Cinemática inversa viable</w:t>
-            </w:r>
-          </w:p>
-        </w:tc>
-        <w:tc>
-          <w:tcPr>
-            <w:tcW w:type="dxa" w:w="1633"/>
-            <w:tcMar>
-              <w:top w:type="dxa" w:w="70"/>
-              <w:left w:type="dxa" w:w="110"/>
-              <w:bottom w:type="dxa" w:w="70"/>
-              <w:right w:type="dxa" w:w="110"/>
-            </w:tcMar>
-            <w:vAlign w:val="center"/>
-          </w:tcPr>
-          <w:p>
-            <w:pPr>
-              <w:spacing w:after="0" w:line="240"/>
-              <w:jc w:val="left"/>
-            </w:pPr>
-            <w:r>
-              <w:rPr>
-                <w:rFonts w:ascii="Times New Roman" w:cs="Times New Roman" w:eastAsia="Times New Roman" w:hAnsi="Times New Roman"/>
-                <w:b w:val="false"/>
-                <w:bCs w:val="false"/>
-                <w:sz w:val="21"/>
-                <w:szCs w:val="21"/>
-              </w:rPr>
-              <w:t xml:space="preserve">No</w:t>
-            </w:r>
-          </w:p>
-        </w:tc>
-        <w:tc>
-          <w:tcPr>
-            <w:tcW w:type="dxa" w:w="1633"/>
-            <w:tcMar>
-              <w:top w:type="dxa" w:w="70"/>
-              <w:left w:type="dxa" w:w="110"/>
-              <w:bottom w:type="dxa" w:w="70"/>
-              <w:right w:type="dxa" w:w="110"/>
-            </w:tcMar>
-            <w:vAlign w:val="center"/>
-          </w:tcPr>
-          <w:p>
-            <w:pPr>
-              <w:spacing w:after="0" w:line="240"/>
-              <w:jc w:val="left"/>
-            </w:pPr>
-            <w:r>
-              <w:rPr>
-                <w:rFonts w:ascii="Times New Roman" w:cs="Times New Roman" w:eastAsia="Times New Roman" w:hAnsi="Times New Roman"/>
-                <w:b w:val="false"/>
-                <w:bCs w:val="false"/>
-                <w:sz w:val="21"/>
-                <w:szCs w:val="21"/>
-              </w:rPr>
-              <w:t xml:space="preserve">No</w:t>
-            </w:r>
-          </w:p>
-        </w:tc>
-        <w:tc>
-          <w:tcPr>
-            <w:tcW w:type="dxa" w:w="1633"/>
-            <w:tcMar>
-              <w:top w:type="dxa" w:w="70"/>
-              <w:left w:type="dxa" w:w="110"/>
-              <w:bottom w:type="dxa" w:w="70"/>
-              <w:right w:type="dxa" w:w="110"/>
-            </w:tcMar>
-            <w:vAlign w:val="center"/>
-          </w:tcPr>
-          <w:p>
-            <w:pPr>
-              <w:spacing w:after="0" w:line="240"/>
-              <w:jc w:val="left"/>
-            </w:pPr>
-            <w:r>
-              <w:rPr>
-                <w:rFonts w:ascii="Times New Roman" w:cs="Times New Roman" w:eastAsia="Times New Roman" w:hAnsi="Times New Roman"/>
-                <w:b w:val="false"/>
-                <w:bCs w:val="false"/>
-                <w:sz w:val="21"/>
-                <w:szCs w:val="21"/>
-              </w:rPr>
-              <w:t xml:space="preserve">Sí</w:t>
-            </w:r>
-          </w:p>
-        </w:tc>
-        <w:tc>
-          <w:tcPr>
-            <w:tcW w:type="dxa" w:w="1633"/>
-            <w:tcMar>
-              <w:top w:type="dxa" w:w="70"/>
-              <w:left w:type="dxa" w:w="110"/>
-              <w:bottom w:type="dxa" w:w="70"/>
-              <w:right w:type="dxa" w:w="110"/>
-            </w:tcMar>
-            <w:vAlign w:val="center"/>
-          </w:tcPr>
-          <w:p>
-            <w:pPr>
-              <w:spacing w:after="0" w:line="240"/>
-              <w:jc w:val="left"/>
-            </w:pPr>
-            <w:r>
-              <w:rPr>
-                <w:rFonts w:ascii="Times New Roman" w:cs="Times New Roman" w:eastAsia="Times New Roman" w:hAnsi="Times New Roman"/>
-                <w:b w:val="false"/>
-                <w:bCs w:val="false"/>
-                <w:sz w:val="21"/>
-                <w:szCs w:val="21"/>
-              </w:rPr>
-              <w:t xml:space="preserve">No</w:t>
-            </w:r>
-          </w:p>
-        </w:tc>
-      </w:tr>
-      <w:tr>
-        <w:trPr>
-          <w:tblHeader w:val="false"/>
-        </w:trPr>
-        <w:tc>
-          <w:tcPr>
-            <w:tcW w:type="dxa" w:w="2540"/>
-            <w:tcMar>
-              <w:top w:type="dxa" w:w="70"/>
-              <w:left w:type="dxa" w:w="110"/>
-              <w:bottom w:type="dxa" w:w="70"/>
-              <w:right w:type="dxa" w:w="110"/>
-            </w:tcMar>
-            <w:vAlign w:val="center"/>
-          </w:tcPr>
-          <w:p>
-            <w:pPr>
-              <w:spacing w:after="0" w:line="240"/>
-              <w:jc w:val="left"/>
-            </w:pPr>
-            <w:r>
-              <w:rPr>
-                <w:rFonts w:ascii="Times New Roman" w:cs="Times New Roman" w:eastAsia="Times New Roman" w:hAnsi="Times New Roman"/>
-                <w:b w:val="false"/>
-                <w:bCs w:val="false"/>
-                <w:sz w:val="21"/>
-                <w:szCs w:val="21"/>
-              </w:rPr>
-              <w:t xml:space="preserve">Riesgo de incumplimiento</w:t>
-            </w:r>
-          </w:p>
-        </w:tc>
-        <w:tc>
-          <w:tcPr>
-            <w:tcW w:type="dxa" w:w="1633"/>
-            <w:tcMar>
-              <w:top w:type="dxa" w:w="70"/>
-              <w:left w:type="dxa" w:w="110"/>
-              <w:bottom w:type="dxa" w:w="70"/>
-              <w:right w:type="dxa" w:w="110"/>
-            </w:tcMar>
-            <w:vAlign w:val="center"/>
-          </w:tcPr>
-          <w:p>
-            <w:pPr>
-              <w:spacing w:after="0" w:line="240"/>
-              <w:jc w:val="left"/>
-            </w:pPr>
-            <w:r>
-              <w:rPr>
-                <w:rFonts w:ascii="Times New Roman" w:cs="Times New Roman" w:eastAsia="Times New Roman" w:hAnsi="Times New Roman"/>
-                <w:b w:val="false"/>
-                <w:bCs w:val="false"/>
-                <w:sz w:val="21"/>
-                <w:szCs w:val="21"/>
-              </w:rPr>
-              <w:t xml:space="preserve">Bajo</w:t>
-            </w:r>
-          </w:p>
-        </w:tc>
-        <w:tc>
-          <w:tcPr>
-            <w:tcW w:type="dxa" w:w="1633"/>
-            <w:tcMar>
-              <w:top w:type="dxa" w:w="70"/>
-              <w:left w:type="dxa" w:w="110"/>
-              <w:bottom w:type="dxa" w:w="70"/>
-              <w:right w:type="dxa" w:w="110"/>
-            </w:tcMar>
-            <w:vAlign w:val="center"/>
-          </w:tcPr>
-          <w:p>
-            <w:pPr>
-              <w:spacing w:after="0" w:line="240"/>
-              <w:jc w:val="left"/>
-            </w:pPr>
-            <w:r>
-              <w:rPr>
-                <w:rFonts w:ascii="Times New Roman" w:cs="Times New Roman" w:eastAsia="Times New Roman" w:hAnsi="Times New Roman"/>
-                <w:b w:val="false"/>
-                <w:bCs w:val="false"/>
-                <w:sz w:val="21"/>
-                <w:szCs w:val="21"/>
-              </w:rPr>
-              <w:t xml:space="preserve">Bajo a medio</w:t>
-            </w:r>
-          </w:p>
-        </w:tc>
-        <w:tc>
-          <w:tcPr>
-            <w:tcW w:type="dxa" w:w="1633"/>
-            <w:tcMar>
-              <w:top w:type="dxa" w:w="70"/>
-              <w:left w:type="dxa" w:w="110"/>
-              <w:bottom w:type="dxa" w:w="70"/>
-              <w:right w:type="dxa" w:w="110"/>
-            </w:tcMar>
-            <w:vAlign w:val="center"/>
-          </w:tcPr>
-          <w:p>
-            <w:pPr>
-              <w:spacing w:after="0" w:line="240"/>
-              <w:jc w:val="left"/>
-            </w:pPr>
-            <w:r>
-              <w:rPr>
-                <w:rFonts w:ascii="Times New Roman" w:cs="Times New Roman" w:eastAsia="Times New Roman" w:hAnsi="Times New Roman"/>
-                <w:b w:val="false"/>
-                <w:bCs w:val="false"/>
-                <w:sz w:val="21"/>
-                <w:szCs w:val="21"/>
-              </w:rPr>
-              <w:t xml:space="preserve">Medio</w:t>
-            </w:r>
-          </w:p>
-        </w:tc>
-        <w:tc>
-          <w:tcPr>
-            <w:tcW w:type="dxa" w:w="1633"/>
-            <w:tcMar>
-              <w:top w:type="dxa" w:w="70"/>
-              <w:left w:type="dxa" w:w="110"/>
-              <w:bottom w:type="dxa" w:w="70"/>
-              <w:right w:type="dxa" w:w="110"/>
-            </w:tcMar>
-            <w:vAlign w:val="center"/>
-          </w:tcPr>
-          <w:p>
-            <w:pPr>
-              <w:spacing w:after="0" w:line="240"/>
-              <w:jc w:val="left"/>
-            </w:pPr>
-            <w:r>
-              <w:rPr>
-                <w:rFonts w:ascii="Times New Roman" w:cs="Times New Roman" w:eastAsia="Times New Roman" w:hAnsi="Times New Roman"/>
-                <w:b w:val="false"/>
-                <w:bCs w:val="false"/>
-                <w:sz w:val="21"/>
-                <w:szCs w:val="21"/>
-              </w:rPr>
-              <w:t xml:space="preserve">Muy bajo</w:t>
-            </w:r>
-          </w:p>
-        </w:tc>
-      </w:tr>
-    </w:tbl>
-    <w:p>
-      <w:pPr>
-        <w:spacing w:after="240" w:before="0"/>
-        <w:jc w:val="center"/>
-      </w:pPr>
-      <w:r>
-        <w:rPr>
-          <w:rFonts w:ascii="Times New Roman" w:cs="Times New Roman" w:eastAsia="Times New Roman" w:hAnsi="Times New Roman"/>
-          <w:b/>
-          <w:bCs/>
-          <w:sz w:val="22"/>
-          <w:szCs w:val="22"/>
-        </w:rPr>
-        <w:t xml:space="preserve">Tabla 3: </w:t>
-      </w:r>
-      <w:r>
-        <w:rPr>
-          <w:rFonts w:ascii="Times New Roman" w:cs="Times New Roman" w:eastAsia="Times New Roman" w:hAnsi="Times New Roman"/>
-          <w:sz w:val="22"/>
-          <w:szCs w:val="22"/>
-        </w:rPr>
-        <w:t xml:space="preserve">Comparación de las alternativas de solución evaluadas.</w:t>
-      </w:r>
-    </w:p>
-    <w:p>
-      <w:pPr>
-        <w:spacing w:after="120" w:line="360"/>
-        <w:ind w:firstLine="709"/>
-        <w:jc w:val="both"/>
-      </w:pPr>
-      <w:r>
-        <w:rPr>
-          <w:rFonts w:ascii="Times New Roman" w:cs="Times New Roman" w:eastAsia="Times New Roman" w:hAnsi="Times New Roman"/>
-          <w:sz w:val="24"/>
-          <w:szCs w:val="24"/>
-        </w:rPr>
-        <w:t xml:space="preserve">Se propone adoptar la alternativa 3 por presentar la mejor relación entre capacidad de carga, costo y valor formativo, con un costo de $21.900 por integrante para un grupo de cuatro. El único riesgo relevante es la resolución mecánica del eje de elevación, que se mitiga construyendo un prototipo de ese eje en la semana 4 del cronograma, antes de comprometer el diseño definitivo. En caso de que el grupo esté integrado por tres personas, o de que dicho prototipo no resulte satisfactorio, se adoptará la alternativa 1, que es la única que se mantiene dentro del presupuesto en ambas configuraciones de grupo y la de menor riesgo de incumplimiento.</w:t>
-      </w:r>
-    </w:p>
-    <w:p>
-      <w:pPr>
-        <w:spacing w:after="120" w:line="360"/>
-        <w:ind w:firstLine="709"/>
-        <w:jc w:val="both"/>
-      </w:pPr>
-      <w:r>
-        <w:rPr>
-          <w:rFonts w:ascii="Times New Roman" w:cs="Times New Roman" w:eastAsia="Times New Roman" w:hAnsi="Times New Roman"/>
-          <w:sz w:val="24"/>
-          <w:szCs w:val="24"/>
-        </w:rPr>
-        <w:t xml:space="preserve">Tres consideraciones aplican a todas las alternativas. El empleo de una fuente ATX de computadora reciclada evita un gasto de $16.000 y aporta protección contra cortocircuito ya integrada. La fabricación de la estructura por impresión tridimensional en la Facultad representa un ahorro aproximado de $12.000 respecto del acrílico cortado a láser y permite iterar el diseño. Por último, no corresponde economizar en el pulsador de parada de emergencia ni en la fuente independiente de los actuadores, dado que ambos responden a requerimientos de seguridad.</w:t>
       </w:r>
     </w:p>
     <w:sectPr>
@@ -7722,13 +4875,13 @@
       </w:tblBorders>
     </w:tblPr>
     <w:tblGrid>
-      <w:gridCol w:w="3600"/>
-      <w:gridCol w:w="5470"/>
+      <w:gridCol w:w="2800"/>
+      <w:gridCol w:w="6270"/>
     </w:tblGrid>
     <w:tr>
       <w:tc>
         <w:tcPr>
-          <w:tcW w:type="dxa" w:w="3600"/>
+          <w:tcW w:type="dxa" w:w="2800"/>
           <w:tcBorders>
             <w:top w:val="none"/>
             <w:left w:val="none"/>
@@ -7746,7 +4899,7 @@
           <w:r>
             <w:drawing>
               <wp:inline distT="0" distB="0" distL="0" distR="0">
-                <wp:extent cx="1428750" cy="561975"/>
+                <wp:extent cx="1219200" cy="552450"/>
                 <wp:effectExtent t="0" r="0" b="0" l="0"/>
                 <wp:docPr id="1" name="" descr="" title=""/>
                 <wp:cNvGraphicFramePr>
@@ -7771,7 +4924,7 @@
                       <pic:spPr bwMode="auto">
                         <a:xfrm>
                           <a:off x="0" y="0"/>
-                          <a:ext cx="1428750" cy="561975"/>
+                          <a:ext cx="1219200" cy="552450"/>
                         </a:xfrm>
                         <a:prstGeom prst="rect">
                           <a:avLst/>
@@ -7787,7 +4940,7 @@
       </w:tc>
       <w:tc>
         <w:tcPr>
-          <w:tcW w:type="dxa" w:w="5470"/>
+          <w:tcW w:type="dxa" w:w="6270"/>
           <w:tcBorders>
             <w:top w:val="none"/>
             <w:left w:val="none"/>
@@ -7824,10 +4977,10 @@
           <w:r>
             <w:rPr>
               <w:rFonts w:ascii="Times New Roman" w:cs="Times New Roman" w:eastAsia="Times New Roman" w:hAnsi="Times New Roman"/>
-              <w:sz w:val="22"/>
-              <w:szCs w:val="22"/>
+              <w:sz w:val="19"/>
+              <w:szCs w:val="19"/>
             </w:rPr>
-            <w:t xml:space="preserve">FACULTAD DE INGENIERÍA</w:t>
+            <w:t xml:space="preserve">FACULTAD DE INGENIERÍA  ·  FACULTAD DE INFORMÁTICA</w:t>
           </w:r>
         </w:p>
       </w:tc>

</xml_diff>